<commit_message>
Conserva formato original en evidencias de pruebas añadidas
Iguala tipografía Calibri, tamaños, colores y espaciado con las secciones originales del documento.
</commit_message>
<xml_diff>
--- a/Fase 2/Evidencias Proyecto/Evidencias de documentación/Pethub_Evidencia_de_Pruebas.docx
+++ b/Fase 2/Evidencias Proyecto/Evidencias de documentación/Pethub_Evidencia_de_Pruebas.docx
@@ -3920,12 +3920,12 @@
           <wp:inline distB="0" distT="0" distL="0" distR="0">
             <wp:extent cx="4762500" cy="3114675"/>
             <wp:effectExtent b="0" l="0" r="0" t="0"/>
-            <wp:docPr descr="Pantallazo de la ejecución de pruebas" id="17" name="image8.png"/>
+            <wp:docPr descr="Pantallazo de la ejecución de pruebas" id="69" name="image11.png"/>
             <a:graphic>
               <a:graphicData uri="http://schemas.openxmlformats.org/drawingml/2006/picture">
                 <pic:pic>
                   <pic:nvPicPr>
-                    <pic:cNvPr descr="Pantallazo de la ejecución de pruebas" id="0" name="image8.png"/>
+                    <pic:cNvPr descr="Pantallazo de la ejecución de pruebas" id="0" name="image11.png"/>
                     <pic:cNvPicPr preferRelativeResize="0"/>
                   </pic:nvPicPr>
                   <pic:blipFill>
@@ -4039,12 +4039,12 @@
           <wp:inline distB="0" distT="0" distL="0" distR="0">
             <wp:extent cx="4953000" cy="2105025"/>
             <wp:effectExtent b="0" l="0" r="0" t="0"/>
-            <wp:docPr descr="Pantallazo de la ejecución de pruebas" id="19" name="image38.png"/>
+            <wp:docPr descr="Pantallazo de la ejecución de pruebas" id="71" name="image14.png"/>
             <a:graphic>
               <a:graphicData uri="http://schemas.openxmlformats.org/drawingml/2006/picture">
                 <pic:pic>
                   <pic:nvPicPr>
-                    <pic:cNvPr descr="Pantallazo de la ejecución de pruebas" id="0" name="image38.png"/>
+                    <pic:cNvPr descr="Pantallazo de la ejecución de pruebas" id="0" name="image14.png"/>
                     <pic:cNvPicPr preferRelativeResize="0"/>
                   </pic:nvPicPr>
                   <pic:blipFill>
@@ -4133,7 +4133,7 @@
           <wp:inline distB="0" distT="0" distL="0" distR="0">
             <wp:extent cx="4953000" cy="1790700"/>
             <wp:effectExtent b="0" l="0" r="0" t="0"/>
-            <wp:docPr descr="Pantallazo de la ejecución de pruebas" id="18" name="image10.png"/>
+            <wp:docPr descr="Pantallazo de la ejecución de pruebas" id="70" name="image10.png"/>
             <a:graphic>
               <a:graphicData uri="http://schemas.openxmlformats.org/drawingml/2006/picture">
                 <pic:pic>
@@ -4227,12 +4227,12 @@
           <wp:inline distB="0" distT="0" distL="0" distR="0">
             <wp:extent cx="4953000" cy="1781175"/>
             <wp:effectExtent b="0" l="0" r="0" t="0"/>
-            <wp:docPr descr="Pantallazo de la ejecución de pruebas" id="21" name="image16.png"/>
+            <wp:docPr descr="Pantallazo de la ejecución de pruebas" id="73" name="image21.png"/>
             <a:graphic>
               <a:graphicData uri="http://schemas.openxmlformats.org/drawingml/2006/picture">
                 <pic:pic>
                   <pic:nvPicPr>
-                    <pic:cNvPr descr="Pantallazo de la ejecución de pruebas" id="0" name="image16.png"/>
+                    <pic:cNvPr descr="Pantallazo de la ejecución de pruebas" id="0" name="image21.png"/>
                     <pic:cNvPicPr preferRelativeResize="0"/>
                   </pic:nvPicPr>
                   <pic:blipFill>
@@ -4321,12 +4321,12 @@
           <wp:inline distB="0" distT="0" distL="0" distR="0">
             <wp:extent cx="4953000" cy="1714500"/>
             <wp:effectExtent b="0" l="0" r="0" t="0"/>
-            <wp:docPr descr="Pantallazo de la ejecución de pruebas" id="20" name="image19.png"/>
+            <wp:docPr descr="Pantallazo de la ejecución de pruebas" id="72" name="image6.png"/>
             <a:graphic>
               <a:graphicData uri="http://schemas.openxmlformats.org/drawingml/2006/picture">
                 <pic:pic>
                   <pic:nvPicPr>
-                    <pic:cNvPr descr="Pantallazo de la ejecución de pruebas" id="0" name="image19.png"/>
+                    <pic:cNvPr descr="Pantallazo de la ejecución de pruebas" id="0" name="image6.png"/>
                     <pic:cNvPicPr preferRelativeResize="0"/>
                   </pic:nvPicPr>
                   <pic:blipFill>
@@ -4415,12 +4415,12 @@
           <wp:inline distB="0" distT="0" distL="0" distR="0">
             <wp:extent cx="3124200" cy="3143250"/>
             <wp:effectExtent b="0" l="0" r="0" t="0"/>
-            <wp:docPr descr="Pantallazo de la ejecución de pruebas" id="23" name="image18.png"/>
+            <wp:docPr descr="Pantallazo de la ejecución de pruebas" id="75" name="image22.png"/>
             <a:graphic>
               <a:graphicData uri="http://schemas.openxmlformats.org/drawingml/2006/picture">
                 <pic:pic>
                   <pic:nvPicPr>
-                    <pic:cNvPr descr="Pantallazo de la ejecución de pruebas" id="0" name="image18.png"/>
+                    <pic:cNvPr descr="Pantallazo de la ejecución de pruebas" id="0" name="image22.png"/>
                     <pic:cNvPicPr preferRelativeResize="0"/>
                   </pic:nvPicPr>
                   <pic:blipFill>
@@ -4462,12 +4462,12 @@
           <wp:inline distB="0" distT="0" distL="0" distR="0">
             <wp:extent cx="4191000" cy="1381125"/>
             <wp:effectExtent b="0" l="0" r="0" t="0"/>
-            <wp:docPr descr="Pantallazo de la ejecución de pruebas" id="22" name="image13.png"/>
+            <wp:docPr descr="Pantallazo de la ejecución de pruebas" id="74" name="image24.png"/>
             <a:graphic>
               <a:graphicData uri="http://schemas.openxmlformats.org/drawingml/2006/picture">
                 <pic:pic>
                   <pic:nvPicPr>
-                    <pic:cNvPr descr="Pantallazo de la ejecución de pruebas" id="0" name="image13.png"/>
+                    <pic:cNvPr descr="Pantallazo de la ejecución de pruebas" id="0" name="image24.png"/>
                     <pic:cNvPicPr preferRelativeResize="0"/>
                   </pic:nvPicPr>
                   <pic:blipFill>
@@ -4601,12 +4601,12 @@
           <wp:inline distB="0" distT="0" distL="0" distR="0">
             <wp:extent cx="4953000" cy="1524000"/>
             <wp:effectExtent b="0" l="0" r="0" t="0"/>
-            <wp:docPr descr="Pantallazo de la ejecución de pruebas" id="27" name="image24.png"/>
+            <wp:docPr descr="Pantallazo de la ejecución de pruebas" id="79" name="image25.png"/>
             <a:graphic>
               <a:graphicData uri="http://schemas.openxmlformats.org/drawingml/2006/picture">
                 <pic:pic>
                   <pic:nvPicPr>
-                    <pic:cNvPr descr="Pantallazo de la ejecución de pruebas" id="0" name="image24.png"/>
+                    <pic:cNvPr descr="Pantallazo de la ejecución de pruebas" id="0" name="image25.png"/>
                     <pic:cNvPicPr preferRelativeResize="0"/>
                   </pic:nvPicPr>
                   <pic:blipFill>
@@ -4695,12 +4695,12 @@
           <wp:inline distB="0" distT="0" distL="0" distR="0">
             <wp:extent cx="4953000" cy="2219325"/>
             <wp:effectExtent b="0" l="0" r="0" t="0"/>
-            <wp:docPr descr="Pantallazo de la ejecución de pruebas" id="25" name="image9.png"/>
+            <wp:docPr descr="Pantallazo de la ejecución de pruebas" id="77" name="image23.png"/>
             <a:graphic>
               <a:graphicData uri="http://schemas.openxmlformats.org/drawingml/2006/picture">
                 <pic:pic>
                   <pic:nvPicPr>
-                    <pic:cNvPr descr="Pantallazo de la ejecución de pruebas" id="0" name="image9.png"/>
+                    <pic:cNvPr descr="Pantallazo de la ejecución de pruebas" id="0" name="image23.png"/>
                     <pic:cNvPicPr preferRelativeResize="0"/>
                   </pic:nvPicPr>
                   <pic:blipFill>
@@ -4789,12 +4789,12 @@
           <wp:inline distB="0" distT="0" distL="0" distR="0">
             <wp:extent cx="4953000" cy="1628775"/>
             <wp:effectExtent b="0" l="0" r="0" t="0"/>
-            <wp:docPr descr="Pantallazo de la ejecución de pruebas" id="32" name="image22.png"/>
+            <wp:docPr descr="Pantallazo de la ejecución de pruebas" id="84" name="image29.png"/>
             <a:graphic>
               <a:graphicData uri="http://schemas.openxmlformats.org/drawingml/2006/picture">
                 <pic:pic>
                   <pic:nvPicPr>
-                    <pic:cNvPr descr="Pantallazo de la ejecución de pruebas" id="0" name="image22.png"/>
+                    <pic:cNvPr descr="Pantallazo de la ejecución de pruebas" id="0" name="image29.png"/>
                     <pic:cNvPicPr preferRelativeResize="0"/>
                   </pic:nvPicPr>
                   <pic:blipFill>
@@ -4883,12 +4883,12 @@
           <wp:inline distB="0" distT="0" distL="0" distR="0">
             <wp:extent cx="4191000" cy="2209800"/>
             <wp:effectExtent b="0" l="0" r="0" t="0"/>
-            <wp:docPr descr="Pantallazo de la ejecución de pruebas" id="28" name="image21.png"/>
+            <wp:docPr descr="Pantallazo de la ejecución de pruebas" id="80" name="image45.png"/>
             <a:graphic>
               <a:graphicData uri="http://schemas.openxmlformats.org/drawingml/2006/picture">
                 <pic:pic>
                   <pic:nvPicPr>
-                    <pic:cNvPr descr="Pantallazo de la ejecución de pruebas" id="0" name="image21.png"/>
+                    <pic:cNvPr descr="Pantallazo de la ejecución de pruebas" id="0" name="image45.png"/>
                     <pic:cNvPicPr preferRelativeResize="0"/>
                   </pic:nvPicPr>
                   <pic:blipFill>
@@ -4930,12 +4930,12 @@
           <wp:inline distB="0" distT="0" distL="0" distR="0">
             <wp:extent cx="3762375" cy="2238375"/>
             <wp:effectExtent b="0" l="0" r="0" t="0"/>
-            <wp:docPr descr="Pantallazo de la ejecución de pruebas" id="30" name="image25.png"/>
+            <wp:docPr descr="Pantallazo de la ejecución de pruebas" id="82" name="image31.png"/>
             <a:graphic>
               <a:graphicData uri="http://schemas.openxmlformats.org/drawingml/2006/picture">
                 <pic:pic>
                   <pic:nvPicPr>
-                    <pic:cNvPr descr="Pantallazo de la ejecución de pruebas" id="0" name="image25.png"/>
+                    <pic:cNvPr descr="Pantallazo de la ejecución de pruebas" id="0" name="image31.png"/>
                     <pic:cNvPicPr preferRelativeResize="0"/>
                   </pic:nvPicPr>
                   <pic:blipFill>
@@ -4977,12 +4977,12 @@
           <wp:inline distB="0" distT="0" distL="0" distR="0">
             <wp:extent cx="3800475" cy="2238375"/>
             <wp:effectExtent b="0" l="0" r="0" t="0"/>
-            <wp:docPr descr="Pantallazo de la ejecución de pruebas" id="33" name="image26.png"/>
+            <wp:docPr descr="Pantallazo de la ejecución de pruebas" id="85" name="image30.png"/>
             <a:graphic>
               <a:graphicData uri="http://schemas.openxmlformats.org/drawingml/2006/picture">
                 <pic:pic>
                   <pic:nvPicPr>
-                    <pic:cNvPr descr="Pantallazo de la ejecución de pruebas" id="0" name="image26.png"/>
+                    <pic:cNvPr descr="Pantallazo de la ejecución de pruebas" id="0" name="image30.png"/>
                     <pic:cNvPicPr preferRelativeResize="0"/>
                   </pic:nvPicPr>
                   <pic:blipFill>
@@ -5024,12 +5024,12 @@
           <wp:inline distB="0" distT="0" distL="0" distR="0">
             <wp:extent cx="2190750" cy="857250"/>
             <wp:effectExtent b="0" l="0" r="0" t="0"/>
-            <wp:docPr descr="Pantallazo de la ejecución de pruebas" id="35" name="image29.png"/>
+            <wp:docPr descr="Pantallazo de la ejecución de pruebas" id="87" name="image19.png"/>
             <a:graphic>
               <a:graphicData uri="http://schemas.openxmlformats.org/drawingml/2006/picture">
                 <pic:pic>
                   <pic:nvPicPr>
-                    <pic:cNvPr descr="Pantallazo de la ejecución de pruebas" id="0" name="image29.png"/>
+                    <pic:cNvPr descr="Pantallazo de la ejecución de pruebas" id="0" name="image19.png"/>
                     <pic:cNvPicPr preferRelativeResize="0"/>
                   </pic:nvPicPr>
                   <pic:blipFill>
@@ -5204,12 +5204,12 @@
           <wp:inline distB="0" distT="0" distL="0" distR="0">
             <wp:extent cx="3876675" cy="3619500"/>
             <wp:effectExtent b="0" l="0" r="0" t="0"/>
-            <wp:docPr descr="Pantallazo de la ejecución de pruebas" id="37" name="image28.png"/>
+            <wp:docPr descr="Pantallazo de la ejecución de pruebas" id="89" name="image44.png"/>
             <a:graphic>
               <a:graphicData uri="http://schemas.openxmlformats.org/drawingml/2006/picture">
                 <pic:pic>
                   <pic:nvPicPr>
-                    <pic:cNvPr descr="Pantallazo de la ejecución de pruebas" id="0" name="image28.png"/>
+                    <pic:cNvPr descr="Pantallazo de la ejecución de pruebas" id="0" name="image44.png"/>
                     <pic:cNvPicPr preferRelativeResize="0"/>
                   </pic:nvPicPr>
                   <pic:blipFill>
@@ -5251,12 +5251,12 @@
           <wp:inline distB="0" distT="0" distL="0" distR="0">
             <wp:extent cx="4191000" cy="733425"/>
             <wp:effectExtent b="0" l="0" r="0" t="0"/>
-            <wp:docPr descr="Pantallazo de la ejecución de pruebas" id="39" name="image36.png"/>
+            <wp:docPr descr="Pantallazo de la ejecución de pruebas" id="91" name="image42.png"/>
             <a:graphic>
               <a:graphicData uri="http://schemas.openxmlformats.org/drawingml/2006/picture">
                 <pic:pic>
                   <pic:nvPicPr>
-                    <pic:cNvPr descr="Pantallazo de la ejecución de pruebas" id="0" name="image36.png"/>
+                    <pic:cNvPr descr="Pantallazo de la ejecución de pruebas" id="0" name="image42.png"/>
                     <pic:cNvPicPr preferRelativeResize="0"/>
                   </pic:nvPicPr>
                   <pic:blipFill>
@@ -5365,12 +5365,12 @@
           <wp:inline distB="0" distT="0" distL="0" distR="0">
             <wp:extent cx="4381500" cy="1876425"/>
             <wp:effectExtent b="0" l="0" r="0" t="0"/>
-            <wp:docPr descr="Pantallazo de la ejecución de pruebas" id="41" name="image33.png"/>
+            <wp:docPr descr="Pantallazo de la ejecución de pruebas" id="93" name="image35.png"/>
             <a:graphic>
               <a:graphicData uri="http://schemas.openxmlformats.org/drawingml/2006/picture">
                 <pic:pic>
                   <pic:nvPicPr>
-                    <pic:cNvPr descr="Pantallazo de la ejecución de pruebas" id="0" name="image33.png"/>
+                    <pic:cNvPr descr="Pantallazo de la ejecución de pruebas" id="0" name="image35.png"/>
                     <pic:cNvPicPr preferRelativeResize="0"/>
                   </pic:nvPicPr>
                   <pic:blipFill>
@@ -5504,12 +5504,12 @@
           <wp:inline distB="0" distT="0" distL="0" distR="0">
             <wp:extent cx="3619500" cy="2047875"/>
             <wp:effectExtent b="0" l="0" r="0" t="0"/>
-            <wp:docPr descr="Pantallazo de la ejecución de pruebas" id="42" name="image30.png"/>
+            <wp:docPr descr="Pantallazo de la ejecución de pruebas" id="95" name="image41.png"/>
             <a:graphic>
               <a:graphicData uri="http://schemas.openxmlformats.org/drawingml/2006/picture">
                 <pic:pic>
                   <pic:nvPicPr>
-                    <pic:cNvPr descr="Pantallazo de la ejecución de pruebas" id="0" name="image30.png"/>
+                    <pic:cNvPr descr="Pantallazo de la ejecución de pruebas" id="0" name="image41.png"/>
                     <pic:cNvPicPr preferRelativeResize="0"/>
                   </pic:nvPicPr>
                   <pic:blipFill>
@@ -5627,6 +5627,11 @@
         </w:rPr>
         <w:t xml:space="preserve">Diagnóstico: Registro de prueba HU05.</w:t>
       </w:r>
+      <w:r>
+        <w:rPr>
+          <w:rtl w:val="0"/>
+        </w:rPr>
+      </w:r>
     </w:p>
     <w:p>
       <w:pPr>
@@ -5670,6 +5675,11 @@
         </w:rPr>
         <w:t xml:space="preserve">Fecha: 20/09/2026.</w:t>
       </w:r>
+      <w:r>
+        <w:rPr>
+          <w:rtl w:val="0"/>
+        </w:rPr>
+      </w:r>
     </w:p>
     <w:p>
       <w:pPr>
@@ -5713,6 +5723,11 @@
         </w:rPr>
         <w:t xml:space="preserve">Tratamiento: Tratamiento de prueba.</w:t>
       </w:r>
+      <w:r>
+        <w:rPr>
+          <w:rtl w:val="0"/>
+        </w:rPr>
+      </w:r>
     </w:p>
     <w:p>
       <w:pPr>
@@ -5726,12 +5741,12 @@
           <wp:inline distB="0" distT="0" distL="0" distR="0">
             <wp:extent cx="4381500" cy="2276475"/>
             <wp:effectExtent b="0" l="0" r="0" t="0"/>
-            <wp:docPr descr="Pantallazo de la ejecución de pruebas" id="43" name="image35.png"/>
+            <wp:docPr descr="Pantallazo de la ejecución de pruebas" id="97" name="image43.png"/>
             <a:graphic>
               <a:graphicData uri="http://schemas.openxmlformats.org/drawingml/2006/picture">
                 <pic:pic>
                   <pic:nvPicPr>
-                    <pic:cNvPr descr="Pantallazo de la ejecución de pruebas" id="0" name="image35.png"/>
+                    <pic:cNvPr descr="Pantallazo de la ejecución de pruebas" id="0" name="image43.png"/>
                     <pic:cNvPicPr preferRelativeResize="0"/>
                   </pic:nvPicPr>
                   <pic:blipFill>
@@ -5840,12 +5855,12 @@
           <wp:inline distB="0" distT="0" distL="114300" distR="114300">
             <wp:extent cx="4191000" cy="2038149"/>
             <wp:effectExtent b="0" l="0" r="0" t="0"/>
-            <wp:docPr id="44" name="image32.png"/>
+            <wp:docPr id="98" name="image40.png"/>
             <a:graphic>
               <a:graphicData uri="http://schemas.openxmlformats.org/drawingml/2006/picture">
                 <pic:pic>
                   <pic:nvPicPr>
-                    <pic:cNvPr id="0" name="image32.png"/>
+                    <pic:cNvPr id="0" name="image40.png"/>
                     <pic:cNvPicPr preferRelativeResize="0"/>
                   </pic:nvPicPr>
                   <pic:blipFill>
@@ -5974,12 +5989,12 @@
           <wp:inline distB="0" distT="0" distL="114300" distR="114300">
             <wp:extent cx="4191000" cy="2156945"/>
             <wp:effectExtent b="0" l="0" r="0" t="0"/>
-            <wp:docPr id="7" name="image3.png"/>
+            <wp:docPr id="55" name="image20.png"/>
             <a:graphic>
               <a:graphicData uri="http://schemas.openxmlformats.org/drawingml/2006/picture">
                 <pic:pic>
                   <pic:nvPicPr>
-                    <pic:cNvPr id="0" name="image3.png"/>
+                    <pic:cNvPr id="0" name="image20.png"/>
                     <pic:cNvPicPr preferRelativeResize="0"/>
                   </pic:nvPicPr>
                   <pic:blipFill>
@@ -6067,12 +6082,12 @@
           <wp:inline distB="0" distT="0" distL="114300" distR="114300">
             <wp:extent cx="5303520" cy="2948792"/>
             <wp:effectExtent b="0" l="0" r="0" t="0"/>
-            <wp:docPr id="8" name="image2.png"/>
+            <wp:docPr id="57" name="image9.png"/>
             <a:graphic>
               <a:graphicData uri="http://schemas.openxmlformats.org/drawingml/2006/picture">
                 <pic:pic>
                   <pic:nvPicPr>
-                    <pic:cNvPr id="0" name="image2.png"/>
+                    <pic:cNvPr id="0" name="image9.png"/>
                     <pic:cNvPicPr preferRelativeResize="0"/>
                   </pic:nvPicPr>
                   <pic:blipFill>
@@ -6174,12 +6189,12 @@
           <wp:inline distB="0" distT="0" distL="114300" distR="114300">
             <wp:extent cx="5303520" cy="2783320"/>
             <wp:effectExtent b="0" l="0" r="0" t="0"/>
-            <wp:docPr id="9" name="image6.png"/>
+            <wp:docPr id="59" name="image46.png"/>
             <a:graphic>
               <a:graphicData uri="http://schemas.openxmlformats.org/drawingml/2006/picture">
                 <pic:pic>
                   <pic:nvPicPr>
-                    <pic:cNvPr id="0" name="image6.png"/>
+                    <pic:cNvPr id="0" name="image46.png"/>
                     <pic:cNvPicPr preferRelativeResize="0"/>
                   </pic:nvPicPr>
                   <pic:blipFill>
@@ -6224,11 +6239,18 @@
     <w:p>
       <w:pPr>
         <w:pStyle w:val="Heading3"/>
-        <w:pageBreakBefore w:val="1"/>
-        <w:rPr/>
-      </w:pPr>
-      <w:r>
-        <w:rPr>
+        <w:keepNext w:val="1"/>
+        <w:spacing w:after="80" w:before="220" w:lineRule="auto"/>
+        <w:rPr/>
+      </w:pPr>
+      <w:r>
+        <w:rPr>
+          <w:rFonts w:ascii="Calibri" w:cs="Calibri" w:eastAsia="Calibri" w:hAnsi="Calibri"/>
+          <w:b w:val="1"/>
+          <w:bCs w:val="1"/>
+          <w:color w:val="2f5d8c"/>
+          <w:sz w:val="24"/>
+          <w:szCs w:val="24"/>
           <w:rtl w:val="0"/>
         </w:rPr>
         <w:t xml:space="preserve">S3-HU09 Solicitudes de sangre</w:t>
@@ -6236,10 +6258,14 @@
     </w:p>
     <w:p>
       <w:pPr>
-        <w:rPr/>
-      </w:pPr>
-      <w:r>
-        <w:rPr>
+        <w:spacing w:after="120" w:line="288" w:lineRule="auto"/>
+        <w:rPr/>
+      </w:pPr>
+      <w:r>
+        <w:rPr>
+          <w:rFonts w:ascii="Calibri" w:cs="Calibri" w:eastAsia="Calibri" w:hAnsi="Calibri"/>
+          <w:sz w:val="22"/>
+          <w:szCs w:val="22"/>
           <w:rtl w:val="0"/>
         </w:rPr>
         <w:t xml:space="preserve">Se agregaron 12 pruebas de SolicitudesSangreComponent: consulta autenticada y separación de estados; listas vacías; urgencia obligatoria; rechazo de espacios en el grupo; publicación autenticada con datos normalizados y confirmación del servidor; bloqueo de publicaciones simultáneas; conservación del formulario y reintento; resolución con PUT sin duplicar; manejo de errores de resolución; actualización tras un conflicto 409; reintento de carga y sesión inválida.</w:t>
@@ -6248,10 +6274,18 @@
     <w:p>
       <w:pPr>
         <w:pStyle w:val="Heading3"/>
-        <w:rPr/>
-      </w:pPr>
-      <w:r>
-        <w:rPr>
+        <w:keepNext w:val="1"/>
+        <w:spacing w:after="80" w:before="220" w:lineRule="auto"/>
+        <w:rPr/>
+      </w:pPr>
+      <w:r>
+        <w:rPr>
+          <w:rFonts w:ascii="Calibri" w:cs="Calibri" w:eastAsia="Calibri" w:hAnsi="Calibri"/>
+          <w:b w:val="1"/>
+          <w:bCs w:val="1"/>
+          <w:color w:val="2f5d8c"/>
+          <w:sz w:val="24"/>
+          <w:szCs w:val="24"/>
           <w:rtl w:val="0"/>
         </w:rPr>
         <w:t xml:space="preserve">S3-HU10 Búsqueda de donantes</w:t>
@@ -6259,10 +6293,14 @@
     </w:p>
     <w:p>
       <w:pPr>
-        <w:rPr/>
-      </w:pPr>
-      <w:r>
-        <w:rPr>
+        <w:spacing w:after="120" w:line="288" w:lineRule="auto"/>
+        <w:rPr/>
+      </w:pPr>
+      <w:r>
+        <w:rPr>
+          <w:rFonts w:ascii="Calibri" w:cs="Calibri" w:eastAsia="Calibri" w:hAnsi="Calibri"/>
+          <w:sz w:val="22"/>
+          <w:szCs w:val="22"/>
           <w:rtl w:val="0"/>
         </w:rPr>
         <w:t xml:space="preserve">Se agregaron 9 pruebas de BuscarDonantesComponent: ausencia de consultas iniciales; campos obligatorios; rechazo de espacios; parámetros normalizados y token; visualización de datos; conservación del orden enviado por el servidor; lista vacía; prevención de envíos simultáneos; limpieza de resultados anteriores, reintento y sesión inválida. La prueba de prioridad conserva el orden simulado del backend; la regla de ordenación de la API corresponde a sus pruebas de integración.</w:t>
@@ -6271,10 +6309,18 @@
     <w:p>
       <w:pPr>
         <w:pStyle w:val="Heading3"/>
-        <w:rPr/>
-      </w:pPr>
-      <w:r>
-        <w:rPr>
+        <w:keepNext w:val="1"/>
+        <w:spacing w:after="80" w:before="220" w:lineRule="auto"/>
+        <w:rPr/>
+      </w:pPr>
+      <w:r>
+        <w:rPr>
+          <w:rFonts w:ascii="Calibri" w:cs="Calibri" w:eastAsia="Calibri" w:hAnsi="Calibri"/>
+          <w:b w:val="1"/>
+          <w:bCs w:val="1"/>
+          <w:color w:val="2f5d8c"/>
+          <w:sz w:val="24"/>
+          <w:szCs w:val="24"/>
           <w:rtl w:val="0"/>
         </w:rPr>
         <w:t xml:space="preserve">Ejecución completa del 18 de octubre de 2026</w:t>
@@ -6282,10 +6328,14 @@
     </w:p>
     <w:p>
       <w:pPr>
-        <w:rPr/>
-      </w:pPr>
-      <w:r>
-        <w:rPr>
+        <w:spacing w:after="120" w:line="288" w:lineRule="auto"/>
+        <w:rPr/>
+      </w:pPr>
+      <w:r>
+        <w:rPr>
+          <w:rFonts w:ascii="Calibri" w:cs="Calibri" w:eastAsia="Calibri" w:hAnsi="Calibri"/>
+          <w:sz w:val="22"/>
+          <w:szCs w:val="22"/>
           <w:rtl w:val="0"/>
         </w:rPr>
         <w:t xml:space="preserve">Las 21 pruebas nuevas y las 45 existentes finalizaron correctamente: 66 de 66 pruebas aprobadas en 14 archivos, sin fallos. Duración: 3,37 segundos. Esta ejecución se realizó en el entorno de verificación del código del repositorio, con Node.js 24 y la telemetría de Angular desactivada. No se utilizó la base de datos real. La imagen siguiente reproduce el registro de salida de esa ejecución; no es una captura del computador de Paulina.</w:t>
@@ -6302,7 +6352,7 @@
           <wp:inline distB="0" distT="0" distL="114300" distR="114300">
             <wp:extent cx="5577840" cy="1972651"/>
             <wp:effectExtent b="0" l="0" r="0" t="0"/>
-            <wp:docPr id="10" name="image1.png"/>
+            <wp:docPr id="61" name="image1.png"/>
             <a:graphic>
               <a:graphicData uri="http://schemas.openxmlformats.org/drawingml/2006/picture">
                 <pic:pic>
@@ -6339,10 +6389,14 @@
     </w:p>
     <w:p>
       <w:pPr>
-        <w:rPr/>
-      </w:pPr>
-      <w:r>
-        <w:rPr>
+        <w:spacing w:after="120" w:line="288" w:lineRule="auto"/>
+        <w:rPr/>
+      </w:pPr>
+      <w:r>
+        <w:rPr>
+          <w:rFonts w:ascii="Calibri" w:cs="Calibri" w:eastAsia="Calibri" w:hAnsi="Calibri"/>
+          <w:sz w:val="22"/>
+          <w:szCs w:val="22"/>
           <w:rtl w:val="0"/>
         </w:rPr>
         <w:t xml:space="preserve">Registro de ejecución: pruebas_hu09_hu10.log. Archivos nuevos: solicitudes-sangre.component.spec.ts y buscar-donantes.component.spec.ts.</w:t>
@@ -6461,6 +6515,11 @@
         </w:rPr>
         <w:t xml:space="preserve">Herramienta: Thunder Client (extensión de VS Code).</w:t>
       </w:r>
+      <w:r>
+        <w:rPr>
+          <w:rtl w:val="0"/>
+        </w:rPr>
+      </w:r>
     </w:p>
     <w:p>
       <w:pPr>
@@ -6504,6 +6563,11 @@
         </w:rPr>
         <w:t xml:space="preserve">Entorno: servidor local (http://localhost:3000), rama feature/s3-hu08-donantes, base de datos PostgreSQL local.</w:t>
       </w:r>
+      <w:r>
+        <w:rPr>
+          <w:rtl w:val="0"/>
+        </w:rPr>
+      </w:r>
     </w:p>
     <w:p>
       <w:pPr>
@@ -6547,6 +6611,11 @@
         </w:rPr>
         <w:t xml:space="preserve">Autenticación: token JWT de un usuario de prueba, enviado como Bearer token.</w:t>
       </w:r>
+      <w:r>
+        <w:rPr>
+          <w:rtl w:val="0"/>
+        </w:rPr>
+      </w:r>
     </w:p>
     <w:p>
       <w:pPr>
@@ -6589,6 +6658,11 @@
           <w:rtl w:val="0"/>
         </w:rPr>
         <w:t xml:space="preserve">Datos previos: mascotas de prueba creadas con POST /api/mascotas (Firulais, id 28; Luna, id 29; Rocky, id 31).</w:t>
+      </w:r>
+      <w:r>
+        <w:rPr>
+          <w:rtl w:val="0"/>
+        </w:rPr>
       </w:r>
     </w:p>
     <w:tbl>
@@ -7766,12 +7840,12 @@
           <wp:inline distB="0" distT="0" distL="0" distR="0">
             <wp:extent cx="4762500" cy="1638300"/>
             <wp:effectExtent b="0" l="0" r="0" t="0"/>
-            <wp:docPr descr="Pantallazo de la ejecución de pruebas" id="11" name="image14.png"/>
+            <wp:docPr descr="Pantallazo de la ejecución de pruebas" id="63" name="image3.png"/>
             <a:graphic>
               <a:graphicData uri="http://schemas.openxmlformats.org/drawingml/2006/picture">
                 <pic:pic>
                   <pic:nvPicPr>
-                    <pic:cNvPr descr="Pantallazo de la ejecución de pruebas" id="0" name="image14.png"/>
+                    <pic:cNvPr descr="Pantallazo de la ejecución de pruebas" id="0" name="image3.png"/>
                     <pic:cNvPicPr preferRelativeResize="0"/>
                   </pic:nvPicPr>
                   <pic:blipFill>
@@ -8028,12 +8102,12 @@
           <wp:inline distB="0" distT="0" distL="0" distR="0">
             <wp:extent cx="4762500" cy="1809750"/>
             <wp:effectExtent b="0" l="0" r="0" t="0"/>
-            <wp:docPr descr="Pantallazo de la ejecución de pruebas" id="12" name="image5.png"/>
+            <wp:docPr descr="Pantallazo de la ejecución de pruebas" id="64" name="image13.png"/>
             <a:graphic>
               <a:graphicData uri="http://schemas.openxmlformats.org/drawingml/2006/picture">
                 <pic:pic>
                   <pic:nvPicPr>
-                    <pic:cNvPr descr="Pantallazo de la ejecución de pruebas" id="0" name="image5.png"/>
+                    <pic:cNvPr descr="Pantallazo de la ejecución de pruebas" id="0" name="image13.png"/>
                     <pic:cNvPicPr preferRelativeResize="0"/>
                   </pic:nvPicPr>
                   <pic:blipFill>
@@ -8290,12 +8364,12 @@
           <wp:inline distB="0" distT="0" distL="0" distR="0">
             <wp:extent cx="3810000" cy="1438275"/>
             <wp:effectExtent b="0" l="0" r="0" t="0"/>
-            <wp:docPr descr="Pantallazo de la ejecución de pruebas" id="13" name="image11.png"/>
+            <wp:docPr descr="Pantallazo de la ejecución de pruebas" id="65" name="image7.png"/>
             <a:graphic>
               <a:graphicData uri="http://schemas.openxmlformats.org/drawingml/2006/picture">
                 <pic:pic>
                   <pic:nvPicPr>
-                    <pic:cNvPr descr="Pantallazo de la ejecución de pruebas" id="0" name="image11.png"/>
+                    <pic:cNvPr descr="Pantallazo de la ejecución de pruebas" id="0" name="image7.png"/>
                     <pic:cNvPicPr preferRelativeResize="0"/>
                   </pic:nvPicPr>
                   <pic:blipFill>
@@ -8528,12 +8602,12 @@
           <wp:inline distB="0" distT="0" distL="0" distR="0">
             <wp:extent cx="4762500" cy="1819275"/>
             <wp:effectExtent b="0" l="0" r="0" t="0"/>
-            <wp:docPr descr="Pantallazo de la ejecución de pruebas" id="14" name="image7.png"/>
+            <wp:docPr descr="Pantallazo de la ejecución de pruebas" id="66" name="image16.png"/>
             <a:graphic>
               <a:graphicData uri="http://schemas.openxmlformats.org/drawingml/2006/picture">
                 <pic:pic>
                   <pic:nvPicPr>
-                    <pic:cNvPr descr="Pantallazo de la ejecución de pruebas" id="0" name="image7.png"/>
+                    <pic:cNvPr descr="Pantallazo de la ejecución de pruebas" id="0" name="image16.png"/>
                     <pic:cNvPicPr preferRelativeResize="0"/>
                   </pic:nvPicPr>
                   <pic:blipFill>
@@ -8672,6 +8746,11 @@
         </w:rPr>
         <w:t xml:space="preserve">Endpoints: POST /api/solicitudes, GET /api/solicitudes y PUT /api/solicitudes/:id/resolver.</w:t>
       </w:r>
+      <w:r>
+        <w:rPr>
+          <w:rtl w:val="0"/>
+        </w:rPr>
+      </w:r>
     </w:p>
     <w:p>
       <w:pPr>
@@ -8715,6 +8794,11 @@
         </w:rPr>
         <w:t xml:space="preserve">Herramienta y entorno: Thunder Client, servidor local (http://localhost:3000), rama feature/s3-hu09-solicitudes, base de datos PostgreSQL local.</w:t>
       </w:r>
+      <w:r>
+        <w:rPr>
+          <w:rtl w:val="0"/>
+        </w:rPr>
+      </w:r>
     </w:p>
     <w:p>
       <w:pPr>
@@ -8757,6 +8841,11 @@
           <w:rtl w:val="0"/>
         </w:rPr>
         <w:t xml:space="preserve">Autenticación: token JWT de un usuario de prueba, enviado como Bearer token.</w:t>
+      </w:r>
+      <w:r>
+        <w:rPr>
+          <w:rtl w:val="0"/>
+        </w:rPr>
       </w:r>
     </w:p>
     <w:tbl>
@@ -10374,12 +10463,12 @@
           <wp:inline distB="0" distT="0" distL="0" distR="0">
             <wp:extent cx="4191000" cy="2133600"/>
             <wp:effectExtent b="0" l="0" r="0" t="0"/>
-            <wp:docPr descr="Pantallazo de la ejecución de pruebas" id="15" name="image12.png"/>
+            <wp:docPr descr="Pantallazo de la ejecución de pruebas" id="67" name="image8.png"/>
             <a:graphic>
               <a:graphicData uri="http://schemas.openxmlformats.org/drawingml/2006/picture">
                 <pic:pic>
                   <pic:nvPicPr>
-                    <pic:cNvPr descr="Pantallazo de la ejecución de pruebas" id="0" name="image12.png"/>
+                    <pic:cNvPr descr="Pantallazo de la ejecución de pruebas" id="0" name="image8.png"/>
                     <pic:cNvPicPr preferRelativeResize="0"/>
                   </pic:nvPicPr>
                   <pic:blipFill>
@@ -10612,12 +10701,12 @@
           <wp:inline distB="0" distT="0" distL="0" distR="0">
             <wp:extent cx="4191000" cy="1447800"/>
             <wp:effectExtent b="0" l="0" r="0" t="0"/>
-            <wp:docPr descr="Pantallazo de la ejecución de pruebas" id="16" name="image4.png"/>
+            <wp:docPr descr="Pantallazo de la ejecución de pruebas" id="68" name="image12.png"/>
             <a:graphic>
               <a:graphicData uri="http://schemas.openxmlformats.org/drawingml/2006/picture">
                 <pic:pic>
                   <pic:nvPicPr>
-                    <pic:cNvPr descr="Pantallazo de la ejecución de pruebas" id="0" name="image4.png"/>
+                    <pic:cNvPr descr="Pantallazo de la ejecución de pruebas" id="0" name="image12.png"/>
                     <pic:cNvPicPr preferRelativeResize="0"/>
                   </pic:nvPicPr>
                   <pic:blipFill>
@@ -10754,12 +10843,12 @@
           <wp:inline distB="0" distT="0" distL="0" distR="0">
             <wp:extent cx="3114675" cy="2857500"/>
             <wp:effectExtent b="0" l="0" r="0" t="0"/>
-            <wp:docPr descr="Pantallazo de la ejecución de pruebas" id="24" name="image17.png"/>
+            <wp:docPr descr="Pantallazo de la ejecución de pruebas" id="76" name="image28.png"/>
             <a:graphic>
               <a:graphicData uri="http://schemas.openxmlformats.org/drawingml/2006/picture">
                 <pic:pic>
                   <pic:nvPicPr>
-                    <pic:cNvPr descr="Pantallazo de la ejecución de pruebas" id="0" name="image17.png"/>
+                    <pic:cNvPr descr="Pantallazo de la ejecución de pruebas" id="0" name="image28.png"/>
                     <pic:cNvPicPr preferRelativeResize="0"/>
                   </pic:nvPicPr>
                   <pic:blipFill>
@@ -10896,12 +10985,12 @@
           <wp:inline distB="0" distT="0" distL="0" distR="0">
             <wp:extent cx="4000500" cy="2714625"/>
             <wp:effectExtent b="0" l="0" r="0" t="0"/>
-            <wp:docPr descr="Pantallazo de la ejecución de pruebas" id="26" name="image15.png"/>
+            <wp:docPr descr="Pantallazo de la ejecución de pruebas" id="78" name="image26.png"/>
             <a:graphic>
               <a:graphicData uri="http://schemas.openxmlformats.org/drawingml/2006/picture">
                 <pic:pic>
                   <pic:nvPicPr>
-                    <pic:cNvPr descr="Pantallazo de la ejecución de pruebas" id="0" name="image15.png"/>
+                    <pic:cNvPr descr="Pantallazo de la ejecución de pruebas" id="0" name="image26.png"/>
                     <pic:cNvPicPr preferRelativeResize="0"/>
                   </pic:nvPicPr>
                   <pic:blipFill>
@@ -11038,12 +11127,12 @@
           <wp:inline distB="0" distT="0" distL="0" distR="0">
             <wp:extent cx="4000500" cy="1466850"/>
             <wp:effectExtent b="0" l="0" r="0" t="0"/>
-            <wp:docPr descr="Pantallazo de la ejecución de pruebas" id="29" name="image23.png"/>
+            <wp:docPr descr="Pantallazo de la ejecución de pruebas" id="81" name="image33.png"/>
             <a:graphic>
               <a:graphicData uri="http://schemas.openxmlformats.org/drawingml/2006/picture">
                 <pic:pic>
                   <pic:nvPicPr>
-                    <pic:cNvPr descr="Pantallazo de la ejecución de pruebas" id="0" name="image23.png"/>
+                    <pic:cNvPr descr="Pantallazo de la ejecución de pruebas" id="0" name="image33.png"/>
                     <pic:cNvPicPr preferRelativeResize="0"/>
                   </pic:nvPicPr>
                   <pic:blipFill>
@@ -11180,12 +11269,12 @@
           <wp:inline distB="0" distT="0" distL="0" distR="0">
             <wp:extent cx="4000500" cy="2362200"/>
             <wp:effectExtent b="0" l="0" r="0" t="0"/>
-            <wp:docPr descr="Pantallazo de la ejecución de pruebas" id="31" name="image20.png"/>
+            <wp:docPr descr="Pantallazo de la ejecución de pruebas" id="83" name="image27.png"/>
             <a:graphic>
               <a:graphicData uri="http://schemas.openxmlformats.org/drawingml/2006/picture">
                 <pic:pic>
                   <pic:nvPicPr>
-                    <pic:cNvPr descr="Pantallazo de la ejecución de pruebas" id="0" name="image20.png"/>
+                    <pic:cNvPr descr="Pantallazo de la ejecución de pruebas" id="0" name="image27.png"/>
                     <pic:cNvPicPr preferRelativeResize="0"/>
                   </pic:nvPicPr>
                   <pic:blipFill>
@@ -11324,6 +11413,11 @@
         </w:rPr>
         <w:t xml:space="preserve">Herramienta y entorno: Thunder Client, servidor local (http://localhost:3000), rama feature/s3-hu10-busqueda, base de datos PostgreSQL local.</w:t>
       </w:r>
+      <w:r>
+        <w:rPr>
+          <w:rtl w:val="0"/>
+        </w:rPr>
+      </w:r>
     </w:p>
     <w:p>
       <w:pPr>
@@ -11367,6 +11461,11 @@
         </w:rPr>
         <w:t xml:space="preserve">Autenticación: token JWT de un usuario de prueba, enviado como Bearer token.</w:t>
       </w:r>
+      <w:r>
+        <w:rPr>
+          <w:rtl w:val="0"/>
+        </w:rPr>
+      </w:r>
     </w:p>
     <w:p>
       <w:pPr>
@@ -11409,6 +11508,11 @@
           <w:rtl w:val="0"/>
         </w:rPr>
         <w:t xml:space="preserve">Datos previos: dos usuarios de prueba (comunas Viña del Mar y Valparaíso) con los donantes Firulais (perro, activo, Viña del Mar) y Toby (perro, activo, Valparaíso). También existen Luna (gata, activa) y Rocky (perro, en estado “pendiente” por no tener grupo sanguíneo).</w:t>
+      </w:r>
+      <w:r>
+        <w:rPr>
+          <w:rtl w:val="0"/>
+        </w:rPr>
       </w:r>
     </w:p>
     <w:tbl>
@@ -12514,12 +12618,12 @@
           <wp:inline distB="0" distT="0" distL="0" distR="0">
             <wp:extent cx="3143250" cy="2857500"/>
             <wp:effectExtent b="0" l="0" r="0" t="0"/>
-            <wp:docPr descr="Pantallazo de la ejecución de pruebas" id="34" name="image37.png"/>
+            <wp:docPr descr="Pantallazo de la ejecución de pruebas" id="86" name="image34.png"/>
             <a:graphic>
               <a:graphicData uri="http://schemas.openxmlformats.org/drawingml/2006/picture">
                 <pic:pic>
                   <pic:nvPicPr>
-                    <pic:cNvPr descr="Pantallazo de la ejecución de pruebas" id="0" name="image37.png"/>
+                    <pic:cNvPr descr="Pantallazo de la ejecución de pruebas" id="0" name="image34.png"/>
                     <pic:cNvPicPr preferRelativeResize="0"/>
                   </pic:nvPicPr>
                   <pic:blipFill>
@@ -12656,12 +12760,12 @@
           <wp:inline distB="0" distT="0" distL="0" distR="0">
             <wp:extent cx="2924175" cy="2857500"/>
             <wp:effectExtent b="0" l="0" r="0" t="0"/>
-            <wp:docPr descr="Pantallazo de la ejecución de pruebas" id="36" name="image31.png"/>
+            <wp:docPr descr="Pantallazo de la ejecución de pruebas" id="88" name="image32.png"/>
             <a:graphic>
               <a:graphicData uri="http://schemas.openxmlformats.org/drawingml/2006/picture">
                 <pic:pic>
                   <pic:nvPicPr>
-                    <pic:cNvPr descr="Pantallazo de la ejecución de pruebas" id="0" name="image31.png"/>
+                    <pic:cNvPr descr="Pantallazo de la ejecución de pruebas" id="0" name="image32.png"/>
                     <pic:cNvPicPr preferRelativeResize="0"/>
                   </pic:nvPicPr>
                   <pic:blipFill>
@@ -12798,12 +12902,12 @@
           <wp:inline distB="0" distT="0" distL="0" distR="0">
             <wp:extent cx="4000500" cy="1438275"/>
             <wp:effectExtent b="0" l="0" r="0" t="0"/>
-            <wp:docPr descr="Pantallazo de la ejecución de pruebas" id="38" name="image34.png"/>
+            <wp:docPr descr="Pantallazo de la ejecución de pruebas" id="90" name="image36.png"/>
             <a:graphic>
               <a:graphicData uri="http://schemas.openxmlformats.org/drawingml/2006/picture">
                 <pic:pic>
                   <pic:nvPicPr>
-                    <pic:cNvPr descr="Pantallazo de la ejecución de pruebas" id="0" name="image34.png"/>
+                    <pic:cNvPr descr="Pantallazo de la ejecución de pruebas" id="0" name="image36.png"/>
                     <pic:cNvPicPr preferRelativeResize="0"/>
                   </pic:nvPicPr>
                   <pic:blipFill>
@@ -12940,12 +13044,12 @@
           <wp:inline distB="0" distT="0" distL="0" distR="0">
             <wp:extent cx="4000500" cy="1304925"/>
             <wp:effectExtent b="0" l="0" r="0" t="0"/>
-            <wp:docPr descr="Pantallazo de la ejecución de pruebas" id="40" name="image27.png"/>
+            <wp:docPr descr="Pantallazo de la ejecución de pruebas" id="92" name="image39.png"/>
             <a:graphic>
               <a:graphicData uri="http://schemas.openxmlformats.org/drawingml/2006/picture">
                 <pic:pic>
                   <pic:nvPicPr>
-                    <pic:cNvPr descr="Pantallazo de la ejecución de pruebas" id="0" name="image27.png"/>
+                    <pic:cNvPr descr="Pantallazo de la ejecución de pruebas" id="0" name="image39.png"/>
                     <pic:cNvPicPr preferRelativeResize="0"/>
                   </pic:nvPicPr>
                   <pic:blipFill>
@@ -12998,57 +13102,110 @@
       </w:r>
     </w:p>
     <w:p>
+      <w:pPr>
+        <w:rPr/>
+      </w:pPr>
       <w:r>
         <w:br w:type="page"/>
       </w:r>
+      <w:r>
+        <w:rPr>
+          <w:rtl w:val="0"/>
+        </w:rPr>
+      </w:r>
     </w:p>
     <w:p>
       <w:pPr>
         <w:pStyle w:val="Heading1"/>
-      </w:pPr>
-      <w:r>
-        <w:t>4 Capturas de pruebas en la interfaz</w:t>
-      </w:r>
-    </w:p>
-    <w:p>
-      <w:r>
-        <w:t>Pruebas realizadas por Paulina el 18 de octubre de 2026 en su entorno local. Se conservan las capturas originales recibidas, sin reconstruir la consola ni modificar los mensajes de la aplicación.</w:t>
+        <w:keepNext w:val="1"/>
+        <w:spacing w:after="140" w:before="0" w:lineRule="auto"/>
+        <w:rPr/>
+      </w:pPr>
+      <w:r>
+        <w:rPr>
+          <w:rFonts w:ascii="Calibri" w:cs="Calibri" w:eastAsia="Calibri" w:hAnsi="Calibri"/>
+          <w:b w:val="1"/>
+          <w:bCs w:val="1"/>
+          <w:color w:val="1e3a5f"/>
+          <w:sz w:val="32"/>
+          <w:szCs w:val="32"/>
+          <w:rtl w:val="0"/>
+        </w:rPr>
+        <w:t xml:space="preserve">4 Capturas de pruebas en la interfaz</w:t>
+      </w:r>
+    </w:p>
+    <w:p>
+      <w:pPr>
+        <w:spacing w:after="120" w:line="288" w:lineRule="auto"/>
+        <w:rPr/>
+      </w:pPr>
+      <w:r>
+        <w:rPr>
+          <w:rFonts w:ascii="Calibri" w:cs="Calibri" w:eastAsia="Calibri" w:hAnsi="Calibri"/>
+          <w:sz w:val="22"/>
+          <w:szCs w:val="22"/>
+          <w:rtl w:val="0"/>
+        </w:rPr>
+        <w:t xml:space="preserve">Pruebas realizadas por Paulina el 18 de octubre de 2026 en su entorno local. Se conservan las capturas originales recibidas, sin reconstruir la consola ni modificar los mensajes de la aplicación.</w:t>
       </w:r>
     </w:p>
     <w:p>
       <w:pPr>
         <w:pStyle w:val="Heading2"/>
-      </w:pPr>
-      <w:r>
-        <w:t>Ejecución del frontend en el computador de Paulina</w:t>
-      </w:r>
-    </w:p>
-    <w:p>
-      <w:r>
-        <w:t>Se ejecutó npm.cmd test -- --watch=false en Visual Studio Code. La captura muestra 14 archivos aprobados y 66 pruebas aprobadas, incluidas las 12 de solicitudes de sangre y las 9 del buscador. Estas pruebas automatizadas simulan las solicitudes HTTP; su resultado se distingue de las pruebas manuales de interfaz que siguen.</w:t>
+        <w:keepNext w:val="1"/>
+        <w:spacing w:after="100" w:before="280" w:lineRule="auto"/>
+        <w:rPr/>
+      </w:pPr>
+      <w:r>
+        <w:rPr>
+          <w:rFonts w:ascii="Calibri" w:cs="Calibri" w:eastAsia="Calibri" w:hAnsi="Calibri"/>
+          <w:b w:val="1"/>
+          <w:bCs w:val="1"/>
+          <w:color w:val="1e3a5f"/>
+          <w:sz w:val="27"/>
+          <w:szCs w:val="27"/>
+          <w:rtl w:val="0"/>
+        </w:rPr>
+        <w:t xml:space="preserve">Ejecución del frontend en el computador de Paulina</w:t>
+      </w:r>
+    </w:p>
+    <w:p>
+      <w:pPr>
+        <w:spacing w:after="120" w:line="288" w:lineRule="auto"/>
+        <w:rPr/>
+      </w:pPr>
+      <w:r>
+        <w:rPr>
+          <w:rFonts w:ascii="Calibri" w:cs="Calibri" w:eastAsia="Calibri" w:hAnsi="Calibri"/>
+          <w:sz w:val="22"/>
+          <w:szCs w:val="22"/>
+          <w:rtl w:val="0"/>
+        </w:rPr>
+        <w:t xml:space="preserve">Se ejecutó npm.cmd test -- --watch=false en Visual Studio Code. La captura muestra 14 archivos aprobados y 66 pruebas aprobadas, incluidas las 12 de solicitudes de sangre y las 9 del buscador. Estas pruebas automatizadas simulan las solicitudes HTTP; su resultado se distingue de las pruebas manuales de interfaz que siguen.</w:t>
       </w:r>
     </w:p>
     <w:p>
       <w:pPr>
         <w:jc w:val="center"/>
-      </w:pPr>
-      <w:r>
+        <w:rPr/>
+      </w:pPr>
+      <w:r>
+        <w:rPr/>
         <w:drawing>
-          <wp:inline>
+          <wp:inline distB="0" distT="0" distL="114300" distR="114300">
             <wp:extent cx="5486400" cy="3594735"/>
-            <wp:docPr id="45" name="Picture 45" descr="Ejecución del frontend en el computador de Paulina captura original 181649"/>
-            <wp:cNvGraphicFramePr>
-              <a:graphicFrameLocks noChangeAspect="1"/>
-            </wp:cNvGraphicFramePr>
+            <wp:effectExtent b="0" l="0" r="0" t="0"/>
+            <wp:docPr descr="Ejecución del frontend en el computador de Paulina captura original 181649" id="94" name="image38.png"/>
             <a:graphic>
               <a:graphicData uri="http://schemas.openxmlformats.org/drawingml/2006/picture">
                 <pic:pic>
                   <pic:nvPicPr>
-                    <pic:cNvPr id="0" name="image(20261018-181649).png"/>
-                    <pic:cNvPicPr/>
+                    <pic:cNvPr descr="Ejecución del frontend en el computador de Paulina captura original 181649" id="0" name="image38.png"/>
+                    <pic:cNvPicPr preferRelativeResize="0"/>
                   </pic:nvPicPr>
                   <pic:blipFill>
-                    <a:blip r:embed="rId46"/>
+                    <a:blip r:embed="rId45"/>
+                    <a:srcRect b="0" l="0" r="0" t="0"/>
                     <a:stretch>
                       <a:fillRect/>
                     </a:stretch>
@@ -13059,6 +13216,7 @@
                       <a:ext cx="5486400" cy="3594735"/>
                     </a:xfrm>
                     <a:prstGeom prst="rect"/>
+                    <a:ln/>
                   </pic:spPr>
                 </pic:pic>
               </a:graphicData>
@@ -13066,57 +13224,105 @@
           </wp:inline>
         </w:drawing>
       </w:r>
-    </w:p>
-    <w:p>
-      <w:pPr>
-        <w:spacing w:after="80"/>
-      </w:pPr>
-      <w:r>
-        <w:rPr>
-          <w:sz w:val="18"/>
-        </w:rPr>
-        <w:t>Captura original image(20261018-181649).png</w:t>
-      </w:r>
-    </w:p>
-    <w:p>
+      <w:r>
+        <w:rPr>
+          <w:rtl w:val="0"/>
+        </w:rPr>
+      </w:r>
+    </w:p>
+    <w:p>
+      <w:pPr>
+        <w:spacing w:after="120" w:line="288" w:lineRule="auto"/>
+        <w:rPr/>
+      </w:pPr>
+      <w:r>
+        <w:rPr>
+          <w:rFonts w:ascii="Calibri" w:cs="Calibri" w:eastAsia="Calibri" w:hAnsi="Calibri"/>
+          <w:sz w:val="22"/>
+          <w:szCs w:val="22"/>
+          <w:rtl w:val="0"/>
+        </w:rPr>
+        <w:t xml:space="preserve">Captura original image(20261018-181649).png</w:t>
+      </w:r>
+      <w:r>
+        <w:rPr>
+          <w:rFonts w:ascii="Calibri" w:cs="Calibri" w:eastAsia="Calibri" w:hAnsi="Calibri"/>
+          <w:sz w:val="22"/>
+          <w:szCs w:val="22"/>
+          <w:rtl w:val="0"/>
+        </w:rPr>
+      </w:r>
+    </w:p>
+    <w:p>
+      <w:pPr>
+        <w:rPr/>
+      </w:pPr>
       <w:r>
         <w:br w:type="page"/>
       </w:r>
+      <w:r>
+        <w:rPr>
+          <w:rtl w:val="0"/>
+        </w:rPr>
+      </w:r>
     </w:p>
     <w:p>
       <w:pPr>
         <w:pStyle w:val="Heading2"/>
-      </w:pPr>
-      <w:r>
-        <w:t>HU09 Validación del nivel de urgencia</w:t>
-      </w:r>
-    </w:p>
-    <w:p>
-      <w:r>
-        <w:t>Con especie Gato y grupo sanguíneo a, se intentó publicar sin seleccionar urgencia. La interfaz mostró “Debes indicar el nivel de urgencia”. Resultado observado: se presentó la validación requerida.</w:t>
+        <w:keepNext w:val="1"/>
+        <w:spacing w:after="100" w:before="280" w:lineRule="auto"/>
+        <w:rPr/>
+      </w:pPr>
+      <w:r>
+        <w:rPr>
+          <w:rFonts w:ascii="Calibri" w:cs="Calibri" w:eastAsia="Calibri" w:hAnsi="Calibri"/>
+          <w:b w:val="1"/>
+          <w:bCs w:val="1"/>
+          <w:color w:val="1e3a5f"/>
+          <w:sz w:val="27"/>
+          <w:szCs w:val="27"/>
+          <w:rtl w:val="0"/>
+        </w:rPr>
+        <w:t xml:space="preserve">HU09 Validación del nivel de urgencia</w:t>
+      </w:r>
+    </w:p>
+    <w:p>
+      <w:pPr>
+        <w:spacing w:after="120" w:line="288" w:lineRule="auto"/>
+        <w:rPr/>
+      </w:pPr>
+      <w:r>
+        <w:rPr>
+          <w:rFonts w:ascii="Calibri" w:cs="Calibri" w:eastAsia="Calibri" w:hAnsi="Calibri"/>
+          <w:sz w:val="22"/>
+          <w:szCs w:val="22"/>
+          <w:rtl w:val="0"/>
+        </w:rPr>
+        <w:t xml:space="preserve">Con especie Gato y grupo sanguíneo a, se intentó publicar sin seleccionar urgencia. La interfaz mostró “Debes indicar el nivel de urgencia”. Resultado observado: se presentó la validación requerida.</w:t>
       </w:r>
     </w:p>
     <w:p>
       <w:pPr>
         <w:jc w:val="center"/>
-      </w:pPr>
-      <w:r>
+        <w:rPr/>
+      </w:pPr>
+      <w:r>
+        <w:rPr/>
         <w:drawing>
-          <wp:inline>
-            <wp:extent cx="4902064" cy="5394959"/>
-            <wp:docPr id="46" name="Picture 46" descr="HU09 Validación del nivel de urgencia captura original 182323"/>
-            <wp:cNvGraphicFramePr>
-              <a:graphicFrameLocks noChangeAspect="1"/>
-            </wp:cNvGraphicFramePr>
+          <wp:inline distB="0" distT="0" distL="114300" distR="114300">
+            <wp:extent cx="4403549" cy="4846320"/>
+            <wp:effectExtent b="0" l="0" r="0" t="0"/>
+            <wp:docPr descr="HU09 Validación del nivel de urgencia captura original 182323" id="96" name="image37.png"/>
             <a:graphic>
               <a:graphicData uri="http://schemas.openxmlformats.org/drawingml/2006/picture">
                 <pic:pic>
                   <pic:nvPicPr>
-                    <pic:cNvPr id="0" name="image(20261018-182323).png"/>
-                    <pic:cNvPicPr/>
+                    <pic:cNvPr descr="HU09 Validación del nivel de urgencia captura original 182323" id="0" name="image37.png"/>
+                    <pic:cNvPicPr preferRelativeResize="0"/>
                   </pic:nvPicPr>
                   <pic:blipFill>
-                    <a:blip r:embed="rId47"/>
+                    <a:blip r:embed="rId46"/>
+                    <a:srcRect b="0" l="0" r="0" t="0"/>
                     <a:stretch>
                       <a:fillRect/>
                     </a:stretch>
@@ -13124,9 +13330,10 @@
                   <pic:spPr>
                     <a:xfrm>
                       <a:off x="0" y="0"/>
-                      <a:ext cx="4902064" cy="5394959"/>
+                      <a:ext cx="4403549" cy="4846320"/>
                     </a:xfrm>
                     <a:prstGeom prst="rect"/>
+                    <a:ln/>
                   </pic:spPr>
                 </pic:pic>
               </a:graphicData>
@@ -13134,57 +13341,105 @@
           </wp:inline>
         </w:drawing>
       </w:r>
-    </w:p>
-    <w:p>
-      <w:pPr>
-        <w:spacing w:after="80"/>
-      </w:pPr>
-      <w:r>
-        <w:rPr>
-          <w:sz w:val="18"/>
-        </w:rPr>
-        <w:t>Captura original image(20261018-182323).png</w:t>
-      </w:r>
-    </w:p>
-    <w:p>
+      <w:r>
+        <w:rPr>
+          <w:rtl w:val="0"/>
+        </w:rPr>
+      </w:r>
+    </w:p>
+    <w:p>
+      <w:pPr>
+        <w:spacing w:after="120" w:line="288" w:lineRule="auto"/>
+        <w:rPr/>
+      </w:pPr>
+      <w:r>
+        <w:rPr>
+          <w:rFonts w:ascii="Calibri" w:cs="Calibri" w:eastAsia="Calibri" w:hAnsi="Calibri"/>
+          <w:sz w:val="22"/>
+          <w:szCs w:val="22"/>
+          <w:rtl w:val="0"/>
+        </w:rPr>
+        <w:t xml:space="preserve">Captura original image(20261018-182323).png</w:t>
+      </w:r>
+      <w:r>
+        <w:rPr>
+          <w:rFonts w:ascii="Calibri" w:cs="Calibri" w:eastAsia="Calibri" w:hAnsi="Calibri"/>
+          <w:sz w:val="22"/>
+          <w:szCs w:val="22"/>
+          <w:rtl w:val="0"/>
+        </w:rPr>
+      </w:r>
+    </w:p>
+    <w:p>
+      <w:pPr>
+        <w:rPr/>
+      </w:pPr>
       <w:r>
         <w:br w:type="page"/>
       </w:r>
+      <w:r>
+        <w:rPr>
+          <w:rtl w:val="0"/>
+        </w:rPr>
+      </w:r>
     </w:p>
     <w:p>
       <w:pPr>
         <w:pStyle w:val="Heading2"/>
-      </w:pPr>
-      <w:r>
-        <w:t>HU09 Publicación exitosa de una solicitud</w:t>
-      </w:r>
-    </w:p>
-    <w:p>
-      <w:r>
-        <w:t>Se seleccionó urgencia alta y se publicó la solicitud. La primera captura muestra “Solicitud publicada correctamente.” y el formulario reiniciado; la segunda muestra Gato · a en Activas, con urgencia alta y estado Activa. La solicitud resuelta que ya figuraba en esa lista corresponde a un registro anterior.</w:t>
+        <w:keepNext w:val="1"/>
+        <w:spacing w:after="100" w:before="280" w:lineRule="auto"/>
+        <w:rPr/>
+      </w:pPr>
+      <w:r>
+        <w:rPr>
+          <w:rFonts w:ascii="Calibri" w:cs="Calibri" w:eastAsia="Calibri" w:hAnsi="Calibri"/>
+          <w:b w:val="1"/>
+          <w:bCs w:val="1"/>
+          <w:color w:val="1e3a5f"/>
+          <w:sz w:val="27"/>
+          <w:szCs w:val="27"/>
+          <w:rtl w:val="0"/>
+        </w:rPr>
+        <w:t xml:space="preserve">HU09 Publicación exitosa de una solicitud</w:t>
+      </w:r>
+    </w:p>
+    <w:p>
+      <w:pPr>
+        <w:spacing w:after="120" w:line="288" w:lineRule="auto"/>
+        <w:rPr/>
+      </w:pPr>
+      <w:r>
+        <w:rPr>
+          <w:rFonts w:ascii="Calibri" w:cs="Calibri" w:eastAsia="Calibri" w:hAnsi="Calibri"/>
+          <w:sz w:val="22"/>
+          <w:szCs w:val="22"/>
+          <w:rtl w:val="0"/>
+        </w:rPr>
+        <w:t xml:space="preserve">Se seleccionó urgencia alta y se publicó la solicitud. La primera captura muestra “Solicitud publicada correctamente.” y el formulario reiniciado; la segunda muestra Gato · a en Activas, con urgencia alta y estado Activa. La solicitud resuelta que ya figuraba en esa lista corresponde a un registro anterior.</w:t>
       </w:r>
     </w:p>
     <w:p>
       <w:pPr>
         <w:jc w:val="center"/>
-      </w:pPr>
-      <w:r>
+        <w:rPr/>
+      </w:pPr>
+      <w:r>
+        <w:rPr/>
         <w:drawing>
-          <wp:inline>
+          <wp:inline distB="0" distT="0" distL="114300" distR="114300">
             <wp:extent cx="3413316" cy="3200400"/>
-            <wp:docPr id="47" name="Picture 47" descr="HU09 Publicación exitosa de una solicitud captura original 182422"/>
-            <wp:cNvGraphicFramePr>
-              <a:graphicFrameLocks noChangeAspect="1"/>
-            </wp:cNvGraphicFramePr>
+            <wp:effectExtent b="0" l="0" r="0" t="0"/>
+            <wp:docPr descr="HU09 Publicación exitosa de una solicitud captura original 182422" id="53" name="image4.png"/>
             <a:graphic>
               <a:graphicData uri="http://schemas.openxmlformats.org/drawingml/2006/picture">
                 <pic:pic>
                   <pic:nvPicPr>
-                    <pic:cNvPr id="0" name="image(20261018-182422).png"/>
-                    <pic:cNvPicPr/>
+                    <pic:cNvPr descr="HU09 Publicación exitosa de una solicitud captura original 182422" id="0" name="image4.png"/>
+                    <pic:cNvPicPr preferRelativeResize="0"/>
                   </pic:nvPicPr>
                   <pic:blipFill>
-                    <a:blip r:embed="rId48"/>
+                    <a:blip r:embed="rId47"/>
+                    <a:srcRect b="0" l="0" r="0" t="0"/>
                     <a:stretch>
                       <a:fillRect/>
                     </a:stretch>
@@ -13195,6 +13450,7 @@
                       <a:ext cx="3413316" cy="3200400"/>
                     </a:xfrm>
                     <a:prstGeom prst="rect"/>
+                    <a:ln/>
                   </pic:spPr>
                 </pic:pic>
               </a:graphicData>
@@ -13202,39 +13458,57 @@
           </wp:inline>
         </w:drawing>
       </w:r>
-    </w:p>
-    <w:p>
-      <w:pPr>
-        <w:spacing w:after="80"/>
-      </w:pPr>
-      <w:r>
-        <w:rPr>
-          <w:sz w:val="18"/>
-        </w:rPr>
-        <w:t>Captura original image(20261018-182422).png</w:t>
+      <w:r>
+        <w:rPr>
+          <w:rtl w:val="0"/>
+        </w:rPr>
+      </w:r>
+    </w:p>
+    <w:p>
+      <w:pPr>
+        <w:spacing w:after="120" w:line="288" w:lineRule="auto"/>
+        <w:rPr/>
+      </w:pPr>
+      <w:r>
+        <w:rPr>
+          <w:rFonts w:ascii="Calibri" w:cs="Calibri" w:eastAsia="Calibri" w:hAnsi="Calibri"/>
+          <w:sz w:val="22"/>
+          <w:szCs w:val="22"/>
+          <w:rtl w:val="0"/>
+        </w:rPr>
+        <w:t xml:space="preserve">Captura original image(20261018-182422).png</w:t>
+      </w:r>
+      <w:r>
+        <w:rPr>
+          <w:rFonts w:ascii="Calibri" w:cs="Calibri" w:eastAsia="Calibri" w:hAnsi="Calibri"/>
+          <w:sz w:val="22"/>
+          <w:szCs w:val="22"/>
+          <w:rtl w:val="0"/>
+        </w:rPr>
       </w:r>
     </w:p>
     <w:p>
       <w:pPr>
         <w:jc w:val="center"/>
-      </w:pPr>
-      <w:r>
+        <w:rPr/>
+      </w:pPr>
+      <w:r>
+        <w:rPr/>
         <w:drawing>
-          <wp:inline>
+          <wp:inline distB="0" distT="0" distL="114300" distR="114300">
             <wp:extent cx="3672900" cy="3200400"/>
-            <wp:docPr id="48" name="Picture 48" descr="HU09 Publicación exitosa de una solicitud captura original 182430"/>
-            <wp:cNvGraphicFramePr>
-              <a:graphicFrameLocks noChangeAspect="1"/>
-            </wp:cNvGraphicFramePr>
+            <wp:effectExtent b="0" l="0" r="0" t="0"/>
+            <wp:docPr descr="HU09 Publicación exitosa de una solicitud captura original 182430" id="54" name="image18.png"/>
             <a:graphic>
               <a:graphicData uri="http://schemas.openxmlformats.org/drawingml/2006/picture">
                 <pic:pic>
                   <pic:nvPicPr>
-                    <pic:cNvPr id="0" name="image(20261018-182430).png"/>
-                    <pic:cNvPicPr/>
+                    <pic:cNvPr descr="HU09 Publicación exitosa de una solicitud captura original 182430" id="0" name="image18.png"/>
+                    <pic:cNvPicPr preferRelativeResize="0"/>
                   </pic:nvPicPr>
                   <pic:blipFill>
-                    <a:blip r:embed="rId49"/>
+                    <a:blip r:embed="rId48"/>
+                    <a:srcRect b="0" l="0" r="0" t="0"/>
                     <a:stretch>
                       <a:fillRect/>
                     </a:stretch>
@@ -13245,6 +13519,7 @@
                       <a:ext cx="3672900" cy="3200400"/>
                     </a:xfrm>
                     <a:prstGeom prst="rect"/>
+                    <a:ln/>
                   </pic:spPr>
                 </pic:pic>
               </a:graphicData>
@@ -13252,57 +13527,105 @@
           </wp:inline>
         </w:drawing>
       </w:r>
-    </w:p>
-    <w:p>
-      <w:pPr>
-        <w:spacing w:after="80"/>
-      </w:pPr>
-      <w:r>
-        <w:rPr>
-          <w:sz w:val="18"/>
-        </w:rPr>
-        <w:t>Captura original image(20261018-182430).png</w:t>
-      </w:r>
-    </w:p>
-    <w:p>
+      <w:r>
+        <w:rPr>
+          <w:rtl w:val="0"/>
+        </w:rPr>
+      </w:r>
+    </w:p>
+    <w:p>
+      <w:pPr>
+        <w:spacing w:after="120" w:line="288" w:lineRule="auto"/>
+        <w:rPr/>
+      </w:pPr>
+      <w:r>
+        <w:rPr>
+          <w:rFonts w:ascii="Calibri" w:cs="Calibri" w:eastAsia="Calibri" w:hAnsi="Calibri"/>
+          <w:sz w:val="22"/>
+          <w:szCs w:val="22"/>
+          <w:rtl w:val="0"/>
+        </w:rPr>
+        <w:t xml:space="preserve">Captura original image(20261018-182430).png</w:t>
+      </w:r>
+      <w:r>
+        <w:rPr>
+          <w:rFonts w:ascii="Calibri" w:cs="Calibri" w:eastAsia="Calibri" w:hAnsi="Calibri"/>
+          <w:sz w:val="22"/>
+          <w:szCs w:val="22"/>
+          <w:rtl w:val="0"/>
+        </w:rPr>
+      </w:r>
+    </w:p>
+    <w:p>
+      <w:pPr>
+        <w:rPr/>
+      </w:pPr>
       <w:r>
         <w:br w:type="page"/>
       </w:r>
+      <w:r>
+        <w:rPr>
+          <w:rtl w:val="0"/>
+        </w:rPr>
+      </w:r>
     </w:p>
     <w:p>
       <w:pPr>
         <w:pStyle w:val="Heading2"/>
-      </w:pPr>
-      <w:r>
-        <w:t>HU09 Cierre de la solicitud</w:t>
-      </w:r>
-    </w:p>
-    <w:p>
-      <w:r>
-        <w:t>Tras marcar la solicitud como resuelta, la lista muestra “No tienes solicitudes activas.” y dos registros en Resueltas. Resultado observado: la solicitud dejó de figurar en Activas. Esta captura documenta el estado final; por sí sola no demuestra la recarga ni la visibilidad desde otra cuenta.</w:t>
+        <w:keepNext w:val="1"/>
+        <w:spacing w:after="100" w:before="280" w:lineRule="auto"/>
+        <w:rPr/>
+      </w:pPr>
+      <w:r>
+        <w:rPr>
+          <w:rFonts w:ascii="Calibri" w:cs="Calibri" w:eastAsia="Calibri" w:hAnsi="Calibri"/>
+          <w:b w:val="1"/>
+          <w:bCs w:val="1"/>
+          <w:color w:val="1e3a5f"/>
+          <w:sz w:val="27"/>
+          <w:szCs w:val="27"/>
+          <w:rtl w:val="0"/>
+        </w:rPr>
+        <w:t xml:space="preserve">HU09 Cierre de la solicitud</w:t>
+      </w:r>
+    </w:p>
+    <w:p>
+      <w:pPr>
+        <w:spacing w:after="120" w:line="288" w:lineRule="auto"/>
+        <w:rPr/>
+      </w:pPr>
+      <w:r>
+        <w:rPr>
+          <w:rFonts w:ascii="Calibri" w:cs="Calibri" w:eastAsia="Calibri" w:hAnsi="Calibri"/>
+          <w:sz w:val="22"/>
+          <w:szCs w:val="22"/>
+          <w:rtl w:val="0"/>
+        </w:rPr>
+        <w:t xml:space="preserve">Tras marcar la solicitud como resuelta, la lista muestra “No tienes solicitudes activas.” y dos registros en Resueltas. Resultado observado: la solicitud dejó de figurar en Activas. Esta captura documenta el estado final; por sí sola no demuestra la recarga ni la visibilidad desde otra cuenta.</w:t>
       </w:r>
     </w:p>
     <w:p>
       <w:pPr>
         <w:jc w:val="center"/>
-      </w:pPr>
-      <w:r>
+        <w:rPr/>
+      </w:pPr>
+      <w:r>
+        <w:rPr/>
         <w:drawing>
-          <wp:inline>
-            <wp:extent cx="5486400" cy="4869712"/>
-            <wp:docPr id="49" name="Picture 49" descr="HU09 Cierre de la solicitud captura original 182620"/>
-            <wp:cNvGraphicFramePr>
-              <a:graphicFrameLocks noChangeAspect="1"/>
-            </wp:cNvGraphicFramePr>
+          <wp:inline distB="0" distT="0" distL="114300" distR="114300">
+            <wp:extent cx="5460045" cy="4846320"/>
+            <wp:effectExtent b="0" l="0" r="0" t="0"/>
+            <wp:docPr descr="HU09 Cierre de la solicitud captura original 182620" id="56" name="image2.png"/>
             <a:graphic>
               <a:graphicData uri="http://schemas.openxmlformats.org/drawingml/2006/picture">
                 <pic:pic>
                   <pic:nvPicPr>
-                    <pic:cNvPr id="0" name="image(20261018-182620).png"/>
-                    <pic:cNvPicPr/>
+                    <pic:cNvPr descr="HU09 Cierre de la solicitud captura original 182620" id="0" name="image2.png"/>
+                    <pic:cNvPicPr preferRelativeResize="0"/>
                   </pic:nvPicPr>
                   <pic:blipFill>
-                    <a:blip r:embed="rId50"/>
+                    <a:blip r:embed="rId49"/>
+                    <a:srcRect b="0" l="0" r="0" t="0"/>
                     <a:stretch>
                       <a:fillRect/>
                     </a:stretch>
@@ -13310,9 +13633,10 @@
                   <pic:spPr>
                     <a:xfrm>
                       <a:off x="0" y="0"/>
-                      <a:ext cx="5486400" cy="4869712"/>
+                      <a:ext cx="5460045" cy="4846320"/>
                     </a:xfrm>
                     <a:prstGeom prst="rect"/>
+                    <a:ln/>
                   </pic:spPr>
                 </pic:pic>
               </a:graphicData>
@@ -13320,57 +13644,105 @@
           </wp:inline>
         </w:drawing>
       </w:r>
-    </w:p>
-    <w:p>
-      <w:pPr>
-        <w:spacing w:after="80"/>
-      </w:pPr>
-      <w:r>
-        <w:rPr>
-          <w:sz w:val="18"/>
-        </w:rPr>
-        <w:t>Captura original image(20261018-182620).png</w:t>
-      </w:r>
-    </w:p>
-    <w:p>
+      <w:r>
+        <w:rPr>
+          <w:rtl w:val="0"/>
+        </w:rPr>
+      </w:r>
+    </w:p>
+    <w:p>
+      <w:pPr>
+        <w:spacing w:after="120" w:line="288" w:lineRule="auto"/>
+        <w:rPr/>
+      </w:pPr>
+      <w:r>
+        <w:rPr>
+          <w:rFonts w:ascii="Calibri" w:cs="Calibri" w:eastAsia="Calibri" w:hAnsi="Calibri"/>
+          <w:sz w:val="22"/>
+          <w:szCs w:val="22"/>
+          <w:rtl w:val="0"/>
+        </w:rPr>
+        <w:t xml:space="preserve">Captura original image(20261018-182620).png</w:t>
+      </w:r>
+      <w:r>
+        <w:rPr>
+          <w:rFonts w:ascii="Calibri" w:cs="Calibri" w:eastAsia="Calibri" w:hAnsi="Calibri"/>
+          <w:sz w:val="22"/>
+          <w:szCs w:val="22"/>
+          <w:rtl w:val="0"/>
+        </w:rPr>
+      </w:r>
+    </w:p>
+    <w:p>
+      <w:pPr>
+        <w:rPr/>
+      </w:pPr>
       <w:r>
         <w:br w:type="page"/>
       </w:r>
+      <w:r>
+        <w:rPr>
+          <w:rtl w:val="0"/>
+        </w:rPr>
+      </w:r>
     </w:p>
     <w:p>
       <w:pPr>
         <w:pStyle w:val="Heading2"/>
-      </w:pPr>
-      <w:r>
-        <w:t>HU10 Validación de los campos obligatorios</w:t>
-      </w:r>
-    </w:p>
-    <w:p>
-      <w:r>
-        <w:t>Se presionó Buscar donantes sin seleccionar especie ni ingresar grupo sanguíneo. La interfaz mostró “Selecciona la especie e ingresa un grupo sanguíneo válido.” Resultado observado: se presentó el mensaje de validación.</w:t>
+        <w:keepNext w:val="1"/>
+        <w:spacing w:after="100" w:before="280" w:lineRule="auto"/>
+        <w:rPr/>
+      </w:pPr>
+      <w:r>
+        <w:rPr>
+          <w:rFonts w:ascii="Calibri" w:cs="Calibri" w:eastAsia="Calibri" w:hAnsi="Calibri"/>
+          <w:b w:val="1"/>
+          <w:bCs w:val="1"/>
+          <w:color w:val="1e3a5f"/>
+          <w:sz w:val="27"/>
+          <w:szCs w:val="27"/>
+          <w:rtl w:val="0"/>
+        </w:rPr>
+        <w:t xml:space="preserve">HU10 Validación de los campos obligatorios</w:t>
+      </w:r>
+    </w:p>
+    <w:p>
+      <w:pPr>
+        <w:spacing w:after="120" w:line="288" w:lineRule="auto"/>
+        <w:rPr/>
+      </w:pPr>
+      <w:r>
+        <w:rPr>
+          <w:rFonts w:ascii="Calibri" w:cs="Calibri" w:eastAsia="Calibri" w:hAnsi="Calibri"/>
+          <w:sz w:val="22"/>
+          <w:szCs w:val="22"/>
+          <w:rtl w:val="0"/>
+        </w:rPr>
+        <w:t xml:space="preserve">Se presionó Buscar donantes sin seleccionar especie ni ingresar grupo sanguíneo. La interfaz mostró “Selecciona la especie e ingresa un grupo sanguíneo válido.” Resultado observado: se presentó el mensaje de validación.</w:t>
       </w:r>
     </w:p>
     <w:p>
       <w:pPr>
         <w:jc w:val="center"/>
-      </w:pPr>
-      <w:r>
+        <w:rPr/>
+      </w:pPr>
+      <w:r>
+        <w:rPr/>
         <w:drawing>
-          <wp:inline>
-            <wp:extent cx="5043918" cy="5394960"/>
-            <wp:docPr id="50" name="Picture 50" descr="HU10 Validación de los campos obligatorios captura original 182730"/>
-            <wp:cNvGraphicFramePr>
-              <a:graphicFrameLocks noChangeAspect="1"/>
-            </wp:cNvGraphicFramePr>
+          <wp:inline distB="0" distT="0" distL="114300" distR="114300">
+            <wp:extent cx="4530977" cy="4846320"/>
+            <wp:effectExtent b="0" l="0" r="0" t="0"/>
+            <wp:docPr descr="HU10 Validación de los campos obligatorios captura original 182730" id="58" name="image17.png"/>
             <a:graphic>
               <a:graphicData uri="http://schemas.openxmlformats.org/drawingml/2006/picture">
                 <pic:pic>
                   <pic:nvPicPr>
-                    <pic:cNvPr id="0" name="image(20261018-182730).png"/>
-                    <pic:cNvPicPr/>
+                    <pic:cNvPr descr="HU10 Validación de los campos obligatorios captura original 182730" id="0" name="image17.png"/>
+                    <pic:cNvPicPr preferRelativeResize="0"/>
                   </pic:nvPicPr>
                   <pic:blipFill>
-                    <a:blip r:embed="rId51"/>
+                    <a:blip r:embed="rId50"/>
+                    <a:srcRect b="0" l="0" r="0" t="0"/>
                     <a:stretch>
                       <a:fillRect/>
                     </a:stretch>
@@ -13378,9 +13750,10 @@
                   <pic:spPr>
                     <a:xfrm>
                       <a:off x="0" y="0"/>
-                      <a:ext cx="5043918" cy="5394960"/>
+                      <a:ext cx="4530977" cy="4846320"/>
                     </a:xfrm>
                     <a:prstGeom prst="rect"/>
+                    <a:ln/>
                   </pic:spPr>
                 </pic:pic>
               </a:graphicData>
@@ -13388,57 +13761,97 @@
           </wp:inline>
         </w:drawing>
       </w:r>
-    </w:p>
-    <w:p>
-      <w:pPr>
-        <w:spacing w:after="80"/>
-      </w:pPr>
-      <w:r>
-        <w:rPr>
-          <w:sz w:val="18"/>
+      <w:r>
+        <w:rPr>
+          <w:rtl w:val="0"/>
+        </w:rPr>
+      </w:r>
+    </w:p>
+    <w:p>
+      <w:pPr>
+        <w:spacing w:after="120" w:line="288" w:lineRule="auto"/>
+        <w:rPr/>
+      </w:pPr>
+      <w:r>
+        <w:rPr>
+          <w:rFonts w:ascii="Calibri" w:cs="Calibri" w:eastAsia="Calibri" w:hAnsi="Calibri"/>
+          <w:sz w:val="22"/>
+          <w:szCs w:val="22"/>
+          <w:rtl w:val="0"/>
         </w:rPr>
         <w:t>Captura original image(20261018-182730).png</w:t>
       </w:r>
     </w:p>
     <w:p>
+      <w:pPr>
+        <w:rPr/>
+      </w:pPr>
       <w:r>
         <w:br w:type="page"/>
       </w:r>
+      <w:r>
+        <w:rPr>
+          <w:rtl w:val="0"/>
+        </w:rPr>
+      </w:r>
     </w:p>
     <w:p>
       <w:pPr>
         <w:pStyle w:val="Heading2"/>
-      </w:pPr>
-      <w:r>
-        <w:t>HU10 Búsqueda con resultados</w:t>
-      </w:r>
-    </w:p>
-    <w:p>
-      <w:r>
-        <w:t>Se buscó la especie Gato y el grupo sanguíneo a, sin preferencia de comuna. Se obtuvo un resultado: kuro, especie Gato, grupo a, con raza y comuna sin especificar. Resultado observado: se mostró el donante coincidente. La compatibilidad médica debe ser confirmada por un veterinario.</w:t>
+        <w:keepNext w:val="1"/>
+        <w:spacing w:after="100" w:before="280" w:lineRule="auto"/>
+        <w:rPr/>
+      </w:pPr>
+      <w:r>
+        <w:rPr>
+          <w:rFonts w:ascii="Calibri" w:cs="Calibri" w:eastAsia="Calibri" w:hAnsi="Calibri"/>
+          <w:b w:val="1"/>
+          <w:bCs w:val="1"/>
+          <w:color w:val="1e3a5f"/>
+          <w:sz w:val="27"/>
+          <w:szCs w:val="27"/>
+          <w:rtl w:val="0"/>
+        </w:rPr>
+        <w:t xml:space="preserve">HU10 Búsqueda con resultados</w:t>
+      </w:r>
+    </w:p>
+    <w:p>
+      <w:pPr>
+        <w:spacing w:after="120" w:line="288" w:lineRule="auto"/>
+        <w:rPr/>
+      </w:pPr>
+      <w:r>
+        <w:rPr>
+          <w:rFonts w:ascii="Calibri" w:cs="Calibri" w:eastAsia="Calibri" w:hAnsi="Calibri"/>
+          <w:sz w:val="22"/>
+          <w:szCs w:val="22"/>
+          <w:rtl w:val="0"/>
+        </w:rPr>
+        <w:t xml:space="preserve">Se buscó la especie Gato y el grupo sanguíneo a, sin preferencia de comuna. Se obtuvo un resultado: kuro, especie Gato, grupo a, con raza y comuna sin especificar. Resultado observado: se mostró el donante coincidente. La compatibilidad médica debe ser confirmada por un veterinario.</w:t>
       </w:r>
     </w:p>
     <w:p>
       <w:pPr>
         <w:jc w:val="center"/>
-      </w:pPr>
-      <w:r>
+        <w:rPr/>
+      </w:pPr>
+      <w:r>
+        <w:rPr/>
         <w:drawing>
-          <wp:inline>
-            <wp:extent cx="3558377" cy="5394959"/>
-            <wp:docPr id="51" name="Picture 51" descr="HU10 Búsqueda con resultados captura original 182816"/>
-            <wp:cNvGraphicFramePr>
-              <a:graphicFrameLocks noChangeAspect="1"/>
-            </wp:cNvGraphicFramePr>
+          <wp:inline distB="0" distT="0" distL="114300" distR="114300">
+            <wp:extent cx="3196508" cy="4846320"/>
+            <wp:effectExtent b="0" l="0" r="0" t="0"/>
+            <wp:docPr descr="HU10 Búsqueda con resultados captura original 182816" id="60" name="image5.png"/>
             <a:graphic>
               <a:graphicData uri="http://schemas.openxmlformats.org/drawingml/2006/picture">
                 <pic:pic>
                   <pic:nvPicPr>
-                    <pic:cNvPr id="0" name="image(20261018-182816).png"/>
-                    <pic:cNvPicPr/>
+                    <pic:cNvPr descr="HU10 Búsqueda con resultados captura original 182816" id="0" name="image5.png"/>
+                    <pic:cNvPicPr preferRelativeResize="0"/>
                   </pic:nvPicPr>
                   <pic:blipFill>
-                    <a:blip r:embed="rId52"/>
+                    <a:blip r:embed="rId51"/>
+                    <a:srcRect b="0" l="0" r="0" t="0"/>
                     <a:stretch>
                       <a:fillRect/>
                     </a:stretch>
@@ -13446,9 +13859,10 @@
                   <pic:spPr>
                     <a:xfrm>
                       <a:off x="0" y="0"/>
-                      <a:ext cx="3558377" cy="5394959"/>
+                      <a:ext cx="3196508" cy="4846320"/>
                     </a:xfrm>
                     <a:prstGeom prst="rect"/>
+                    <a:ln/>
                   </pic:spPr>
                 </pic:pic>
               </a:graphicData>
@@ -13456,57 +13870,105 @@
           </wp:inline>
         </w:drawing>
       </w:r>
-    </w:p>
-    <w:p>
-      <w:pPr>
-        <w:spacing w:after="80"/>
-      </w:pPr>
-      <w:r>
-        <w:rPr>
-          <w:sz w:val="18"/>
-        </w:rPr>
-        <w:t>Captura original image(20261018-182816).png</w:t>
-      </w:r>
-    </w:p>
-    <w:p>
+      <w:r>
+        <w:rPr>
+          <w:rtl w:val="0"/>
+        </w:rPr>
+      </w:r>
+    </w:p>
+    <w:p>
+      <w:pPr>
+        <w:spacing w:after="120" w:line="288" w:lineRule="auto"/>
+        <w:rPr/>
+      </w:pPr>
+      <w:r>
+        <w:rPr>
+          <w:rFonts w:ascii="Calibri" w:cs="Calibri" w:eastAsia="Calibri" w:hAnsi="Calibri"/>
+          <w:sz w:val="22"/>
+          <w:szCs w:val="22"/>
+          <w:rtl w:val="0"/>
+        </w:rPr>
+        <w:t xml:space="preserve">Captura original image(20261018-182816).png</w:t>
+      </w:r>
+      <w:r>
+        <w:rPr>
+          <w:rFonts w:ascii="Calibri" w:cs="Calibri" w:eastAsia="Calibri" w:hAnsi="Calibri"/>
+          <w:sz w:val="22"/>
+          <w:szCs w:val="22"/>
+          <w:rtl w:val="0"/>
+        </w:rPr>
+      </w:r>
+    </w:p>
+    <w:p>
+      <w:pPr>
+        <w:rPr/>
+      </w:pPr>
       <w:r>
         <w:br w:type="page"/>
       </w:r>
+      <w:r>
+        <w:rPr>
+          <w:rtl w:val="0"/>
+        </w:rPr>
+      </w:r>
     </w:p>
     <w:p>
       <w:pPr>
         <w:pStyle w:val="Heading2"/>
-      </w:pPr>
-      <w:r>
-        <w:t>HU10 Búsqueda sin resultados</w:t>
-      </w:r>
-    </w:p>
-    <w:p>
-      <w:r>
-        <w:t>Se buscó la especie Gato y el grupo sanguíneo ab, sin preferencia de comuna. La interfaz mostró “No se encontraron donantes compatibles en este momento”. Resultado observado: se informó la ausencia de coincidencias y no se mantuvo la tarjeta del resultado anterior.</w:t>
+        <w:keepNext w:val="1"/>
+        <w:spacing w:after="100" w:before="280" w:lineRule="auto"/>
+        <w:rPr/>
+      </w:pPr>
+      <w:r>
+        <w:rPr>
+          <w:rFonts w:ascii="Calibri" w:cs="Calibri" w:eastAsia="Calibri" w:hAnsi="Calibri"/>
+          <w:b w:val="1"/>
+          <w:bCs w:val="1"/>
+          <w:color w:val="1e3a5f"/>
+          <w:sz w:val="27"/>
+          <w:szCs w:val="27"/>
+          <w:rtl w:val="0"/>
+        </w:rPr>
+        <w:t xml:space="preserve">HU10 Búsqueda sin resultados</w:t>
+      </w:r>
+    </w:p>
+    <w:p>
+      <w:pPr>
+        <w:spacing w:after="120" w:line="288" w:lineRule="auto"/>
+        <w:rPr/>
+      </w:pPr>
+      <w:r>
+        <w:rPr>
+          <w:rFonts w:ascii="Calibri" w:cs="Calibri" w:eastAsia="Calibri" w:hAnsi="Calibri"/>
+          <w:sz w:val="22"/>
+          <w:szCs w:val="22"/>
+          <w:rtl w:val="0"/>
+        </w:rPr>
+        <w:t xml:space="preserve">Se buscó la especie Gato y el grupo sanguíneo ab, sin preferencia de comuna. La interfaz mostró “No se encontraron donantes compatibles en este momento”. Resultado observado: se informó la ausencia de coincidencias y no se mantuvo la tarjeta del resultado anterior.</w:t>
       </w:r>
     </w:p>
     <w:p>
       <w:pPr>
         <w:jc w:val="center"/>
-      </w:pPr>
-      <w:r>
+        <w:rPr/>
+      </w:pPr>
+      <w:r>
+        <w:rPr/>
         <w:drawing>
-          <wp:inline>
-            <wp:extent cx="3821429" cy="5394960"/>
-            <wp:docPr id="52" name="Picture 52" descr="HU10 Búsqueda sin resultados captura original 182934"/>
-            <wp:cNvGraphicFramePr>
-              <a:graphicFrameLocks noChangeAspect="1"/>
-            </wp:cNvGraphicFramePr>
+          <wp:inline distB="0" distT="0" distL="114300" distR="114300">
+            <wp:extent cx="3432809" cy="4846320"/>
+            <wp:effectExtent b="0" l="0" r="0" t="0"/>
+            <wp:docPr descr="HU10 Búsqueda sin resultados captura original 182934" id="62" name="image15.png"/>
             <a:graphic>
               <a:graphicData uri="http://schemas.openxmlformats.org/drawingml/2006/picture">
                 <pic:pic>
                   <pic:nvPicPr>
-                    <pic:cNvPr id="0" name="image(20261018-182934).png"/>
-                    <pic:cNvPicPr/>
+                    <pic:cNvPr descr="HU10 Búsqueda sin resultados captura original 182934" id="0" name="image15.png"/>
+                    <pic:cNvPicPr preferRelativeResize="0"/>
                   </pic:nvPicPr>
                   <pic:blipFill>
-                    <a:blip r:embed="rId53"/>
+                    <a:blip r:embed="rId52"/>
+                    <a:srcRect b="0" l="0" r="0" t="0"/>
                     <a:stretch>
                       <a:fillRect/>
                     </a:stretch>
@@ -13514,9 +13976,10 @@
                   <pic:spPr>
                     <a:xfrm>
                       <a:off x="0" y="0"/>
-                      <a:ext cx="3821429" cy="5394960"/>
+                      <a:ext cx="3432809" cy="4846320"/>
                     </a:xfrm>
                     <a:prstGeom prst="rect"/>
+                    <a:ln/>
                   </pic:spPr>
                 </pic:pic>
               </a:graphicData>
@@ -13524,20 +13987,37 @@
           </wp:inline>
         </w:drawing>
       </w:r>
-    </w:p>
-    <w:p>
-      <w:pPr>
-        <w:spacing w:after="80"/>
-      </w:pPr>
-      <w:r>
-        <w:rPr>
-          <w:sz w:val="18"/>
-        </w:rPr>
-        <w:t>Captura original image(20261018-182934).png</w:t>
+      <w:r>
+        <w:rPr>
+          <w:rtl w:val="0"/>
+        </w:rPr>
+      </w:r>
+    </w:p>
+    <w:p>
+      <w:pPr>
+        <w:spacing w:after="120" w:line="288" w:lineRule="auto"/>
+        <w:rPr/>
+      </w:pPr>
+      <w:r>
+        <w:rPr>
+          <w:rFonts w:ascii="Calibri" w:cs="Calibri" w:eastAsia="Calibri" w:hAnsi="Calibri"/>
+          <w:sz w:val="22"/>
+          <w:szCs w:val="22"/>
+          <w:rtl w:val="0"/>
+        </w:rPr>
+        <w:t xml:space="preserve">Captura original image(20261018-182934).png</w:t>
+      </w:r>
+      <w:r>
+        <w:rPr>
+          <w:rFonts w:ascii="Calibri" w:cs="Calibri" w:eastAsia="Calibri" w:hAnsi="Calibri"/>
+          <w:sz w:val="22"/>
+          <w:szCs w:val="22"/>
+          <w:rtl w:val="0"/>
+        </w:rPr>
       </w:r>
     </w:p>
     <w:sectPr>
-      <w:footerReference r:id="rId45" w:type="default"/>
+      <w:footerReference r:id="rId53" w:type="default"/>
       <w:pgSz w:h="15840" w:w="12240" w:orient="portrait"/>
       <w:pgMar w:bottom="1200" w:top="1200" w:left="1440" w:right="1440" w:header="708" w:footer="708"/>
       <w:pgNumType w:start="1"/>
@@ -13971,6 +14451,20 @@
       <w:vertAlign w:val="baseline"/>
     </w:rPr>
   </w:style>
+  <w:style w:type="table" w:styleId="TableNormal" w:default="1">
+    <w:name w:val="TableNormal"/>
+    <w:tblPr>
+      <w:tblCellMar>
+        <w:top w:w="100.0" w:type="dxa"/>
+        <w:left w:w="100.0" w:type="dxa"/>
+        <w:bottom w:w="100.0" w:type="dxa"/>
+        <w:right w:w="100.0" w:type="dxa"/>
+      </w:tblCellMar>
+    </w:tblPr>
+  </w:style>
+  <w:style w:type="paragraph" w:styleId="Normal" w:default="1">
+    <w:name w:val="normal"/>
+  </w:style>
   <w:style w:type="paragraph" w:styleId="Strong">
     <w:name w:val="Strong"/>
     <w:basedOn w:val="Normal"/>
@@ -14069,6 +14563,58 @@
       <w:sz w:val="20"/>
       <w:szCs w:val="20"/>
     </w:rPr>
+  </w:style>
+  <w:style w:type="table" w:styleId="Table1">
+    <w:basedOn w:val="TableNormal"/>
+    <w:tblPr>
+      <w:tblStyleRowBandSize w:val="1"/>
+      <w:tblStyleColBandSize w:val="1"/>
+      <w:tblCellMar>
+        <w:top w:w="0.0" w:type="dxa"/>
+        <w:left w:w="115.0" w:type="dxa"/>
+        <w:bottom w:w="0.0" w:type="dxa"/>
+        <w:right w:w="115.0" w:type="dxa"/>
+      </w:tblCellMar>
+    </w:tblPr>
+  </w:style>
+  <w:style w:type="table" w:styleId="Table2">
+    <w:basedOn w:val="TableNormal"/>
+    <w:tblPr>
+      <w:tblStyleRowBandSize w:val="1"/>
+      <w:tblStyleColBandSize w:val="1"/>
+      <w:tblCellMar>
+        <w:top w:w="0.0" w:type="dxa"/>
+        <w:left w:w="115.0" w:type="dxa"/>
+        <w:bottom w:w="0.0" w:type="dxa"/>
+        <w:right w:w="115.0" w:type="dxa"/>
+      </w:tblCellMar>
+    </w:tblPr>
+  </w:style>
+  <w:style w:type="table" w:styleId="Table3">
+    <w:basedOn w:val="TableNormal"/>
+    <w:tblPr>
+      <w:tblStyleRowBandSize w:val="1"/>
+      <w:tblStyleColBandSize w:val="1"/>
+      <w:tblCellMar>
+        <w:top w:w="0.0" w:type="dxa"/>
+        <w:left w:w="115.0" w:type="dxa"/>
+        <w:bottom w:w="0.0" w:type="dxa"/>
+        <w:right w:w="115.0" w:type="dxa"/>
+      </w:tblCellMar>
+    </w:tblPr>
+  </w:style>
+  <w:style w:type="table" w:styleId="Table4">
+    <w:basedOn w:val="TableNormal"/>
+    <w:tblPr>
+      <w:tblStyleRowBandSize w:val="1"/>
+      <w:tblStyleColBandSize w:val="1"/>
+      <w:tblCellMar>
+        <w:top w:w="0.0" w:type="dxa"/>
+        <w:left w:w="115.0" w:type="dxa"/>
+        <w:bottom w:w="0.0" w:type="dxa"/>
+        <w:right w:w="115.0" w:type="dxa"/>
+      </w:tblCellMar>
+    </w:tblPr>
   </w:style>
   <w:style w:type="paragraph" w:styleId="Subtitle">
     <w:name w:val="Subtitle"/>

</xml_diff>

<commit_message>
Quita nombres de archivos bajo las capturas de pruebas
</commit_message>
<xml_diff>
--- a/Fase 2/Evidencias Proyecto/Evidencias de documentación/Pethub_Evidencia_de_Pruebas.docx
+++ b/Fase 2/Evidencias Proyecto/Evidencias de documentación/Pethub_Evidencia_de_Pruebas.docx
@@ -3920,12 +3920,12 @@
           <wp:inline distB="0" distT="0" distL="0" distR="0">
             <wp:extent cx="4762500" cy="3114675"/>
             <wp:effectExtent b="0" l="0" r="0" t="0"/>
-            <wp:docPr descr="Pantallazo de la ejecución de pruebas" id="69" name="image11.png"/>
+            <wp:docPr descr="Pantallazo de la ejecución de pruebas" id="115" name="image17.png"/>
             <a:graphic>
               <a:graphicData uri="http://schemas.openxmlformats.org/drawingml/2006/picture">
                 <pic:pic>
                   <pic:nvPicPr>
-                    <pic:cNvPr descr="Pantallazo de la ejecución de pruebas" id="0" name="image11.png"/>
+                    <pic:cNvPr descr="Pantallazo de la ejecución de pruebas" id="0" name="image17.png"/>
                     <pic:cNvPicPr preferRelativeResize="0"/>
                   </pic:nvPicPr>
                   <pic:blipFill>
@@ -4039,12 +4039,12 @@
           <wp:inline distB="0" distT="0" distL="0" distR="0">
             <wp:extent cx="4953000" cy="2105025"/>
             <wp:effectExtent b="0" l="0" r="0" t="0"/>
-            <wp:docPr descr="Pantallazo de la ejecución de pruebas" id="71" name="image14.png"/>
+            <wp:docPr descr="Pantallazo de la ejecución de pruebas" id="117" name="image13.png"/>
             <a:graphic>
               <a:graphicData uri="http://schemas.openxmlformats.org/drawingml/2006/picture">
                 <pic:pic>
                   <pic:nvPicPr>
-                    <pic:cNvPr descr="Pantallazo de la ejecución de pruebas" id="0" name="image14.png"/>
+                    <pic:cNvPr descr="Pantallazo de la ejecución de pruebas" id="0" name="image13.png"/>
                     <pic:cNvPicPr preferRelativeResize="0"/>
                   </pic:nvPicPr>
                   <pic:blipFill>
@@ -4133,12 +4133,12 @@
           <wp:inline distB="0" distT="0" distL="0" distR="0">
             <wp:extent cx="4953000" cy="1790700"/>
             <wp:effectExtent b="0" l="0" r="0" t="0"/>
-            <wp:docPr descr="Pantallazo de la ejecución de pruebas" id="70" name="image10.png"/>
+            <wp:docPr descr="Pantallazo de la ejecución de pruebas" id="116" name="image16.png"/>
             <a:graphic>
               <a:graphicData uri="http://schemas.openxmlformats.org/drawingml/2006/picture">
                 <pic:pic>
                   <pic:nvPicPr>
-                    <pic:cNvPr descr="Pantallazo de la ejecución de pruebas" id="0" name="image10.png"/>
+                    <pic:cNvPr descr="Pantallazo de la ejecución de pruebas" id="0" name="image16.png"/>
                     <pic:cNvPicPr preferRelativeResize="0"/>
                   </pic:nvPicPr>
                   <pic:blipFill>
@@ -4227,12 +4227,12 @@
           <wp:inline distB="0" distT="0" distL="0" distR="0">
             <wp:extent cx="4953000" cy="1781175"/>
             <wp:effectExtent b="0" l="0" r="0" t="0"/>
-            <wp:docPr descr="Pantallazo de la ejecución de pruebas" id="73" name="image21.png"/>
+            <wp:docPr descr="Pantallazo de la ejecución de pruebas" id="119" name="image24.png"/>
             <a:graphic>
               <a:graphicData uri="http://schemas.openxmlformats.org/drawingml/2006/picture">
                 <pic:pic>
                   <pic:nvPicPr>
-                    <pic:cNvPr descr="Pantallazo de la ejecución de pruebas" id="0" name="image21.png"/>
+                    <pic:cNvPr descr="Pantallazo de la ejecución de pruebas" id="0" name="image24.png"/>
                     <pic:cNvPicPr preferRelativeResize="0"/>
                   </pic:nvPicPr>
                   <pic:blipFill>
@@ -4321,12 +4321,12 @@
           <wp:inline distB="0" distT="0" distL="0" distR="0">
             <wp:extent cx="4953000" cy="1714500"/>
             <wp:effectExtent b="0" l="0" r="0" t="0"/>
-            <wp:docPr descr="Pantallazo de la ejecución de pruebas" id="72" name="image6.png"/>
+            <wp:docPr descr="Pantallazo de la ejecución de pruebas" id="118" name="image20.png"/>
             <a:graphic>
               <a:graphicData uri="http://schemas.openxmlformats.org/drawingml/2006/picture">
                 <pic:pic>
                   <pic:nvPicPr>
-                    <pic:cNvPr descr="Pantallazo de la ejecución de pruebas" id="0" name="image6.png"/>
+                    <pic:cNvPr descr="Pantallazo de la ejecución de pruebas" id="0" name="image20.png"/>
                     <pic:cNvPicPr preferRelativeResize="0"/>
                   </pic:nvPicPr>
                   <pic:blipFill>
@@ -4415,12 +4415,12 @@
           <wp:inline distB="0" distT="0" distL="0" distR="0">
             <wp:extent cx="3124200" cy="3143250"/>
             <wp:effectExtent b="0" l="0" r="0" t="0"/>
-            <wp:docPr descr="Pantallazo de la ejecución de pruebas" id="75" name="image22.png"/>
+            <wp:docPr descr="Pantallazo de la ejecución de pruebas" id="121" name="image29.png"/>
             <a:graphic>
               <a:graphicData uri="http://schemas.openxmlformats.org/drawingml/2006/picture">
                 <pic:pic>
                   <pic:nvPicPr>
-                    <pic:cNvPr descr="Pantallazo de la ejecución de pruebas" id="0" name="image22.png"/>
+                    <pic:cNvPr descr="Pantallazo de la ejecución de pruebas" id="0" name="image29.png"/>
                     <pic:cNvPicPr preferRelativeResize="0"/>
                   </pic:nvPicPr>
                   <pic:blipFill>
@@ -4462,12 +4462,12 @@
           <wp:inline distB="0" distT="0" distL="0" distR="0">
             <wp:extent cx="4191000" cy="1381125"/>
             <wp:effectExtent b="0" l="0" r="0" t="0"/>
-            <wp:docPr descr="Pantallazo de la ejecución de pruebas" id="74" name="image24.png"/>
+            <wp:docPr descr="Pantallazo de la ejecución de pruebas" id="120" name="image21.png"/>
             <a:graphic>
               <a:graphicData uri="http://schemas.openxmlformats.org/drawingml/2006/picture">
                 <pic:pic>
                   <pic:nvPicPr>
-                    <pic:cNvPr descr="Pantallazo de la ejecución de pruebas" id="0" name="image24.png"/>
+                    <pic:cNvPr descr="Pantallazo de la ejecución de pruebas" id="0" name="image21.png"/>
                     <pic:cNvPicPr preferRelativeResize="0"/>
                   </pic:nvPicPr>
                   <pic:blipFill>
@@ -4601,12 +4601,12 @@
           <wp:inline distB="0" distT="0" distL="0" distR="0">
             <wp:extent cx="4953000" cy="1524000"/>
             <wp:effectExtent b="0" l="0" r="0" t="0"/>
-            <wp:docPr descr="Pantallazo de la ejecución de pruebas" id="79" name="image25.png"/>
+            <wp:docPr descr="Pantallazo de la ejecución de pruebas" id="125" name="image27.png"/>
             <a:graphic>
               <a:graphicData uri="http://schemas.openxmlformats.org/drawingml/2006/picture">
                 <pic:pic>
                   <pic:nvPicPr>
-                    <pic:cNvPr descr="Pantallazo de la ejecución de pruebas" id="0" name="image25.png"/>
+                    <pic:cNvPr descr="Pantallazo de la ejecución de pruebas" id="0" name="image27.png"/>
                     <pic:cNvPicPr preferRelativeResize="0"/>
                   </pic:nvPicPr>
                   <pic:blipFill>
@@ -4695,12 +4695,12 @@
           <wp:inline distB="0" distT="0" distL="0" distR="0">
             <wp:extent cx="4953000" cy="2219325"/>
             <wp:effectExtent b="0" l="0" r="0" t="0"/>
-            <wp:docPr descr="Pantallazo de la ejecución de pruebas" id="77" name="image23.png"/>
+            <wp:docPr descr="Pantallazo de la ejecución de pruebas" id="123" name="image40.png"/>
             <a:graphic>
               <a:graphicData uri="http://schemas.openxmlformats.org/drawingml/2006/picture">
                 <pic:pic>
                   <pic:nvPicPr>
-                    <pic:cNvPr descr="Pantallazo de la ejecución de pruebas" id="0" name="image23.png"/>
+                    <pic:cNvPr descr="Pantallazo de la ejecución de pruebas" id="0" name="image40.png"/>
                     <pic:cNvPicPr preferRelativeResize="0"/>
                   </pic:nvPicPr>
                   <pic:blipFill>
@@ -4789,12 +4789,12 @@
           <wp:inline distB="0" distT="0" distL="0" distR="0">
             <wp:extent cx="4953000" cy="1628775"/>
             <wp:effectExtent b="0" l="0" r="0" t="0"/>
-            <wp:docPr descr="Pantallazo de la ejecución de pruebas" id="84" name="image29.png"/>
+            <wp:docPr descr="Pantallazo de la ejecución de pruebas" id="130" name="image28.png"/>
             <a:graphic>
               <a:graphicData uri="http://schemas.openxmlformats.org/drawingml/2006/picture">
                 <pic:pic>
                   <pic:nvPicPr>
-                    <pic:cNvPr descr="Pantallazo de la ejecución de pruebas" id="0" name="image29.png"/>
+                    <pic:cNvPr descr="Pantallazo de la ejecución de pruebas" id="0" name="image28.png"/>
                     <pic:cNvPicPr preferRelativeResize="0"/>
                   </pic:nvPicPr>
                   <pic:blipFill>
@@ -4883,12 +4883,12 @@
           <wp:inline distB="0" distT="0" distL="0" distR="0">
             <wp:extent cx="4191000" cy="2209800"/>
             <wp:effectExtent b="0" l="0" r="0" t="0"/>
-            <wp:docPr descr="Pantallazo de la ejecución de pruebas" id="80" name="image45.png"/>
+            <wp:docPr descr="Pantallazo de la ejecución de pruebas" id="126" name="image36.png"/>
             <a:graphic>
               <a:graphicData uri="http://schemas.openxmlformats.org/drawingml/2006/picture">
                 <pic:pic>
                   <pic:nvPicPr>
-                    <pic:cNvPr descr="Pantallazo de la ejecución de pruebas" id="0" name="image45.png"/>
+                    <pic:cNvPr descr="Pantallazo de la ejecución de pruebas" id="0" name="image36.png"/>
                     <pic:cNvPicPr preferRelativeResize="0"/>
                   </pic:nvPicPr>
                   <pic:blipFill>
@@ -4930,12 +4930,12 @@
           <wp:inline distB="0" distT="0" distL="0" distR="0">
             <wp:extent cx="3762375" cy="2238375"/>
             <wp:effectExtent b="0" l="0" r="0" t="0"/>
-            <wp:docPr descr="Pantallazo de la ejecución de pruebas" id="82" name="image31.png"/>
+            <wp:docPr descr="Pantallazo de la ejecución de pruebas" id="128" name="image33.png"/>
             <a:graphic>
               <a:graphicData uri="http://schemas.openxmlformats.org/drawingml/2006/picture">
                 <pic:pic>
                   <pic:nvPicPr>
-                    <pic:cNvPr descr="Pantallazo de la ejecución de pruebas" id="0" name="image31.png"/>
+                    <pic:cNvPr descr="Pantallazo de la ejecución de pruebas" id="0" name="image33.png"/>
                     <pic:cNvPicPr preferRelativeResize="0"/>
                   </pic:nvPicPr>
                   <pic:blipFill>
@@ -4977,12 +4977,12 @@
           <wp:inline distB="0" distT="0" distL="0" distR="0">
             <wp:extent cx="3800475" cy="2238375"/>
             <wp:effectExtent b="0" l="0" r="0" t="0"/>
-            <wp:docPr descr="Pantallazo de la ejecución de pruebas" id="85" name="image30.png"/>
+            <wp:docPr descr="Pantallazo de la ejecución de pruebas" id="131" name="image32.png"/>
             <a:graphic>
               <a:graphicData uri="http://schemas.openxmlformats.org/drawingml/2006/picture">
                 <pic:pic>
                   <pic:nvPicPr>
-                    <pic:cNvPr descr="Pantallazo de la ejecución de pruebas" id="0" name="image30.png"/>
+                    <pic:cNvPr descr="Pantallazo de la ejecución de pruebas" id="0" name="image32.png"/>
                     <pic:cNvPicPr preferRelativeResize="0"/>
                   </pic:nvPicPr>
                   <pic:blipFill>
@@ -5024,12 +5024,12 @@
           <wp:inline distB="0" distT="0" distL="0" distR="0">
             <wp:extent cx="2190750" cy="857250"/>
             <wp:effectExtent b="0" l="0" r="0" t="0"/>
-            <wp:docPr descr="Pantallazo de la ejecución de pruebas" id="87" name="image19.png"/>
+            <wp:docPr descr="Pantallazo de la ejecución de pruebas" id="133" name="image30.png"/>
             <a:graphic>
               <a:graphicData uri="http://schemas.openxmlformats.org/drawingml/2006/picture">
                 <pic:pic>
                   <pic:nvPicPr>
-                    <pic:cNvPr descr="Pantallazo de la ejecución de pruebas" id="0" name="image19.png"/>
+                    <pic:cNvPr descr="Pantallazo de la ejecución de pruebas" id="0" name="image30.png"/>
                     <pic:cNvPicPr preferRelativeResize="0"/>
                   </pic:nvPicPr>
                   <pic:blipFill>
@@ -5204,12 +5204,12 @@
           <wp:inline distB="0" distT="0" distL="0" distR="0">
             <wp:extent cx="3876675" cy="3619500"/>
             <wp:effectExtent b="0" l="0" r="0" t="0"/>
-            <wp:docPr descr="Pantallazo de la ejecución de pruebas" id="89" name="image44.png"/>
+            <wp:docPr descr="Pantallazo de la ejecución de pruebas" id="135" name="image38.png"/>
             <a:graphic>
               <a:graphicData uri="http://schemas.openxmlformats.org/drawingml/2006/picture">
                 <pic:pic>
                   <pic:nvPicPr>
-                    <pic:cNvPr descr="Pantallazo de la ejecución de pruebas" id="0" name="image44.png"/>
+                    <pic:cNvPr descr="Pantallazo de la ejecución de pruebas" id="0" name="image38.png"/>
                     <pic:cNvPicPr preferRelativeResize="0"/>
                   </pic:nvPicPr>
                   <pic:blipFill>
@@ -5251,12 +5251,12 @@
           <wp:inline distB="0" distT="0" distL="0" distR="0">
             <wp:extent cx="4191000" cy="733425"/>
             <wp:effectExtent b="0" l="0" r="0" t="0"/>
-            <wp:docPr descr="Pantallazo de la ejecución de pruebas" id="91" name="image42.png"/>
+            <wp:docPr descr="Pantallazo de la ejecución de pruebas" id="137" name="image39.png"/>
             <a:graphic>
               <a:graphicData uri="http://schemas.openxmlformats.org/drawingml/2006/picture">
                 <pic:pic>
                   <pic:nvPicPr>
-                    <pic:cNvPr descr="Pantallazo de la ejecución de pruebas" id="0" name="image42.png"/>
+                    <pic:cNvPr descr="Pantallazo de la ejecución de pruebas" id="0" name="image39.png"/>
                     <pic:cNvPicPr preferRelativeResize="0"/>
                   </pic:nvPicPr>
                   <pic:blipFill>
@@ -5365,12 +5365,12 @@
           <wp:inline distB="0" distT="0" distL="0" distR="0">
             <wp:extent cx="4381500" cy="1876425"/>
             <wp:effectExtent b="0" l="0" r="0" t="0"/>
-            <wp:docPr descr="Pantallazo de la ejecución de pruebas" id="93" name="image35.png"/>
+            <wp:docPr descr="Pantallazo de la ejecución de pruebas" id="139" name="image43.png"/>
             <a:graphic>
               <a:graphicData uri="http://schemas.openxmlformats.org/drawingml/2006/picture">
                 <pic:pic>
                   <pic:nvPicPr>
-                    <pic:cNvPr descr="Pantallazo de la ejecución de pruebas" id="0" name="image35.png"/>
+                    <pic:cNvPr descr="Pantallazo de la ejecución de pruebas" id="0" name="image43.png"/>
                     <pic:cNvPicPr preferRelativeResize="0"/>
                   </pic:nvPicPr>
                   <pic:blipFill>
@@ -5504,12 +5504,12 @@
           <wp:inline distB="0" distT="0" distL="0" distR="0">
             <wp:extent cx="3619500" cy="2047875"/>
             <wp:effectExtent b="0" l="0" r="0" t="0"/>
-            <wp:docPr descr="Pantallazo de la ejecución de pruebas" id="95" name="image41.png"/>
+            <wp:docPr descr="Pantallazo de la ejecución de pruebas" id="141" name="image42.png"/>
             <a:graphic>
               <a:graphicData uri="http://schemas.openxmlformats.org/drawingml/2006/picture">
                 <pic:pic>
                   <pic:nvPicPr>
-                    <pic:cNvPr descr="Pantallazo de la ejecución de pruebas" id="0" name="image41.png"/>
+                    <pic:cNvPr descr="Pantallazo de la ejecución de pruebas" id="0" name="image42.png"/>
                     <pic:cNvPicPr preferRelativeResize="0"/>
                   </pic:nvPicPr>
                   <pic:blipFill>
@@ -5741,12 +5741,12 @@
           <wp:inline distB="0" distT="0" distL="0" distR="0">
             <wp:extent cx="4381500" cy="2276475"/>
             <wp:effectExtent b="0" l="0" r="0" t="0"/>
-            <wp:docPr descr="Pantallazo de la ejecución de pruebas" id="97" name="image43.png"/>
+            <wp:docPr descr="Pantallazo de la ejecución de pruebas" id="143" name="image46.png"/>
             <a:graphic>
               <a:graphicData uri="http://schemas.openxmlformats.org/drawingml/2006/picture">
                 <pic:pic>
                   <pic:nvPicPr>
-                    <pic:cNvPr descr="Pantallazo de la ejecución de pruebas" id="0" name="image43.png"/>
+                    <pic:cNvPr descr="Pantallazo de la ejecución de pruebas" id="0" name="image46.png"/>
                     <pic:cNvPicPr preferRelativeResize="0"/>
                   </pic:nvPicPr>
                   <pic:blipFill>
@@ -5855,12 +5855,12 @@
           <wp:inline distB="0" distT="0" distL="114300" distR="114300">
             <wp:extent cx="4191000" cy="2038149"/>
             <wp:effectExtent b="0" l="0" r="0" t="0"/>
-            <wp:docPr id="98" name="image40.png"/>
+            <wp:docPr id="144" name="image41.png"/>
             <a:graphic>
               <a:graphicData uri="http://schemas.openxmlformats.org/drawingml/2006/picture">
                 <pic:pic>
                   <pic:nvPicPr>
-                    <pic:cNvPr id="0" name="image40.png"/>
+                    <pic:cNvPr id="0" name="image41.png"/>
                     <pic:cNvPicPr preferRelativeResize="0"/>
                   </pic:nvPicPr>
                   <pic:blipFill>
@@ -5989,12 +5989,12 @@
           <wp:inline distB="0" distT="0" distL="114300" distR="114300">
             <wp:extent cx="4191000" cy="2156945"/>
             <wp:effectExtent b="0" l="0" r="0" t="0"/>
-            <wp:docPr id="55" name="image20.png"/>
+            <wp:docPr id="101" name="image7.png"/>
             <a:graphic>
               <a:graphicData uri="http://schemas.openxmlformats.org/drawingml/2006/picture">
                 <pic:pic>
                   <pic:nvPicPr>
-                    <pic:cNvPr id="0" name="image20.png"/>
+                    <pic:cNvPr id="0" name="image7.png"/>
                     <pic:cNvPicPr preferRelativeResize="0"/>
                   </pic:nvPicPr>
                   <pic:blipFill>
@@ -6082,12 +6082,12 @@
           <wp:inline distB="0" distT="0" distL="114300" distR="114300">
             <wp:extent cx="5303520" cy="2948792"/>
             <wp:effectExtent b="0" l="0" r="0" t="0"/>
-            <wp:docPr id="57" name="image9.png"/>
+            <wp:docPr id="103" name="image10.png"/>
             <a:graphic>
               <a:graphicData uri="http://schemas.openxmlformats.org/drawingml/2006/picture">
                 <pic:pic>
                   <pic:nvPicPr>
-                    <pic:cNvPr id="0" name="image9.png"/>
+                    <pic:cNvPr id="0" name="image10.png"/>
                     <pic:cNvPicPr preferRelativeResize="0"/>
                   </pic:nvPicPr>
                   <pic:blipFill>
@@ -6189,12 +6189,12 @@
           <wp:inline distB="0" distT="0" distL="114300" distR="114300">
             <wp:extent cx="5303520" cy="2783320"/>
             <wp:effectExtent b="0" l="0" r="0" t="0"/>
-            <wp:docPr id="59" name="image46.png"/>
+            <wp:docPr id="105" name="image14.png"/>
             <a:graphic>
               <a:graphicData uri="http://schemas.openxmlformats.org/drawingml/2006/picture">
                 <pic:pic>
                   <pic:nvPicPr>
-                    <pic:cNvPr id="0" name="image46.png"/>
+                    <pic:cNvPr id="0" name="image14.png"/>
                     <pic:cNvPicPr preferRelativeResize="0"/>
                   </pic:nvPicPr>
                   <pic:blipFill>
@@ -6255,6 +6255,11 @@
         </w:rPr>
         <w:t xml:space="preserve">S3-HU09 Solicitudes de sangre</w:t>
       </w:r>
+      <w:r>
+        <w:rPr>
+          <w:rtl w:val="0"/>
+        </w:rPr>
+      </w:r>
     </w:p>
     <w:p>
       <w:pPr>
@@ -6269,6 +6274,11 @@
           <w:rtl w:val="0"/>
         </w:rPr>
         <w:t xml:space="preserve">Se agregaron 12 pruebas de SolicitudesSangreComponent: consulta autenticada y separación de estados; listas vacías; urgencia obligatoria; rechazo de espacios en el grupo; publicación autenticada con datos normalizados y confirmación del servidor; bloqueo de publicaciones simultáneas; conservación del formulario y reintento; resolución con PUT sin duplicar; manejo de errores de resolución; actualización tras un conflicto 409; reintento de carga y sesión inválida.</w:t>
+      </w:r>
+      <w:r>
+        <w:rPr>
+          <w:rtl w:val="0"/>
+        </w:rPr>
       </w:r>
     </w:p>
     <w:p>
@@ -6290,6 +6300,11 @@
         </w:rPr>
         <w:t xml:space="preserve">S3-HU10 Búsqueda de donantes</w:t>
       </w:r>
+      <w:r>
+        <w:rPr>
+          <w:rtl w:val="0"/>
+        </w:rPr>
+      </w:r>
     </w:p>
     <w:p>
       <w:pPr>
@@ -6304,6 +6319,11 @@
           <w:rtl w:val="0"/>
         </w:rPr>
         <w:t xml:space="preserve">Se agregaron 9 pruebas de BuscarDonantesComponent: ausencia de consultas iniciales; campos obligatorios; rechazo de espacios; parámetros normalizados y token; visualización de datos; conservación del orden enviado por el servidor; lista vacía; prevención de envíos simultáneos; limpieza de resultados anteriores, reintento y sesión inválida. La prueba de prioridad conserva el orden simulado del backend; la regla de ordenación de la API corresponde a sus pruebas de integración.</w:t>
+      </w:r>
+      <w:r>
+        <w:rPr>
+          <w:rtl w:val="0"/>
+        </w:rPr>
       </w:r>
     </w:p>
     <w:p>
@@ -6325,6 +6345,11 @@
         </w:rPr>
         <w:t xml:space="preserve">Ejecución completa del 18 de octubre de 2026</w:t>
       </w:r>
+      <w:r>
+        <w:rPr>
+          <w:rtl w:val="0"/>
+        </w:rPr>
+      </w:r>
     </w:p>
     <w:p>
       <w:pPr>
@@ -6339,6 +6364,11 @@
           <w:rtl w:val="0"/>
         </w:rPr>
         <w:t xml:space="preserve">Las 21 pruebas nuevas y las 45 existentes finalizaron correctamente: 66 de 66 pruebas aprobadas en 14 archivos, sin fallos. Duración: 3,37 segundos. Esta ejecución se realizó en el entorno de verificación del código del repositorio, con Node.js 24 y la telemetría de Angular desactivada. No se utilizó la base de datos real. La imagen siguiente reproduce el registro de salida de esa ejecución; no es una captura del computador de Paulina.</w:t>
+      </w:r>
+      <w:r>
+        <w:rPr>
+          <w:rtl w:val="0"/>
+        </w:rPr>
       </w:r>
     </w:p>
     <w:p>
@@ -6352,12 +6382,12 @@
           <wp:inline distB="0" distT="0" distL="114300" distR="114300">
             <wp:extent cx="5577840" cy="1972651"/>
             <wp:effectExtent b="0" l="0" r="0" t="0"/>
-            <wp:docPr id="61" name="image1.png"/>
+            <wp:docPr id="107" name="image4.png"/>
             <a:graphic>
               <a:graphicData uri="http://schemas.openxmlformats.org/drawingml/2006/picture">
                 <pic:pic>
                   <pic:nvPicPr>
-                    <pic:cNvPr id="0" name="image1.png"/>
+                    <pic:cNvPr id="0" name="image4.png"/>
                     <pic:cNvPicPr preferRelativeResize="0"/>
                   </pic:nvPicPr>
                   <pic:blipFill>
@@ -6400,6 +6430,11 @@
           <w:rtl w:val="0"/>
         </w:rPr>
         <w:t xml:space="preserve">Registro de ejecución: pruebas_hu09_hu10.log. Archivos nuevos: solicitudes-sangre.component.spec.ts y buscar-donantes.component.spec.ts.</w:t>
+      </w:r>
+      <w:r>
+        <w:rPr>
+          <w:rtl w:val="0"/>
+        </w:rPr>
       </w:r>
     </w:p>
     <w:p>
@@ -7840,12 +7875,12 @@
           <wp:inline distB="0" distT="0" distL="0" distR="0">
             <wp:extent cx="4762500" cy="1638300"/>
             <wp:effectExtent b="0" l="0" r="0" t="0"/>
-            <wp:docPr descr="Pantallazo de la ejecución de pruebas" id="63" name="image3.png"/>
+            <wp:docPr descr="Pantallazo de la ejecución de pruebas" id="109" name="image12.png"/>
             <a:graphic>
               <a:graphicData uri="http://schemas.openxmlformats.org/drawingml/2006/picture">
                 <pic:pic>
                   <pic:nvPicPr>
-                    <pic:cNvPr descr="Pantallazo de la ejecución de pruebas" id="0" name="image3.png"/>
+                    <pic:cNvPr descr="Pantallazo de la ejecución de pruebas" id="0" name="image12.png"/>
                     <pic:cNvPicPr preferRelativeResize="0"/>
                   </pic:nvPicPr>
                   <pic:blipFill>
@@ -8102,12 +8137,12 @@
           <wp:inline distB="0" distT="0" distL="0" distR="0">
             <wp:extent cx="4762500" cy="1809750"/>
             <wp:effectExtent b="0" l="0" r="0" t="0"/>
-            <wp:docPr descr="Pantallazo de la ejecución de pruebas" id="64" name="image13.png"/>
+            <wp:docPr descr="Pantallazo de la ejecución de pruebas" id="110" name="image18.png"/>
             <a:graphic>
               <a:graphicData uri="http://schemas.openxmlformats.org/drawingml/2006/picture">
                 <pic:pic>
                   <pic:nvPicPr>
-                    <pic:cNvPr descr="Pantallazo de la ejecución de pruebas" id="0" name="image13.png"/>
+                    <pic:cNvPr descr="Pantallazo de la ejecución de pruebas" id="0" name="image18.png"/>
                     <pic:cNvPicPr preferRelativeResize="0"/>
                   </pic:nvPicPr>
                   <pic:blipFill>
@@ -8364,12 +8399,12 @@
           <wp:inline distB="0" distT="0" distL="0" distR="0">
             <wp:extent cx="3810000" cy="1438275"/>
             <wp:effectExtent b="0" l="0" r="0" t="0"/>
-            <wp:docPr descr="Pantallazo de la ejecución de pruebas" id="65" name="image7.png"/>
+            <wp:docPr descr="Pantallazo de la ejecución de pruebas" id="111" name="image11.png"/>
             <a:graphic>
               <a:graphicData uri="http://schemas.openxmlformats.org/drawingml/2006/picture">
                 <pic:pic>
                   <pic:nvPicPr>
-                    <pic:cNvPr descr="Pantallazo de la ejecución de pruebas" id="0" name="image7.png"/>
+                    <pic:cNvPr descr="Pantallazo de la ejecución de pruebas" id="0" name="image11.png"/>
                     <pic:cNvPicPr preferRelativeResize="0"/>
                   </pic:nvPicPr>
                   <pic:blipFill>
@@ -8602,12 +8637,12 @@
           <wp:inline distB="0" distT="0" distL="0" distR="0">
             <wp:extent cx="4762500" cy="1819275"/>
             <wp:effectExtent b="0" l="0" r="0" t="0"/>
-            <wp:docPr descr="Pantallazo de la ejecución de pruebas" id="66" name="image16.png"/>
+            <wp:docPr descr="Pantallazo de la ejecución de pruebas" id="112" name="image19.png"/>
             <a:graphic>
               <a:graphicData uri="http://schemas.openxmlformats.org/drawingml/2006/picture">
                 <pic:pic>
                   <pic:nvPicPr>
-                    <pic:cNvPr descr="Pantallazo de la ejecución de pruebas" id="0" name="image16.png"/>
+                    <pic:cNvPr descr="Pantallazo de la ejecución de pruebas" id="0" name="image19.png"/>
                     <pic:cNvPicPr preferRelativeResize="0"/>
                   </pic:nvPicPr>
                   <pic:blipFill>
@@ -10463,12 +10498,12 @@
           <wp:inline distB="0" distT="0" distL="0" distR="0">
             <wp:extent cx="4191000" cy="2133600"/>
             <wp:effectExtent b="0" l="0" r="0" t="0"/>
-            <wp:docPr descr="Pantallazo de la ejecución de pruebas" id="67" name="image8.png"/>
+            <wp:docPr descr="Pantallazo de la ejecución de pruebas" id="113" name="image15.png"/>
             <a:graphic>
               <a:graphicData uri="http://schemas.openxmlformats.org/drawingml/2006/picture">
                 <pic:pic>
                   <pic:nvPicPr>
-                    <pic:cNvPr descr="Pantallazo de la ejecución de pruebas" id="0" name="image8.png"/>
+                    <pic:cNvPr descr="Pantallazo de la ejecución de pruebas" id="0" name="image15.png"/>
                     <pic:cNvPicPr preferRelativeResize="0"/>
                   </pic:nvPicPr>
                   <pic:blipFill>
@@ -10701,12 +10736,12 @@
           <wp:inline distB="0" distT="0" distL="0" distR="0">
             <wp:extent cx="4191000" cy="1447800"/>
             <wp:effectExtent b="0" l="0" r="0" t="0"/>
-            <wp:docPr descr="Pantallazo de la ejecución de pruebas" id="68" name="image12.png"/>
+            <wp:docPr descr="Pantallazo de la ejecución de pruebas" id="114" name="image9.png"/>
             <a:graphic>
               <a:graphicData uri="http://schemas.openxmlformats.org/drawingml/2006/picture">
                 <pic:pic>
                   <pic:nvPicPr>
-                    <pic:cNvPr descr="Pantallazo de la ejecución de pruebas" id="0" name="image12.png"/>
+                    <pic:cNvPr descr="Pantallazo de la ejecución de pruebas" id="0" name="image9.png"/>
                     <pic:cNvPicPr preferRelativeResize="0"/>
                   </pic:nvPicPr>
                   <pic:blipFill>
@@ -10843,12 +10878,12 @@
           <wp:inline distB="0" distT="0" distL="0" distR="0">
             <wp:extent cx="3114675" cy="2857500"/>
             <wp:effectExtent b="0" l="0" r="0" t="0"/>
-            <wp:docPr descr="Pantallazo de la ejecución de pruebas" id="76" name="image28.png"/>
+            <wp:docPr descr="Pantallazo de la ejecución de pruebas" id="122" name="image26.png"/>
             <a:graphic>
               <a:graphicData uri="http://schemas.openxmlformats.org/drawingml/2006/picture">
                 <pic:pic>
                   <pic:nvPicPr>
-                    <pic:cNvPr descr="Pantallazo de la ejecución de pruebas" id="0" name="image28.png"/>
+                    <pic:cNvPr descr="Pantallazo de la ejecución de pruebas" id="0" name="image26.png"/>
                     <pic:cNvPicPr preferRelativeResize="0"/>
                   </pic:nvPicPr>
                   <pic:blipFill>
@@ -10985,12 +11020,12 @@
           <wp:inline distB="0" distT="0" distL="0" distR="0">
             <wp:extent cx="4000500" cy="2714625"/>
             <wp:effectExtent b="0" l="0" r="0" t="0"/>
-            <wp:docPr descr="Pantallazo de la ejecución de pruebas" id="78" name="image26.png"/>
+            <wp:docPr descr="Pantallazo de la ejecución de pruebas" id="124" name="image23.png"/>
             <a:graphic>
               <a:graphicData uri="http://schemas.openxmlformats.org/drawingml/2006/picture">
                 <pic:pic>
                   <pic:nvPicPr>
-                    <pic:cNvPr descr="Pantallazo de la ejecución de pruebas" id="0" name="image26.png"/>
+                    <pic:cNvPr descr="Pantallazo de la ejecución de pruebas" id="0" name="image23.png"/>
                     <pic:cNvPicPr preferRelativeResize="0"/>
                   </pic:nvPicPr>
                   <pic:blipFill>
@@ -11127,12 +11162,12 @@
           <wp:inline distB="0" distT="0" distL="0" distR="0">
             <wp:extent cx="4000500" cy="1466850"/>
             <wp:effectExtent b="0" l="0" r="0" t="0"/>
-            <wp:docPr descr="Pantallazo de la ejecución de pruebas" id="81" name="image33.png"/>
+            <wp:docPr descr="Pantallazo de la ejecución de pruebas" id="127" name="image25.png"/>
             <a:graphic>
               <a:graphicData uri="http://schemas.openxmlformats.org/drawingml/2006/picture">
                 <pic:pic>
                   <pic:nvPicPr>
-                    <pic:cNvPr descr="Pantallazo de la ejecución de pruebas" id="0" name="image33.png"/>
+                    <pic:cNvPr descr="Pantallazo de la ejecución de pruebas" id="0" name="image25.png"/>
                     <pic:cNvPicPr preferRelativeResize="0"/>
                   </pic:nvPicPr>
                   <pic:blipFill>
@@ -11269,12 +11304,12 @@
           <wp:inline distB="0" distT="0" distL="0" distR="0">
             <wp:extent cx="4000500" cy="2362200"/>
             <wp:effectExtent b="0" l="0" r="0" t="0"/>
-            <wp:docPr descr="Pantallazo de la ejecución de pruebas" id="83" name="image27.png"/>
+            <wp:docPr descr="Pantallazo de la ejecución de pruebas" id="129" name="image22.png"/>
             <a:graphic>
               <a:graphicData uri="http://schemas.openxmlformats.org/drawingml/2006/picture">
                 <pic:pic>
                   <pic:nvPicPr>
-                    <pic:cNvPr descr="Pantallazo de la ejecución de pruebas" id="0" name="image27.png"/>
+                    <pic:cNvPr descr="Pantallazo de la ejecución de pruebas" id="0" name="image22.png"/>
                     <pic:cNvPicPr preferRelativeResize="0"/>
                   </pic:nvPicPr>
                   <pic:blipFill>
@@ -12618,7 +12653,7 @@
           <wp:inline distB="0" distT="0" distL="0" distR="0">
             <wp:extent cx="3143250" cy="2857500"/>
             <wp:effectExtent b="0" l="0" r="0" t="0"/>
-            <wp:docPr descr="Pantallazo de la ejecución de pruebas" id="86" name="image34.png"/>
+            <wp:docPr descr="Pantallazo de la ejecución de pruebas" id="132" name="image34.png"/>
             <a:graphic>
               <a:graphicData uri="http://schemas.openxmlformats.org/drawingml/2006/picture">
                 <pic:pic>
@@ -12760,12 +12795,12 @@
           <wp:inline distB="0" distT="0" distL="0" distR="0">
             <wp:extent cx="2924175" cy="2857500"/>
             <wp:effectExtent b="0" l="0" r="0" t="0"/>
-            <wp:docPr descr="Pantallazo de la ejecución de pruebas" id="88" name="image32.png"/>
+            <wp:docPr descr="Pantallazo de la ejecución de pruebas" id="134" name="image31.png"/>
             <a:graphic>
               <a:graphicData uri="http://schemas.openxmlformats.org/drawingml/2006/picture">
                 <pic:pic>
                   <pic:nvPicPr>
-                    <pic:cNvPr descr="Pantallazo de la ejecución de pruebas" id="0" name="image32.png"/>
+                    <pic:cNvPr descr="Pantallazo de la ejecución de pruebas" id="0" name="image31.png"/>
                     <pic:cNvPicPr preferRelativeResize="0"/>
                   </pic:nvPicPr>
                   <pic:blipFill>
@@ -12902,12 +12937,12 @@
           <wp:inline distB="0" distT="0" distL="0" distR="0">
             <wp:extent cx="4000500" cy="1438275"/>
             <wp:effectExtent b="0" l="0" r="0" t="0"/>
-            <wp:docPr descr="Pantallazo de la ejecución de pruebas" id="90" name="image36.png"/>
+            <wp:docPr descr="Pantallazo de la ejecución de pruebas" id="136" name="image37.png"/>
             <a:graphic>
               <a:graphicData uri="http://schemas.openxmlformats.org/drawingml/2006/picture">
                 <pic:pic>
                   <pic:nvPicPr>
-                    <pic:cNvPr descr="Pantallazo de la ejecución de pruebas" id="0" name="image36.png"/>
+                    <pic:cNvPr descr="Pantallazo de la ejecución de pruebas" id="0" name="image37.png"/>
                     <pic:cNvPicPr preferRelativeResize="0"/>
                   </pic:nvPicPr>
                   <pic:blipFill>
@@ -13044,12 +13079,12 @@
           <wp:inline distB="0" distT="0" distL="0" distR="0">
             <wp:extent cx="4000500" cy="1304925"/>
             <wp:effectExtent b="0" l="0" r="0" t="0"/>
-            <wp:docPr descr="Pantallazo de la ejecución de pruebas" id="92" name="image39.png"/>
+            <wp:docPr descr="Pantallazo de la ejecución de pruebas" id="138" name="image35.png"/>
             <a:graphic>
               <a:graphicData uri="http://schemas.openxmlformats.org/drawingml/2006/picture">
                 <pic:pic>
                   <pic:nvPicPr>
-                    <pic:cNvPr descr="Pantallazo de la ejecución de pruebas" id="0" name="image39.png"/>
+                    <pic:cNvPr descr="Pantallazo de la ejecución de pruebas" id="0" name="image35.png"/>
                     <pic:cNvPicPr preferRelativeResize="0"/>
                   </pic:nvPicPr>
                   <pic:blipFill>
@@ -13133,6 +13168,11 @@
         </w:rPr>
         <w:t xml:space="preserve">4 Capturas de pruebas en la interfaz</w:t>
       </w:r>
+      <w:r>
+        <w:rPr>
+          <w:rtl w:val="0"/>
+        </w:rPr>
+      </w:r>
     </w:p>
     <w:p>
       <w:pPr>
@@ -13141,12 +13181,8 @@
       </w:pPr>
       <w:r>
         <w:rPr>
-          <w:rFonts w:ascii="Calibri" w:cs="Calibri" w:eastAsia="Calibri" w:hAnsi="Calibri"/>
-          <w:sz w:val="22"/>
-          <w:szCs w:val="22"/>
-          <w:rtl w:val="0"/>
-        </w:rPr>
-        <w:t xml:space="preserve">Pruebas realizadas por Paulina el 18 de octubre de 2026 en su entorno local. Se conservan las capturas originales recibidas, sin reconstruir la consola ni modificar los mensajes de la aplicación.</w:t>
+          <w:rtl w:val="0"/>
+        </w:rPr>
       </w:r>
     </w:p>
     <w:p>
@@ -13168,6 +13204,11 @@
         </w:rPr>
         <w:t xml:space="preserve">Ejecución del frontend en el computador de Paulina</w:t>
       </w:r>
+      <w:r>
+        <w:rPr>
+          <w:rtl w:val="0"/>
+        </w:rPr>
+      </w:r>
     </w:p>
     <w:p>
       <w:pPr>
@@ -13182,6 +13223,11 @@
           <w:rtl w:val="0"/>
         </w:rPr>
         <w:t xml:space="preserve">Se ejecutó npm.cmd test -- --watch=false en Visual Studio Code. La captura muestra 14 archivos aprobados y 66 pruebas aprobadas, incluidas las 12 de solicitudes de sangre y las 9 del buscador. Estas pruebas automatizadas simulan las solicitudes HTTP; su resultado se distingue de las pruebas manuales de interfaz que siguen.</w:t>
+      </w:r>
+      <w:r>
+        <w:rPr>
+          <w:rtl w:val="0"/>
+        </w:rPr>
       </w:r>
     </w:p>
     <w:p>
@@ -13195,12 +13241,12 @@
           <wp:inline distB="0" distT="0" distL="114300" distR="114300">
             <wp:extent cx="5486400" cy="3594735"/>
             <wp:effectExtent b="0" l="0" r="0" t="0"/>
-            <wp:docPr descr="Ejecución del frontend en el computador de Paulina captura original 181649" id="94" name="image38.png"/>
+            <wp:docPr descr="Ejecución del frontend en el computador de Paulina captura original 181649" id="140" name="image45.png"/>
             <a:graphic>
               <a:graphicData uri="http://schemas.openxmlformats.org/drawingml/2006/picture">
                 <pic:pic>
                   <pic:nvPicPr>
-                    <pic:cNvPr descr="Ejecución del frontend en el computador de Paulina captura original 181649" id="0" name="image38.png"/>
+                    <pic:cNvPr descr="Ejecución del frontend en el computador de Paulina captura original 181649" id="0" name="image45.png"/>
                     <pic:cNvPicPr preferRelativeResize="0"/>
                   </pic:nvPicPr>
                   <pic:blipFill>
@@ -13232,29 +13278,6 @@
     </w:p>
     <w:p>
       <w:pPr>
-        <w:spacing w:after="120" w:line="288" w:lineRule="auto"/>
-        <w:rPr/>
-      </w:pPr>
-      <w:r>
-        <w:rPr>
-          <w:rFonts w:ascii="Calibri" w:cs="Calibri" w:eastAsia="Calibri" w:hAnsi="Calibri"/>
-          <w:sz w:val="22"/>
-          <w:szCs w:val="22"/>
-          <w:rtl w:val="0"/>
-        </w:rPr>
-        <w:t xml:space="preserve">Captura original image(20261018-181649).png</w:t>
-      </w:r>
-      <w:r>
-        <w:rPr>
-          <w:rFonts w:ascii="Calibri" w:cs="Calibri" w:eastAsia="Calibri" w:hAnsi="Calibri"/>
-          <w:sz w:val="22"/>
-          <w:szCs w:val="22"/>
-          <w:rtl w:val="0"/>
-        </w:rPr>
-      </w:r>
-    </w:p>
-    <w:p>
-      <w:pPr>
         <w:rPr/>
       </w:pPr>
       <w:r>
@@ -13285,6 +13308,11 @@
         </w:rPr>
         <w:t xml:space="preserve">HU09 Validación del nivel de urgencia</w:t>
       </w:r>
+      <w:r>
+        <w:rPr>
+          <w:rtl w:val="0"/>
+        </w:rPr>
+      </w:r>
     </w:p>
     <w:p>
       <w:pPr>
@@ -13299,6 +13327,11 @@
           <w:rtl w:val="0"/>
         </w:rPr>
         <w:t xml:space="preserve">Con especie Gato y grupo sanguíneo a, se intentó publicar sin seleccionar urgencia. La interfaz mostró “Debes indicar el nivel de urgencia”. Resultado observado: se presentó la validación requerida.</w:t>
+      </w:r>
+      <w:r>
+        <w:rPr>
+          <w:rtl w:val="0"/>
+        </w:rPr>
       </w:r>
     </w:p>
     <w:p>
@@ -13312,12 +13345,12 @@
           <wp:inline distB="0" distT="0" distL="114300" distR="114300">
             <wp:extent cx="4403549" cy="4846320"/>
             <wp:effectExtent b="0" l="0" r="0" t="0"/>
-            <wp:docPr descr="HU09 Validación del nivel de urgencia captura original 182323" id="96" name="image37.png"/>
+            <wp:docPr descr="HU09 Validación del nivel de urgencia captura original 182323" id="142" name="image44.png"/>
             <a:graphic>
               <a:graphicData uri="http://schemas.openxmlformats.org/drawingml/2006/picture">
                 <pic:pic>
                   <pic:nvPicPr>
-                    <pic:cNvPr descr="HU09 Validación del nivel de urgencia captura original 182323" id="0" name="image37.png"/>
+                    <pic:cNvPr descr="HU09 Validación del nivel de urgencia captura original 182323" id="0" name="image44.png"/>
                     <pic:cNvPicPr preferRelativeResize="0"/>
                   </pic:nvPicPr>
                   <pic:blipFill>
@@ -13349,29 +13382,6 @@
     </w:p>
     <w:p>
       <w:pPr>
-        <w:spacing w:after="120" w:line="288" w:lineRule="auto"/>
-        <w:rPr/>
-      </w:pPr>
-      <w:r>
-        <w:rPr>
-          <w:rFonts w:ascii="Calibri" w:cs="Calibri" w:eastAsia="Calibri" w:hAnsi="Calibri"/>
-          <w:sz w:val="22"/>
-          <w:szCs w:val="22"/>
-          <w:rtl w:val="0"/>
-        </w:rPr>
-        <w:t xml:space="preserve">Captura original image(20261018-182323).png</w:t>
-      </w:r>
-      <w:r>
-        <w:rPr>
-          <w:rFonts w:ascii="Calibri" w:cs="Calibri" w:eastAsia="Calibri" w:hAnsi="Calibri"/>
-          <w:sz w:val="22"/>
-          <w:szCs w:val="22"/>
-          <w:rtl w:val="0"/>
-        </w:rPr>
-      </w:r>
-    </w:p>
-    <w:p>
-      <w:pPr>
         <w:rPr/>
       </w:pPr>
       <w:r>
@@ -13402,6 +13412,11 @@
         </w:rPr>
         <w:t xml:space="preserve">HU09 Publicación exitosa de una solicitud</w:t>
       </w:r>
+      <w:r>
+        <w:rPr>
+          <w:rtl w:val="0"/>
+        </w:rPr>
+      </w:r>
     </w:p>
     <w:p>
       <w:pPr>
@@ -13416,6 +13431,11 @@
           <w:rtl w:val="0"/>
         </w:rPr>
         <w:t xml:space="preserve">Se seleccionó urgencia alta y se publicó la solicitud. La primera captura muestra “Solicitud publicada correctamente.” y el formulario reiniciado; la segunda muestra Gato · a en Activas, con urgencia alta y estado Activa. La solicitud resuelta que ya figuraba en esa lista corresponde a un registro anterior.</w:t>
+      </w:r>
+      <w:r>
+        <w:rPr>
+          <w:rtl w:val="0"/>
+        </w:rPr>
       </w:r>
     </w:p>
     <w:p>
@@ -13429,12 +13449,12 @@
           <wp:inline distB="0" distT="0" distL="114300" distR="114300">
             <wp:extent cx="3413316" cy="3200400"/>
             <wp:effectExtent b="0" l="0" r="0" t="0"/>
-            <wp:docPr descr="HU09 Publicación exitosa de una solicitud captura original 182422" id="53" name="image4.png"/>
+            <wp:docPr descr="HU09 Publicación exitosa de una solicitud captura original 182422" id="99" name="image3.png"/>
             <a:graphic>
               <a:graphicData uri="http://schemas.openxmlformats.org/drawingml/2006/picture">
                 <pic:pic>
                   <pic:nvPicPr>
-                    <pic:cNvPr descr="HU09 Publicación exitosa de una solicitud captura original 182422" id="0" name="image4.png"/>
+                    <pic:cNvPr descr="HU09 Publicación exitosa de una solicitud captura original 182422" id="0" name="image3.png"/>
                     <pic:cNvPicPr preferRelativeResize="0"/>
                   </pic:nvPicPr>
                   <pic:blipFill>
@@ -13466,29 +13486,6 @@
     </w:p>
     <w:p>
       <w:pPr>
-        <w:spacing w:after="120" w:line="288" w:lineRule="auto"/>
-        <w:rPr/>
-      </w:pPr>
-      <w:r>
-        <w:rPr>
-          <w:rFonts w:ascii="Calibri" w:cs="Calibri" w:eastAsia="Calibri" w:hAnsi="Calibri"/>
-          <w:sz w:val="22"/>
-          <w:szCs w:val="22"/>
-          <w:rtl w:val="0"/>
-        </w:rPr>
-        <w:t xml:space="preserve">Captura original image(20261018-182422).png</w:t>
-      </w:r>
-      <w:r>
-        <w:rPr>
-          <w:rFonts w:ascii="Calibri" w:cs="Calibri" w:eastAsia="Calibri" w:hAnsi="Calibri"/>
-          <w:sz w:val="22"/>
-          <w:szCs w:val="22"/>
-          <w:rtl w:val="0"/>
-        </w:rPr>
-      </w:r>
-    </w:p>
-    <w:p>
-      <w:pPr>
         <w:jc w:val="center"/>
         <w:rPr/>
       </w:pPr>
@@ -13498,12 +13495,12 @@
           <wp:inline distB="0" distT="0" distL="114300" distR="114300">
             <wp:extent cx="3672900" cy="3200400"/>
             <wp:effectExtent b="0" l="0" r="0" t="0"/>
-            <wp:docPr descr="HU09 Publicación exitosa de una solicitud captura original 182430" id="54" name="image18.png"/>
+            <wp:docPr descr="HU09 Publicación exitosa de una solicitud captura original 182430" id="100" name="image8.png"/>
             <a:graphic>
               <a:graphicData uri="http://schemas.openxmlformats.org/drawingml/2006/picture">
                 <pic:pic>
                   <pic:nvPicPr>
-                    <pic:cNvPr descr="HU09 Publicación exitosa de una solicitud captura original 182430" id="0" name="image18.png"/>
+                    <pic:cNvPr descr="HU09 Publicación exitosa de una solicitud captura original 182430" id="0" name="image8.png"/>
                     <pic:cNvPicPr preferRelativeResize="0"/>
                   </pic:nvPicPr>
                   <pic:blipFill>
@@ -13535,29 +13532,6 @@
     </w:p>
     <w:p>
       <w:pPr>
-        <w:spacing w:after="120" w:line="288" w:lineRule="auto"/>
-        <w:rPr/>
-      </w:pPr>
-      <w:r>
-        <w:rPr>
-          <w:rFonts w:ascii="Calibri" w:cs="Calibri" w:eastAsia="Calibri" w:hAnsi="Calibri"/>
-          <w:sz w:val="22"/>
-          <w:szCs w:val="22"/>
-          <w:rtl w:val="0"/>
-        </w:rPr>
-        <w:t xml:space="preserve">Captura original image(20261018-182430).png</w:t>
-      </w:r>
-      <w:r>
-        <w:rPr>
-          <w:rFonts w:ascii="Calibri" w:cs="Calibri" w:eastAsia="Calibri" w:hAnsi="Calibri"/>
-          <w:sz w:val="22"/>
-          <w:szCs w:val="22"/>
-          <w:rtl w:val="0"/>
-        </w:rPr>
-      </w:r>
-    </w:p>
-    <w:p>
-      <w:pPr>
         <w:rPr/>
       </w:pPr>
       <w:r>
@@ -13588,6 +13562,11 @@
         </w:rPr>
         <w:t xml:space="preserve">HU09 Cierre de la solicitud</w:t>
       </w:r>
+      <w:r>
+        <w:rPr>
+          <w:rtl w:val="0"/>
+        </w:rPr>
+      </w:r>
     </w:p>
     <w:p>
       <w:pPr>
@@ -13602,6 +13581,11 @@
           <w:rtl w:val="0"/>
         </w:rPr>
         <w:t xml:space="preserve">Tras marcar la solicitud como resuelta, la lista muestra “No tienes solicitudes activas.” y dos registros en Resueltas. Resultado observado: la solicitud dejó de figurar en Activas. Esta captura documenta el estado final; por sí sola no demuestra la recarga ni la visibilidad desde otra cuenta.</w:t>
+      </w:r>
+      <w:r>
+        <w:rPr>
+          <w:rtl w:val="0"/>
+        </w:rPr>
       </w:r>
     </w:p>
     <w:p>
@@ -13615,12 +13599,12 @@
           <wp:inline distB="0" distT="0" distL="114300" distR="114300">
             <wp:extent cx="5460045" cy="4846320"/>
             <wp:effectExtent b="0" l="0" r="0" t="0"/>
-            <wp:docPr descr="HU09 Cierre de la solicitud captura original 182620" id="56" name="image2.png"/>
+            <wp:docPr descr="HU09 Cierre de la solicitud captura original 182620" id="102" name="image1.png"/>
             <a:graphic>
               <a:graphicData uri="http://schemas.openxmlformats.org/drawingml/2006/picture">
                 <pic:pic>
                   <pic:nvPicPr>
-                    <pic:cNvPr descr="HU09 Cierre de la solicitud captura original 182620" id="0" name="image2.png"/>
+                    <pic:cNvPr descr="HU09 Cierre de la solicitud captura original 182620" id="0" name="image1.png"/>
                     <pic:cNvPicPr preferRelativeResize="0"/>
                   </pic:nvPicPr>
                   <pic:blipFill>
@@ -13652,29 +13636,6 @@
     </w:p>
     <w:p>
       <w:pPr>
-        <w:spacing w:after="120" w:line="288" w:lineRule="auto"/>
-        <w:rPr/>
-      </w:pPr>
-      <w:r>
-        <w:rPr>
-          <w:rFonts w:ascii="Calibri" w:cs="Calibri" w:eastAsia="Calibri" w:hAnsi="Calibri"/>
-          <w:sz w:val="22"/>
-          <w:szCs w:val="22"/>
-          <w:rtl w:val="0"/>
-        </w:rPr>
-        <w:t xml:space="preserve">Captura original image(20261018-182620).png</w:t>
-      </w:r>
-      <w:r>
-        <w:rPr>
-          <w:rFonts w:ascii="Calibri" w:cs="Calibri" w:eastAsia="Calibri" w:hAnsi="Calibri"/>
-          <w:sz w:val="22"/>
-          <w:szCs w:val="22"/>
-          <w:rtl w:val="0"/>
-        </w:rPr>
-      </w:r>
-    </w:p>
-    <w:p>
-      <w:pPr>
         <w:rPr/>
       </w:pPr>
       <w:r>
@@ -13705,6 +13666,11 @@
         </w:rPr>
         <w:t xml:space="preserve">HU10 Validación de los campos obligatorios</w:t>
       </w:r>
+      <w:r>
+        <w:rPr>
+          <w:rtl w:val="0"/>
+        </w:rPr>
+      </w:r>
     </w:p>
     <w:p>
       <w:pPr>
@@ -13719,6 +13685,11 @@
           <w:rtl w:val="0"/>
         </w:rPr>
         <w:t xml:space="preserve">Se presionó Buscar donantes sin seleccionar especie ni ingresar grupo sanguíneo. La interfaz mostró “Selecciona la especie e ingresa un grupo sanguíneo válido.” Resultado observado: se presentó el mensaje de validación.</w:t>
+      </w:r>
+      <w:r>
+        <w:rPr>
+          <w:rtl w:val="0"/>
+        </w:rPr>
       </w:r>
     </w:p>
     <w:p>
@@ -13732,12 +13703,12 @@
           <wp:inline distB="0" distT="0" distL="114300" distR="114300">
             <wp:extent cx="4530977" cy="4846320"/>
             <wp:effectExtent b="0" l="0" r="0" t="0"/>
-            <wp:docPr descr="HU10 Validación de los campos obligatorios captura original 182730" id="58" name="image17.png"/>
+            <wp:docPr descr="HU10 Validación de los campos obligatorios captura original 182730" id="104" name="image6.png"/>
             <a:graphic>
               <a:graphicData uri="http://schemas.openxmlformats.org/drawingml/2006/picture">
                 <pic:pic>
                   <pic:nvPicPr>
-                    <pic:cNvPr descr="HU10 Validación de los campos obligatorios captura original 182730" id="0" name="image17.png"/>
+                    <pic:cNvPr descr="HU10 Validación de los campos obligatorios captura original 182730" id="0" name="image6.png"/>
                     <pic:cNvPicPr preferRelativeResize="0"/>
                   </pic:nvPicPr>
                   <pic:blipFill>
@@ -13769,21 +13740,6 @@
     </w:p>
     <w:p>
       <w:pPr>
-        <w:spacing w:after="120" w:line="288" w:lineRule="auto"/>
-        <w:rPr/>
-      </w:pPr>
-      <w:r>
-        <w:rPr>
-          <w:rFonts w:ascii="Calibri" w:cs="Calibri" w:eastAsia="Calibri" w:hAnsi="Calibri"/>
-          <w:sz w:val="22"/>
-          <w:szCs w:val="22"/>
-          <w:rtl w:val="0"/>
-        </w:rPr>
-        <w:t>Captura original image(20261018-182730).png</w:t>
-      </w:r>
-    </w:p>
-    <w:p>
-      <w:pPr>
         <w:rPr/>
       </w:pPr>
       <w:r>
@@ -13814,6 +13770,11 @@
         </w:rPr>
         <w:t xml:space="preserve">HU10 Búsqueda con resultados</w:t>
       </w:r>
+      <w:r>
+        <w:rPr>
+          <w:rtl w:val="0"/>
+        </w:rPr>
+      </w:r>
     </w:p>
     <w:p>
       <w:pPr>
@@ -13828,6 +13789,11 @@
           <w:rtl w:val="0"/>
         </w:rPr>
         <w:t xml:space="preserve">Se buscó la especie Gato y el grupo sanguíneo a, sin preferencia de comuna. Se obtuvo un resultado: kuro, especie Gato, grupo a, con raza y comuna sin especificar. Resultado observado: se mostró el donante coincidente. La compatibilidad médica debe ser confirmada por un veterinario.</w:t>
+      </w:r>
+      <w:r>
+        <w:rPr>
+          <w:rtl w:val="0"/>
+        </w:rPr>
       </w:r>
     </w:p>
     <w:p>
@@ -13841,7 +13807,7 @@
           <wp:inline distB="0" distT="0" distL="114300" distR="114300">
             <wp:extent cx="3196508" cy="4846320"/>
             <wp:effectExtent b="0" l="0" r="0" t="0"/>
-            <wp:docPr descr="HU10 Búsqueda con resultados captura original 182816" id="60" name="image5.png"/>
+            <wp:docPr descr="HU10 Búsqueda con resultados captura original 182816" id="106" name="image5.png"/>
             <a:graphic>
               <a:graphicData uri="http://schemas.openxmlformats.org/drawingml/2006/picture">
                 <pic:pic>
@@ -13878,29 +13844,6 @@
     </w:p>
     <w:p>
       <w:pPr>
-        <w:spacing w:after="120" w:line="288" w:lineRule="auto"/>
-        <w:rPr/>
-      </w:pPr>
-      <w:r>
-        <w:rPr>
-          <w:rFonts w:ascii="Calibri" w:cs="Calibri" w:eastAsia="Calibri" w:hAnsi="Calibri"/>
-          <w:sz w:val="22"/>
-          <w:szCs w:val="22"/>
-          <w:rtl w:val="0"/>
-        </w:rPr>
-        <w:t xml:space="preserve">Captura original image(20261018-182816).png</w:t>
-      </w:r>
-      <w:r>
-        <w:rPr>
-          <w:rFonts w:ascii="Calibri" w:cs="Calibri" w:eastAsia="Calibri" w:hAnsi="Calibri"/>
-          <w:sz w:val="22"/>
-          <w:szCs w:val="22"/>
-          <w:rtl w:val="0"/>
-        </w:rPr>
-      </w:r>
-    </w:p>
-    <w:p>
-      <w:pPr>
         <w:rPr/>
       </w:pPr>
       <w:r>
@@ -13931,6 +13874,11 @@
         </w:rPr>
         <w:t xml:space="preserve">HU10 Búsqueda sin resultados</w:t>
       </w:r>
+      <w:r>
+        <w:rPr>
+          <w:rtl w:val="0"/>
+        </w:rPr>
+      </w:r>
     </w:p>
     <w:p>
       <w:pPr>
@@ -13945,6 +13893,11 @@
           <w:rtl w:val="0"/>
         </w:rPr>
         <w:t xml:space="preserve">Se buscó la especie Gato y el grupo sanguíneo ab, sin preferencia de comuna. La interfaz mostró “No se encontraron donantes compatibles en este momento”. Resultado observado: se informó la ausencia de coincidencias y no se mantuvo la tarjeta del resultado anterior.</w:t>
+      </w:r>
+      <w:r>
+        <w:rPr>
+          <w:rtl w:val="0"/>
+        </w:rPr>
       </w:r>
     </w:p>
     <w:p>
@@ -13958,12 +13911,12 @@
           <wp:inline distB="0" distT="0" distL="114300" distR="114300">
             <wp:extent cx="3432809" cy="4846320"/>
             <wp:effectExtent b="0" l="0" r="0" t="0"/>
-            <wp:docPr descr="HU10 Búsqueda sin resultados captura original 182934" id="62" name="image15.png"/>
+            <wp:docPr descr="HU10 Búsqueda sin resultados captura original 182934" id="108" name="image2.png"/>
             <a:graphic>
               <a:graphicData uri="http://schemas.openxmlformats.org/drawingml/2006/picture">
                 <pic:pic>
                   <pic:nvPicPr>
-                    <pic:cNvPr descr="HU10 Búsqueda sin resultados captura original 182934" id="0" name="image15.png"/>
+                    <pic:cNvPr descr="HU10 Búsqueda sin resultados captura original 182934" id="0" name="image2.png"/>
                     <pic:cNvPicPr preferRelativeResize="0"/>
                   </pic:nvPicPr>
                   <pic:blipFill>
@@ -13989,29 +13942,6 @@
       </w:r>
       <w:r>
         <w:rPr>
-          <w:rtl w:val="0"/>
-        </w:rPr>
-      </w:r>
-    </w:p>
-    <w:p>
-      <w:pPr>
-        <w:spacing w:after="120" w:line="288" w:lineRule="auto"/>
-        <w:rPr/>
-      </w:pPr>
-      <w:r>
-        <w:rPr>
-          <w:rFonts w:ascii="Calibri" w:cs="Calibri" w:eastAsia="Calibri" w:hAnsi="Calibri"/>
-          <w:sz w:val="22"/>
-          <w:szCs w:val="22"/>
-          <w:rtl w:val="0"/>
-        </w:rPr>
-        <w:t xml:space="preserve">Captura original image(20261018-182934).png</w:t>
-      </w:r>
-      <w:r>
-        <w:rPr>
-          <w:rFonts w:ascii="Calibri" w:cs="Calibri" w:eastAsia="Calibri" w:hAnsi="Calibri"/>
-          <w:sz w:val="22"/>
-          <w:szCs w:val="22"/>
           <w:rtl w:val="0"/>
         </w:rPr>
       </w:r>
@@ -14465,6 +14395,20 @@
   <w:style w:type="paragraph" w:styleId="Normal" w:default="1">
     <w:name w:val="normal"/>
   </w:style>
+  <w:style w:type="table" w:styleId="TableNormal" w:default="1">
+    <w:name w:val="TableNormal"/>
+    <w:tblPr>
+      <w:tblCellMar>
+        <w:top w:w="100.0" w:type="dxa"/>
+        <w:left w:w="100.0" w:type="dxa"/>
+        <w:bottom w:w="100.0" w:type="dxa"/>
+        <w:right w:w="100.0" w:type="dxa"/>
+      </w:tblCellMar>
+    </w:tblPr>
+  </w:style>
+  <w:style w:type="paragraph" w:styleId="Normal" w:default="1">
+    <w:name w:val="normal"/>
+  </w:style>
   <w:style w:type="paragraph" w:styleId="Strong">
     <w:name w:val="Strong"/>
     <w:basedOn w:val="Normal"/>
@@ -14563,6 +14507,58 @@
       <w:sz w:val="20"/>
       <w:szCs w:val="20"/>
     </w:rPr>
+  </w:style>
+  <w:style w:type="table" w:styleId="Table1">
+    <w:basedOn w:val="TableNormal"/>
+    <w:tblPr>
+      <w:tblStyleRowBandSize w:val="1"/>
+      <w:tblStyleColBandSize w:val="1"/>
+      <w:tblCellMar>
+        <w:top w:w="0.0" w:type="dxa"/>
+        <w:left w:w="115.0" w:type="dxa"/>
+        <w:bottom w:w="0.0" w:type="dxa"/>
+        <w:right w:w="115.0" w:type="dxa"/>
+      </w:tblCellMar>
+    </w:tblPr>
+  </w:style>
+  <w:style w:type="table" w:styleId="Table2">
+    <w:basedOn w:val="TableNormal"/>
+    <w:tblPr>
+      <w:tblStyleRowBandSize w:val="1"/>
+      <w:tblStyleColBandSize w:val="1"/>
+      <w:tblCellMar>
+        <w:top w:w="0.0" w:type="dxa"/>
+        <w:left w:w="115.0" w:type="dxa"/>
+        <w:bottom w:w="0.0" w:type="dxa"/>
+        <w:right w:w="115.0" w:type="dxa"/>
+      </w:tblCellMar>
+    </w:tblPr>
+  </w:style>
+  <w:style w:type="table" w:styleId="Table3">
+    <w:basedOn w:val="TableNormal"/>
+    <w:tblPr>
+      <w:tblStyleRowBandSize w:val="1"/>
+      <w:tblStyleColBandSize w:val="1"/>
+      <w:tblCellMar>
+        <w:top w:w="0.0" w:type="dxa"/>
+        <w:left w:w="115.0" w:type="dxa"/>
+        <w:bottom w:w="0.0" w:type="dxa"/>
+        <w:right w:w="115.0" w:type="dxa"/>
+      </w:tblCellMar>
+    </w:tblPr>
+  </w:style>
+  <w:style w:type="table" w:styleId="Table4">
+    <w:basedOn w:val="TableNormal"/>
+    <w:tblPr>
+      <w:tblStyleRowBandSize w:val="1"/>
+      <w:tblStyleColBandSize w:val="1"/>
+      <w:tblCellMar>
+        <w:top w:w="0.0" w:type="dxa"/>
+        <w:left w:w="115.0" w:type="dxa"/>
+        <w:bottom w:w="0.0" w:type="dxa"/>
+        <w:right w:w="115.0" w:type="dxa"/>
+      </w:tblCellMar>
+    </w:tblPr>
   </w:style>
   <w:style w:type="table" w:styleId="Table1">
     <w:basedOn w:val="TableNormal"/>

</xml_diff>

<commit_message>
Unifica evidencias con formato Calibri y títulos de historias
Aplica azul #2F5D8C, códigos S3-HU09 y S3-HU10 con dos puntos y descripciones en cursiva bajo las capturas.
</commit_message>
<xml_diff>
--- a/Fase 2/Evidencias Proyecto/Evidencias de documentación/Pethub_Evidencia_de_Pruebas.docx
+++ b/Fase 2/Evidencias Proyecto/Evidencias de documentación/Pethub_Evidencia_de_Pruebas.docx
@@ -19,6 +19,7 @@
       </w:r>
       <w:r>
         <w:rPr>
+          <w:rFonts w:ascii="Calibri" w:hAnsi="Calibri"/>
           <w:rtl w:val="0"/>
         </w:rPr>
       </w:r>
@@ -42,6 +43,7 @@
       </w:r>
       <w:r>
         <w:rPr>
+          <w:rFonts w:ascii="Calibri" w:hAnsi="Calibri"/>
           <w:rtl w:val="0"/>
         </w:rPr>
       </w:r>
@@ -62,6 +64,7 @@
       </w:r>
       <w:r>
         <w:rPr>
+          <w:rFonts w:ascii="Calibri" w:hAnsi="Calibri"/>
           <w:rtl w:val="0"/>
         </w:rPr>
       </w:r>
@@ -76,9 +79,10 @@
       <w:r>
         <w:rPr>
           <w:rFonts w:ascii="Calibri" w:cs="Calibri" w:eastAsia="Calibri" w:hAnsi="Calibri"/>
-          <w:b w:val="1"/>
+          <w:b/>
           <w:bCs w:val="1"/>
-          <w:color w:val="1e3a5f"/>
+          <w:i w:val="0"/>
+          <w:color w:val="1E3A5F"/>
           <w:sz w:val="27"/>
           <w:szCs w:val="27"/>
           <w:rtl w:val="0"/>
@@ -87,6 +91,11 @@
       </w:r>
       <w:r>
         <w:rPr>
+          <w:rFonts w:ascii="Calibri" w:hAnsi="Calibri"/>
+          <w:b/>
+          <w:i w:val="0"/>
+          <w:color w:val="1E3A5F"/>
+          <w:sz w:val="27"/>
           <w:rtl w:val="0"/>
         </w:rPr>
       </w:r>
@@ -3828,9 +3837,10 @@
       <w:r>
         <w:rPr>
           <w:rFonts w:ascii="Calibri" w:cs="Calibri" w:eastAsia="Calibri" w:hAnsi="Calibri"/>
-          <w:b w:val="1"/>
+          <w:b/>
           <w:bCs w:val="1"/>
-          <w:color w:val="1e3a5f"/>
+          <w:i w:val="0"/>
+          <w:color w:val="1E3A5F"/>
           <w:sz w:val="32"/>
           <w:szCs w:val="32"/>
           <w:rtl w:val="0"/>
@@ -3839,6 +3849,11 @@
       </w:r>
       <w:r>
         <w:rPr>
+          <w:rFonts w:ascii="Calibri" w:hAnsi="Calibri"/>
+          <w:b/>
+          <w:i w:val="0"/>
+          <w:color w:val="1E3A5F"/>
+          <w:sz w:val="32"/>
           <w:rtl w:val="0"/>
         </w:rPr>
       </w:r>
@@ -3859,6 +3874,7 @@
       </w:r>
       <w:r>
         <w:rPr>
+          <w:rFonts w:ascii="Calibri" w:hAnsi="Calibri"/>
           <w:rtl w:val="0"/>
         </w:rPr>
       </w:r>
@@ -3873,9 +3889,10 @@
       <w:r>
         <w:rPr>
           <w:rFonts w:ascii="Calibri" w:cs="Calibri" w:eastAsia="Calibri" w:hAnsi="Calibri"/>
-          <w:b w:val="1"/>
+          <w:b/>
           <w:bCs w:val="1"/>
-          <w:color w:val="1e3a5f"/>
+          <w:i w:val="0"/>
+          <w:color w:val="1E3A5F"/>
           <w:sz w:val="27"/>
           <w:szCs w:val="27"/>
           <w:rtl w:val="0"/>
@@ -3884,6 +3901,11 @@
       </w:r>
       <w:r>
         <w:rPr>
+          <w:rFonts w:ascii="Calibri" w:hAnsi="Calibri"/>
+          <w:b/>
+          <w:i w:val="0"/>
+          <w:color w:val="1E3A5F"/>
+          <w:sz w:val="27"/>
           <w:rtl w:val="0"/>
         </w:rPr>
       </w:r>
@@ -3904,6 +3926,7 @@
       </w:r>
       <w:r>
         <w:rPr>
+          <w:rFonts w:ascii="Calibri" w:hAnsi="Calibri"/>
           <w:rtl w:val="0"/>
         </w:rPr>
       </w:r>
@@ -3915,17 +3938,19 @@
         <w:rPr/>
       </w:pPr>
       <w:r>
-        <w:rPr/>
+        <w:rPr>
+          <w:rFonts w:ascii="Calibri" w:hAnsi="Calibri"/>
+        </w:rPr>
         <w:drawing>
           <wp:inline distB="0" distT="0" distL="0" distR="0">
             <wp:extent cx="4762500" cy="3114675"/>
             <wp:effectExtent b="0" l="0" r="0" t="0"/>
-            <wp:docPr descr="Pantallazo de la ejecución de pruebas" id="115" name="image17.png"/>
+            <wp:docPr descr="Pantallazo de la ejecución de pruebas" id="161" name="image16.png"/>
             <a:graphic>
               <a:graphicData uri="http://schemas.openxmlformats.org/drawingml/2006/picture">
                 <pic:pic>
                   <pic:nvPicPr>
-                    <pic:cNvPr descr="Pantallazo de la ejecución de pruebas" id="0" name="image17.png"/>
+                    <pic:cNvPr descr="Pantallazo de la ejecución de pruebas" id="0" name="image16.png"/>
                     <pic:cNvPicPr preferRelativeResize="0"/>
                   </pic:nvPicPr>
                   <pic:blipFill>
@@ -3951,6 +3976,7 @@
       </w:r>
       <w:r>
         <w:rPr>
+          <w:rFonts w:ascii="Calibri" w:hAnsi="Calibri"/>
           <w:rtl w:val="0"/>
         </w:rPr>
       </w:r>
@@ -3973,6 +3999,7 @@
       </w:r>
       <w:r>
         <w:rPr>
+          <w:rFonts w:ascii="Calibri" w:hAnsi="Calibri"/>
           <w:rtl w:val="0"/>
         </w:rPr>
       </w:r>
@@ -3987,9 +4014,10 @@
       <w:r>
         <w:rPr>
           <w:rFonts w:ascii="Calibri" w:cs="Calibri" w:eastAsia="Calibri" w:hAnsi="Calibri"/>
-          <w:b w:val="1"/>
+          <w:b/>
           <w:bCs w:val="1"/>
-          <w:color w:val="1e3a5f"/>
+          <w:i w:val="0"/>
+          <w:color w:val="1E3A5F"/>
           <w:sz w:val="27"/>
           <w:szCs w:val="27"/>
           <w:rtl w:val="0"/>
@@ -3998,6 +4026,11 @@
       </w:r>
       <w:r>
         <w:rPr>
+          <w:rFonts w:ascii="Calibri" w:hAnsi="Calibri"/>
+          <w:b/>
+          <w:i w:val="0"/>
+          <w:color w:val="1E3A5F"/>
+          <w:sz w:val="27"/>
           <w:rtl w:val="0"/>
         </w:rPr>
       </w:r>
@@ -4012,9 +4045,10 @@
       <w:r>
         <w:rPr>
           <w:rFonts w:ascii="Calibri" w:cs="Calibri" w:eastAsia="Calibri" w:hAnsi="Calibri"/>
-          <w:b w:val="1"/>
+          <w:b/>
           <w:bCs w:val="1"/>
-          <w:color w:val="2f5d8c"/>
+          <w:i w:val="0"/>
+          <w:color w:val="2F5D8C"/>
           <w:sz w:val="24"/>
           <w:szCs w:val="24"/>
           <w:rtl w:val="0"/>
@@ -4023,6 +4057,11 @@
       </w:r>
       <w:r>
         <w:rPr>
+          <w:rFonts w:ascii="Calibri" w:hAnsi="Calibri"/>
+          <w:b/>
+          <w:i w:val="0"/>
+          <w:color w:val="2F5D8C"/>
+          <w:sz w:val="24"/>
           <w:rtl w:val="0"/>
         </w:rPr>
       </w:r>
@@ -4034,17 +4073,19 @@
         <w:rPr/>
       </w:pPr>
       <w:r>
-        <w:rPr/>
+        <w:rPr>
+          <w:rFonts w:ascii="Calibri" w:hAnsi="Calibri"/>
+        </w:rPr>
         <w:drawing>
           <wp:inline distB="0" distT="0" distL="0" distR="0">
             <wp:extent cx="4953000" cy="2105025"/>
             <wp:effectExtent b="0" l="0" r="0" t="0"/>
-            <wp:docPr descr="Pantallazo de la ejecución de pruebas" id="117" name="image13.png"/>
+            <wp:docPr descr="Pantallazo de la ejecución de pruebas" id="163" name="image5.png"/>
             <a:graphic>
               <a:graphicData uri="http://schemas.openxmlformats.org/drawingml/2006/picture">
                 <pic:pic>
                   <pic:nvPicPr>
-                    <pic:cNvPr descr="Pantallazo de la ejecución de pruebas" id="0" name="image13.png"/>
+                    <pic:cNvPr descr="Pantallazo de la ejecución de pruebas" id="0" name="image5.png"/>
                     <pic:cNvPicPr preferRelativeResize="0"/>
                   </pic:nvPicPr>
                   <pic:blipFill>
@@ -4070,6 +4111,7 @@
       </w:r>
       <w:r>
         <w:rPr>
+          <w:rFonts w:ascii="Calibri" w:hAnsi="Calibri"/>
           <w:rtl w:val="0"/>
         </w:rPr>
       </w:r>
@@ -4092,6 +4134,7 @@
       </w:r>
       <w:r>
         <w:rPr>
+          <w:rFonts w:ascii="Calibri" w:hAnsi="Calibri"/>
           <w:rtl w:val="0"/>
         </w:rPr>
       </w:r>
@@ -4106,9 +4149,10 @@
       <w:r>
         <w:rPr>
           <w:rFonts w:ascii="Calibri" w:cs="Calibri" w:eastAsia="Calibri" w:hAnsi="Calibri"/>
-          <w:b w:val="1"/>
+          <w:b/>
           <w:bCs w:val="1"/>
-          <w:color w:val="2f5d8c"/>
+          <w:i w:val="0"/>
+          <w:color w:val="2F5D8C"/>
           <w:sz w:val="24"/>
           <w:szCs w:val="24"/>
           <w:rtl w:val="0"/>
@@ -4117,6 +4161,11 @@
       </w:r>
       <w:r>
         <w:rPr>
+          <w:rFonts w:ascii="Calibri" w:hAnsi="Calibri"/>
+          <w:b/>
+          <w:i w:val="0"/>
+          <w:color w:val="2F5D8C"/>
+          <w:sz w:val="24"/>
           <w:rtl w:val="0"/>
         </w:rPr>
       </w:r>
@@ -4128,17 +4177,19 @@
         <w:rPr/>
       </w:pPr>
       <w:r>
-        <w:rPr/>
+        <w:rPr>
+          <w:rFonts w:ascii="Calibri" w:hAnsi="Calibri"/>
+        </w:rPr>
         <w:drawing>
           <wp:inline distB="0" distT="0" distL="0" distR="0">
             <wp:extent cx="4953000" cy="1790700"/>
             <wp:effectExtent b="0" l="0" r="0" t="0"/>
-            <wp:docPr descr="Pantallazo de la ejecución de pruebas" id="116" name="image16.png"/>
+            <wp:docPr descr="Pantallazo de la ejecución de pruebas" id="162" name="image21.png"/>
             <a:graphic>
               <a:graphicData uri="http://schemas.openxmlformats.org/drawingml/2006/picture">
                 <pic:pic>
                   <pic:nvPicPr>
-                    <pic:cNvPr descr="Pantallazo de la ejecución de pruebas" id="0" name="image16.png"/>
+                    <pic:cNvPr descr="Pantallazo de la ejecución de pruebas" id="0" name="image21.png"/>
                     <pic:cNvPicPr preferRelativeResize="0"/>
                   </pic:nvPicPr>
                   <pic:blipFill>
@@ -4164,6 +4215,7 @@
       </w:r>
       <w:r>
         <w:rPr>
+          <w:rFonts w:ascii="Calibri" w:hAnsi="Calibri"/>
           <w:rtl w:val="0"/>
         </w:rPr>
       </w:r>
@@ -4186,6 +4238,7 @@
       </w:r>
       <w:r>
         <w:rPr>
+          <w:rFonts w:ascii="Calibri" w:hAnsi="Calibri"/>
           <w:rtl w:val="0"/>
         </w:rPr>
       </w:r>
@@ -4200,9 +4253,10 @@
       <w:r>
         <w:rPr>
           <w:rFonts w:ascii="Calibri" w:cs="Calibri" w:eastAsia="Calibri" w:hAnsi="Calibri"/>
-          <w:b w:val="1"/>
+          <w:b/>
           <w:bCs w:val="1"/>
-          <w:color w:val="2f5d8c"/>
+          <w:i w:val="0"/>
+          <w:color w:val="2F5D8C"/>
           <w:sz w:val="24"/>
           <w:szCs w:val="24"/>
           <w:rtl w:val="0"/>
@@ -4211,6 +4265,11 @@
       </w:r>
       <w:r>
         <w:rPr>
+          <w:rFonts w:ascii="Calibri" w:hAnsi="Calibri"/>
+          <w:b/>
+          <w:i w:val="0"/>
+          <w:color w:val="2F5D8C"/>
+          <w:sz w:val="24"/>
           <w:rtl w:val="0"/>
         </w:rPr>
       </w:r>
@@ -4222,17 +4281,19 @@
         <w:rPr/>
       </w:pPr>
       <w:r>
-        <w:rPr/>
+        <w:rPr>
+          <w:rFonts w:ascii="Calibri" w:hAnsi="Calibri"/>
+        </w:rPr>
         <w:drawing>
           <wp:inline distB="0" distT="0" distL="0" distR="0">
             <wp:extent cx="4953000" cy="1781175"/>
             <wp:effectExtent b="0" l="0" r="0" t="0"/>
-            <wp:docPr descr="Pantallazo de la ejecución de pruebas" id="119" name="image24.png"/>
+            <wp:docPr descr="Pantallazo de la ejecución de pruebas" id="165" name="image20.png"/>
             <a:graphic>
               <a:graphicData uri="http://schemas.openxmlformats.org/drawingml/2006/picture">
                 <pic:pic>
                   <pic:nvPicPr>
-                    <pic:cNvPr descr="Pantallazo de la ejecución de pruebas" id="0" name="image24.png"/>
+                    <pic:cNvPr descr="Pantallazo de la ejecución de pruebas" id="0" name="image20.png"/>
                     <pic:cNvPicPr preferRelativeResize="0"/>
                   </pic:nvPicPr>
                   <pic:blipFill>
@@ -4258,6 +4319,7 @@
       </w:r>
       <w:r>
         <w:rPr>
+          <w:rFonts w:ascii="Calibri" w:hAnsi="Calibri"/>
           <w:rtl w:val="0"/>
         </w:rPr>
       </w:r>
@@ -4280,6 +4342,7 @@
       </w:r>
       <w:r>
         <w:rPr>
+          <w:rFonts w:ascii="Calibri" w:hAnsi="Calibri"/>
           <w:rtl w:val="0"/>
         </w:rPr>
       </w:r>
@@ -4294,9 +4357,10 @@
       <w:r>
         <w:rPr>
           <w:rFonts w:ascii="Calibri" w:cs="Calibri" w:eastAsia="Calibri" w:hAnsi="Calibri"/>
-          <w:b w:val="1"/>
+          <w:b/>
           <w:bCs w:val="1"/>
-          <w:color w:val="2f5d8c"/>
+          <w:i w:val="0"/>
+          <w:color w:val="2F5D8C"/>
           <w:sz w:val="24"/>
           <w:szCs w:val="24"/>
           <w:rtl w:val="0"/>
@@ -4305,6 +4369,11 @@
       </w:r>
       <w:r>
         <w:rPr>
+          <w:rFonts w:ascii="Calibri" w:hAnsi="Calibri"/>
+          <w:b/>
+          <w:i w:val="0"/>
+          <w:color w:val="2F5D8C"/>
+          <w:sz w:val="24"/>
           <w:rtl w:val="0"/>
         </w:rPr>
       </w:r>
@@ -4316,17 +4385,19 @@
         <w:rPr/>
       </w:pPr>
       <w:r>
-        <w:rPr/>
+        <w:rPr>
+          <w:rFonts w:ascii="Calibri" w:hAnsi="Calibri"/>
+        </w:rPr>
         <w:drawing>
           <wp:inline distB="0" distT="0" distL="0" distR="0">
             <wp:extent cx="4953000" cy="1714500"/>
             <wp:effectExtent b="0" l="0" r="0" t="0"/>
-            <wp:docPr descr="Pantallazo de la ejecución de pruebas" id="118" name="image20.png"/>
+            <wp:docPr descr="Pantallazo de la ejecución de pruebas" id="164" name="image6.png"/>
             <a:graphic>
               <a:graphicData uri="http://schemas.openxmlformats.org/drawingml/2006/picture">
                 <pic:pic>
                   <pic:nvPicPr>
-                    <pic:cNvPr descr="Pantallazo de la ejecución de pruebas" id="0" name="image20.png"/>
+                    <pic:cNvPr descr="Pantallazo de la ejecución de pruebas" id="0" name="image6.png"/>
                     <pic:cNvPicPr preferRelativeResize="0"/>
                   </pic:nvPicPr>
                   <pic:blipFill>
@@ -4352,6 +4423,7 @@
       </w:r>
       <w:r>
         <w:rPr>
+          <w:rFonts w:ascii="Calibri" w:hAnsi="Calibri"/>
           <w:rtl w:val="0"/>
         </w:rPr>
       </w:r>
@@ -4374,6 +4446,7 @@
       </w:r>
       <w:r>
         <w:rPr>
+          <w:rFonts w:ascii="Calibri" w:hAnsi="Calibri"/>
           <w:rtl w:val="0"/>
         </w:rPr>
       </w:r>
@@ -4388,9 +4461,10 @@
       <w:r>
         <w:rPr>
           <w:rFonts w:ascii="Calibri" w:cs="Calibri" w:eastAsia="Calibri" w:hAnsi="Calibri"/>
-          <w:b w:val="1"/>
+          <w:b/>
           <w:bCs w:val="1"/>
-          <w:color w:val="2f5d8c"/>
+          <w:i w:val="0"/>
+          <w:color w:val="2F5D8C"/>
           <w:sz w:val="24"/>
           <w:szCs w:val="24"/>
           <w:rtl w:val="0"/>
@@ -4399,6 +4473,11 @@
       </w:r>
       <w:r>
         <w:rPr>
+          <w:rFonts w:ascii="Calibri" w:hAnsi="Calibri"/>
+          <w:b/>
+          <w:i w:val="0"/>
+          <w:color w:val="2F5D8C"/>
+          <w:sz w:val="24"/>
           <w:rtl w:val="0"/>
         </w:rPr>
       </w:r>
@@ -4410,17 +4489,19 @@
         <w:rPr/>
       </w:pPr>
       <w:r>
-        <w:rPr/>
+        <w:rPr>
+          <w:rFonts w:ascii="Calibri" w:hAnsi="Calibri"/>
+        </w:rPr>
         <w:drawing>
           <wp:inline distB="0" distT="0" distL="0" distR="0">
             <wp:extent cx="3124200" cy="3143250"/>
             <wp:effectExtent b="0" l="0" r="0" t="0"/>
-            <wp:docPr descr="Pantallazo de la ejecución de pruebas" id="121" name="image29.png"/>
+            <wp:docPr descr="Pantallazo de la ejecución de pruebas" id="167" name="image27.png"/>
             <a:graphic>
               <a:graphicData uri="http://schemas.openxmlformats.org/drawingml/2006/picture">
                 <pic:pic>
                   <pic:nvPicPr>
-                    <pic:cNvPr descr="Pantallazo de la ejecución de pruebas" id="0" name="image29.png"/>
+                    <pic:cNvPr descr="Pantallazo de la ejecución de pruebas" id="0" name="image27.png"/>
                     <pic:cNvPicPr preferRelativeResize="0"/>
                   </pic:nvPicPr>
                   <pic:blipFill>
@@ -4446,6 +4527,7 @@
       </w:r>
       <w:r>
         <w:rPr>
+          <w:rFonts w:ascii="Calibri" w:hAnsi="Calibri"/>
           <w:rtl w:val="0"/>
         </w:rPr>
       </w:r>
@@ -4457,17 +4539,19 @@
         <w:rPr/>
       </w:pPr>
       <w:r>
-        <w:rPr/>
+        <w:rPr>
+          <w:rFonts w:ascii="Calibri" w:hAnsi="Calibri"/>
+        </w:rPr>
         <w:drawing>
           <wp:inline distB="0" distT="0" distL="0" distR="0">
             <wp:extent cx="4191000" cy="1381125"/>
             <wp:effectExtent b="0" l="0" r="0" t="0"/>
-            <wp:docPr descr="Pantallazo de la ejecución de pruebas" id="120" name="image21.png"/>
+            <wp:docPr descr="Pantallazo de la ejecución de pruebas" id="166" name="image24.png"/>
             <a:graphic>
               <a:graphicData uri="http://schemas.openxmlformats.org/drawingml/2006/picture">
                 <pic:pic>
                   <pic:nvPicPr>
-                    <pic:cNvPr descr="Pantallazo de la ejecución de pruebas" id="0" name="image21.png"/>
+                    <pic:cNvPr descr="Pantallazo de la ejecución de pruebas" id="0" name="image24.png"/>
                     <pic:cNvPicPr preferRelativeResize="0"/>
                   </pic:nvPicPr>
                   <pic:blipFill>
@@ -4493,6 +4577,7 @@
       </w:r>
       <w:r>
         <w:rPr>
+          <w:rFonts w:ascii="Calibri" w:hAnsi="Calibri"/>
           <w:rtl w:val="0"/>
         </w:rPr>
       </w:r>
@@ -4515,6 +4600,7 @@
       </w:r>
       <w:r>
         <w:rPr>
+          <w:rFonts w:ascii="Calibri" w:hAnsi="Calibri"/>
           <w:rtl w:val="0"/>
         </w:rPr>
       </w:r>
@@ -4529,9 +4615,10 @@
       <w:r>
         <w:rPr>
           <w:rFonts w:ascii="Calibri" w:cs="Calibri" w:eastAsia="Calibri" w:hAnsi="Calibri"/>
-          <w:b w:val="1"/>
+          <w:b/>
           <w:bCs w:val="1"/>
-          <w:color w:val="1e3a5f"/>
+          <w:i w:val="0"/>
+          <w:color w:val="1E3A5F"/>
           <w:sz w:val="27"/>
           <w:szCs w:val="27"/>
           <w:rtl w:val="0"/>
@@ -4540,6 +4627,11 @@
       </w:r>
       <w:r>
         <w:rPr>
+          <w:rFonts w:ascii="Calibri" w:hAnsi="Calibri"/>
+          <w:b/>
+          <w:i w:val="0"/>
+          <w:color w:val="1E3A5F"/>
+          <w:sz w:val="27"/>
           <w:rtl w:val="0"/>
         </w:rPr>
       </w:r>
@@ -4560,6 +4652,7 @@
       </w:r>
       <w:r>
         <w:rPr>
+          <w:rFonts w:ascii="Calibri" w:hAnsi="Calibri"/>
           <w:rtl w:val="0"/>
         </w:rPr>
       </w:r>
@@ -4574,9 +4667,10 @@
       <w:r>
         <w:rPr>
           <w:rFonts w:ascii="Calibri" w:cs="Calibri" w:eastAsia="Calibri" w:hAnsi="Calibri"/>
-          <w:b w:val="1"/>
+          <w:b/>
           <w:bCs w:val="1"/>
-          <w:color w:val="2f5d8c"/>
+          <w:i w:val="0"/>
+          <w:color w:val="2F5D8C"/>
           <w:sz w:val="24"/>
           <w:szCs w:val="24"/>
           <w:rtl w:val="0"/>
@@ -4585,6 +4679,11 @@
       </w:r>
       <w:r>
         <w:rPr>
+          <w:rFonts w:ascii="Calibri" w:hAnsi="Calibri"/>
+          <w:b/>
+          <w:i w:val="0"/>
+          <w:color w:val="2F5D8C"/>
+          <w:sz w:val="24"/>
           <w:rtl w:val="0"/>
         </w:rPr>
       </w:r>
@@ -4596,17 +4695,19 @@
         <w:rPr/>
       </w:pPr>
       <w:r>
-        <w:rPr/>
+        <w:rPr>
+          <w:rFonts w:ascii="Calibri" w:hAnsi="Calibri"/>
+        </w:rPr>
         <w:drawing>
           <wp:inline distB="0" distT="0" distL="0" distR="0">
             <wp:extent cx="4953000" cy="1524000"/>
             <wp:effectExtent b="0" l="0" r="0" t="0"/>
-            <wp:docPr descr="Pantallazo de la ejecución de pruebas" id="125" name="image27.png"/>
+            <wp:docPr descr="Pantallazo de la ejecución de pruebas" id="171" name="image28.png"/>
             <a:graphic>
               <a:graphicData uri="http://schemas.openxmlformats.org/drawingml/2006/picture">
                 <pic:pic>
                   <pic:nvPicPr>
-                    <pic:cNvPr descr="Pantallazo de la ejecución de pruebas" id="0" name="image27.png"/>
+                    <pic:cNvPr descr="Pantallazo de la ejecución de pruebas" id="0" name="image28.png"/>
                     <pic:cNvPicPr preferRelativeResize="0"/>
                   </pic:nvPicPr>
                   <pic:blipFill>
@@ -4632,6 +4733,7 @@
       </w:r>
       <w:r>
         <w:rPr>
+          <w:rFonts w:ascii="Calibri" w:hAnsi="Calibri"/>
           <w:rtl w:val="0"/>
         </w:rPr>
       </w:r>
@@ -4654,6 +4756,7 @@
       </w:r>
       <w:r>
         <w:rPr>
+          <w:rFonts w:ascii="Calibri" w:hAnsi="Calibri"/>
           <w:rtl w:val="0"/>
         </w:rPr>
       </w:r>
@@ -4668,9 +4771,10 @@
       <w:r>
         <w:rPr>
           <w:rFonts w:ascii="Calibri" w:cs="Calibri" w:eastAsia="Calibri" w:hAnsi="Calibri"/>
-          <w:b w:val="1"/>
+          <w:b/>
           <w:bCs w:val="1"/>
-          <w:color w:val="2f5d8c"/>
+          <w:i w:val="0"/>
+          <w:color w:val="2F5D8C"/>
           <w:sz w:val="24"/>
           <w:szCs w:val="24"/>
           <w:rtl w:val="0"/>
@@ -4679,6 +4783,11 @@
       </w:r>
       <w:r>
         <w:rPr>
+          <w:rFonts w:ascii="Calibri" w:hAnsi="Calibri"/>
+          <w:b/>
+          <w:i w:val="0"/>
+          <w:color w:val="2F5D8C"/>
+          <w:sz w:val="24"/>
           <w:rtl w:val="0"/>
         </w:rPr>
       </w:r>
@@ -4690,17 +4799,19 @@
         <w:rPr/>
       </w:pPr>
       <w:r>
-        <w:rPr/>
+        <w:rPr>
+          <w:rFonts w:ascii="Calibri" w:hAnsi="Calibri"/>
+        </w:rPr>
         <w:drawing>
           <wp:inline distB="0" distT="0" distL="0" distR="0">
             <wp:extent cx="4953000" cy="2219325"/>
             <wp:effectExtent b="0" l="0" r="0" t="0"/>
-            <wp:docPr descr="Pantallazo de la ejecución de pruebas" id="123" name="image40.png"/>
+            <wp:docPr descr="Pantallazo de la ejecución de pruebas" id="169" name="image35.png"/>
             <a:graphic>
               <a:graphicData uri="http://schemas.openxmlformats.org/drawingml/2006/picture">
                 <pic:pic>
                   <pic:nvPicPr>
-                    <pic:cNvPr descr="Pantallazo de la ejecución de pruebas" id="0" name="image40.png"/>
+                    <pic:cNvPr descr="Pantallazo de la ejecución de pruebas" id="0" name="image35.png"/>
                     <pic:cNvPicPr preferRelativeResize="0"/>
                   </pic:nvPicPr>
                   <pic:blipFill>
@@ -4726,6 +4837,7 @@
       </w:r>
       <w:r>
         <w:rPr>
+          <w:rFonts w:ascii="Calibri" w:hAnsi="Calibri"/>
           <w:rtl w:val="0"/>
         </w:rPr>
       </w:r>
@@ -4748,6 +4860,7 @@
       </w:r>
       <w:r>
         <w:rPr>
+          <w:rFonts w:ascii="Calibri" w:hAnsi="Calibri"/>
           <w:rtl w:val="0"/>
         </w:rPr>
       </w:r>
@@ -4762,9 +4875,10 @@
       <w:r>
         <w:rPr>
           <w:rFonts w:ascii="Calibri" w:cs="Calibri" w:eastAsia="Calibri" w:hAnsi="Calibri"/>
-          <w:b w:val="1"/>
+          <w:b/>
           <w:bCs w:val="1"/>
-          <w:color w:val="2f5d8c"/>
+          <w:i w:val="0"/>
+          <w:color w:val="2F5D8C"/>
           <w:sz w:val="24"/>
           <w:szCs w:val="24"/>
           <w:rtl w:val="0"/>
@@ -4773,6 +4887,11 @@
       </w:r>
       <w:r>
         <w:rPr>
+          <w:rFonts w:ascii="Calibri" w:hAnsi="Calibri"/>
+          <w:b/>
+          <w:i w:val="0"/>
+          <w:color w:val="2F5D8C"/>
+          <w:sz w:val="24"/>
           <w:rtl w:val="0"/>
         </w:rPr>
       </w:r>
@@ -4784,17 +4903,19 @@
         <w:rPr/>
       </w:pPr>
       <w:r>
-        <w:rPr/>
+        <w:rPr>
+          <w:rFonts w:ascii="Calibri" w:hAnsi="Calibri"/>
+        </w:rPr>
         <w:drawing>
           <wp:inline distB="0" distT="0" distL="0" distR="0">
             <wp:extent cx="4953000" cy="1628775"/>
             <wp:effectExtent b="0" l="0" r="0" t="0"/>
-            <wp:docPr descr="Pantallazo de la ejecución de pruebas" id="130" name="image28.png"/>
+            <wp:docPr descr="Pantallazo de la ejecución de pruebas" id="176" name="image38.png"/>
             <a:graphic>
               <a:graphicData uri="http://schemas.openxmlformats.org/drawingml/2006/picture">
                 <pic:pic>
                   <pic:nvPicPr>
-                    <pic:cNvPr descr="Pantallazo de la ejecución de pruebas" id="0" name="image28.png"/>
+                    <pic:cNvPr descr="Pantallazo de la ejecución de pruebas" id="0" name="image38.png"/>
                     <pic:cNvPicPr preferRelativeResize="0"/>
                   </pic:nvPicPr>
                   <pic:blipFill>
@@ -4820,6 +4941,7 @@
       </w:r>
       <w:r>
         <w:rPr>
+          <w:rFonts w:ascii="Calibri" w:hAnsi="Calibri"/>
           <w:rtl w:val="0"/>
         </w:rPr>
       </w:r>
@@ -4842,6 +4964,7 @@
       </w:r>
       <w:r>
         <w:rPr>
+          <w:rFonts w:ascii="Calibri" w:hAnsi="Calibri"/>
           <w:rtl w:val="0"/>
         </w:rPr>
       </w:r>
@@ -4856,9 +4979,10 @@
       <w:r>
         <w:rPr>
           <w:rFonts w:ascii="Calibri" w:cs="Calibri" w:eastAsia="Calibri" w:hAnsi="Calibri"/>
-          <w:b w:val="1"/>
+          <w:b/>
           <w:bCs w:val="1"/>
-          <w:color w:val="2f5d8c"/>
+          <w:i w:val="0"/>
+          <w:color w:val="2F5D8C"/>
           <w:sz w:val="24"/>
           <w:szCs w:val="24"/>
           <w:rtl w:val="0"/>
@@ -4867,6 +4991,11 @@
       </w:r>
       <w:r>
         <w:rPr>
+          <w:rFonts w:ascii="Calibri" w:hAnsi="Calibri"/>
+          <w:b/>
+          <w:i w:val="0"/>
+          <w:color w:val="2F5D8C"/>
+          <w:sz w:val="24"/>
           <w:rtl w:val="0"/>
         </w:rPr>
       </w:r>
@@ -4878,17 +5007,19 @@
         <w:rPr/>
       </w:pPr>
       <w:r>
-        <w:rPr/>
+        <w:rPr>
+          <w:rFonts w:ascii="Calibri" w:hAnsi="Calibri"/>
+        </w:rPr>
         <w:drawing>
           <wp:inline distB="0" distT="0" distL="0" distR="0">
             <wp:extent cx="4191000" cy="2209800"/>
             <wp:effectExtent b="0" l="0" r="0" t="0"/>
-            <wp:docPr descr="Pantallazo de la ejecución de pruebas" id="126" name="image36.png"/>
+            <wp:docPr descr="Pantallazo de la ejecución de pruebas" id="172" name="image29.png"/>
             <a:graphic>
               <a:graphicData uri="http://schemas.openxmlformats.org/drawingml/2006/picture">
                 <pic:pic>
                   <pic:nvPicPr>
-                    <pic:cNvPr descr="Pantallazo de la ejecución de pruebas" id="0" name="image36.png"/>
+                    <pic:cNvPr descr="Pantallazo de la ejecución de pruebas" id="0" name="image29.png"/>
                     <pic:cNvPicPr preferRelativeResize="0"/>
                   </pic:nvPicPr>
                   <pic:blipFill>
@@ -4914,6 +5045,7 @@
       </w:r>
       <w:r>
         <w:rPr>
+          <w:rFonts w:ascii="Calibri" w:hAnsi="Calibri"/>
           <w:rtl w:val="0"/>
         </w:rPr>
       </w:r>
@@ -4925,17 +5057,19 @@
         <w:rPr/>
       </w:pPr>
       <w:r>
-        <w:rPr/>
+        <w:rPr>
+          <w:rFonts w:ascii="Calibri" w:hAnsi="Calibri"/>
+        </w:rPr>
         <w:drawing>
           <wp:inline distB="0" distT="0" distL="0" distR="0">
             <wp:extent cx="3762375" cy="2238375"/>
             <wp:effectExtent b="0" l="0" r="0" t="0"/>
-            <wp:docPr descr="Pantallazo de la ejecución de pruebas" id="128" name="image33.png"/>
+            <wp:docPr descr="Pantallazo de la ejecución de pruebas" id="174" name="image36.png"/>
             <a:graphic>
               <a:graphicData uri="http://schemas.openxmlformats.org/drawingml/2006/picture">
                 <pic:pic>
                   <pic:nvPicPr>
-                    <pic:cNvPr descr="Pantallazo de la ejecución de pruebas" id="0" name="image33.png"/>
+                    <pic:cNvPr descr="Pantallazo de la ejecución de pruebas" id="0" name="image36.png"/>
                     <pic:cNvPicPr preferRelativeResize="0"/>
                   </pic:nvPicPr>
                   <pic:blipFill>
@@ -4961,6 +5095,7 @@
       </w:r>
       <w:r>
         <w:rPr>
+          <w:rFonts w:ascii="Calibri" w:hAnsi="Calibri"/>
           <w:rtl w:val="0"/>
         </w:rPr>
       </w:r>
@@ -4972,17 +5107,19 @@
         <w:rPr/>
       </w:pPr>
       <w:r>
-        <w:rPr/>
+        <w:rPr>
+          <w:rFonts w:ascii="Calibri" w:hAnsi="Calibri"/>
+        </w:rPr>
         <w:drawing>
           <wp:inline distB="0" distT="0" distL="0" distR="0">
             <wp:extent cx="3800475" cy="2238375"/>
             <wp:effectExtent b="0" l="0" r="0" t="0"/>
-            <wp:docPr descr="Pantallazo de la ejecución de pruebas" id="131" name="image32.png"/>
+            <wp:docPr descr="Pantallazo de la ejecución de pruebas" id="177" name="image31.png"/>
             <a:graphic>
               <a:graphicData uri="http://schemas.openxmlformats.org/drawingml/2006/picture">
                 <pic:pic>
                   <pic:nvPicPr>
-                    <pic:cNvPr descr="Pantallazo de la ejecución de pruebas" id="0" name="image32.png"/>
+                    <pic:cNvPr descr="Pantallazo de la ejecución de pruebas" id="0" name="image31.png"/>
                     <pic:cNvPicPr preferRelativeResize="0"/>
                   </pic:nvPicPr>
                   <pic:blipFill>
@@ -5008,6 +5145,7 @@
       </w:r>
       <w:r>
         <w:rPr>
+          <w:rFonts w:ascii="Calibri" w:hAnsi="Calibri"/>
           <w:rtl w:val="0"/>
         </w:rPr>
       </w:r>
@@ -5019,17 +5157,19 @@
         <w:rPr/>
       </w:pPr>
       <w:r>
-        <w:rPr/>
+        <w:rPr>
+          <w:rFonts w:ascii="Calibri" w:hAnsi="Calibri"/>
+        </w:rPr>
         <w:drawing>
           <wp:inline distB="0" distT="0" distL="0" distR="0">
             <wp:extent cx="2190750" cy="857250"/>
             <wp:effectExtent b="0" l="0" r="0" t="0"/>
-            <wp:docPr descr="Pantallazo de la ejecución de pruebas" id="133" name="image30.png"/>
+            <wp:docPr descr="Pantallazo de la ejecución de pruebas" id="179" name="image25.png"/>
             <a:graphic>
               <a:graphicData uri="http://schemas.openxmlformats.org/drawingml/2006/picture">
                 <pic:pic>
                   <pic:nvPicPr>
-                    <pic:cNvPr descr="Pantallazo de la ejecución de pruebas" id="0" name="image30.png"/>
+                    <pic:cNvPr descr="Pantallazo de la ejecución de pruebas" id="0" name="image25.png"/>
                     <pic:cNvPicPr preferRelativeResize="0"/>
                   </pic:nvPicPr>
                   <pic:blipFill>
@@ -5055,6 +5195,7 @@
       </w:r>
       <w:r>
         <w:rPr>
+          <w:rFonts w:ascii="Calibri" w:hAnsi="Calibri"/>
           <w:rtl w:val="0"/>
         </w:rPr>
       </w:r>
@@ -5077,6 +5218,7 @@
       </w:r>
       <w:r>
         <w:rPr>
+          <w:rFonts w:ascii="Calibri" w:hAnsi="Calibri"/>
           <w:rtl w:val="0"/>
         </w:rPr>
       </w:r>
@@ -5092,9 +5234,10 @@
       <w:r>
         <w:rPr>
           <w:rFonts w:ascii="Calibri" w:cs="Calibri" w:eastAsia="Calibri" w:hAnsi="Calibri"/>
-          <w:b w:val="1"/>
+          <w:b/>
           <w:bCs w:val="1"/>
-          <w:color w:val="1e3a5f"/>
+          <w:i w:val="0"/>
+          <w:color w:val="1E3A5F"/>
           <w:sz w:val="32"/>
           <w:szCs w:val="32"/>
           <w:rtl w:val="0"/>
@@ -5103,6 +5246,11 @@
       </w:r>
       <w:r>
         <w:rPr>
+          <w:rFonts w:ascii="Calibri" w:hAnsi="Calibri"/>
+          <w:b/>
+          <w:i w:val="0"/>
+          <w:color w:val="1E3A5F"/>
+          <w:sz w:val="32"/>
           <w:rtl w:val="0"/>
         </w:rPr>
       </w:r>
@@ -5123,6 +5271,7 @@
       </w:r>
       <w:r>
         <w:rPr>
+          <w:rFonts w:ascii="Calibri" w:hAnsi="Calibri"/>
           <w:rtl w:val="0"/>
         </w:rPr>
       </w:r>
@@ -5137,9 +5286,10 @@
       <w:r>
         <w:rPr>
           <w:rFonts w:ascii="Calibri" w:cs="Calibri" w:eastAsia="Calibri" w:hAnsi="Calibri"/>
-          <w:b w:val="1"/>
+          <w:b/>
           <w:bCs w:val="1"/>
-          <w:color w:val="1e3a5f"/>
+          <w:i w:val="0"/>
+          <w:color w:val="1E3A5F"/>
           <w:sz w:val="27"/>
           <w:szCs w:val="27"/>
           <w:rtl w:val="0"/>
@@ -5148,6 +5298,11 @@
       </w:r>
       <w:r>
         <w:rPr>
+          <w:rFonts w:ascii="Calibri" w:hAnsi="Calibri"/>
+          <w:b/>
+          <w:i w:val="0"/>
+          <w:color w:val="1E3A5F"/>
+          <w:sz w:val="27"/>
           <w:rtl w:val="0"/>
         </w:rPr>
       </w:r>
@@ -5168,6 +5323,7 @@
       </w:r>
       <w:r>
         <w:rPr>
+          <w:rFonts w:ascii="Calibri" w:hAnsi="Calibri"/>
           <w:rtl w:val="0"/>
         </w:rPr>
       </w:r>
@@ -5188,6 +5344,7 @@
       </w:r>
       <w:r>
         <w:rPr>
+          <w:rFonts w:ascii="Calibri" w:hAnsi="Calibri"/>
           <w:rtl w:val="0"/>
         </w:rPr>
       </w:r>
@@ -5199,17 +5356,19 @@
         <w:rPr/>
       </w:pPr>
       <w:r>
-        <w:rPr/>
+        <w:rPr>
+          <w:rFonts w:ascii="Calibri" w:hAnsi="Calibri"/>
+        </w:rPr>
         <w:drawing>
           <wp:inline distB="0" distT="0" distL="0" distR="0">
             <wp:extent cx="3876675" cy="3619500"/>
             <wp:effectExtent b="0" l="0" r="0" t="0"/>
-            <wp:docPr descr="Pantallazo de la ejecución de pruebas" id="135" name="image38.png"/>
+            <wp:docPr descr="Pantallazo de la ejecución de pruebas" id="181" name="image30.png"/>
             <a:graphic>
               <a:graphicData uri="http://schemas.openxmlformats.org/drawingml/2006/picture">
                 <pic:pic>
                   <pic:nvPicPr>
-                    <pic:cNvPr descr="Pantallazo de la ejecución de pruebas" id="0" name="image38.png"/>
+                    <pic:cNvPr descr="Pantallazo de la ejecución de pruebas" id="0" name="image30.png"/>
                     <pic:cNvPicPr preferRelativeResize="0"/>
                   </pic:nvPicPr>
                   <pic:blipFill>
@@ -5235,6 +5394,7 @@
       </w:r>
       <w:r>
         <w:rPr>
+          <w:rFonts w:ascii="Calibri" w:hAnsi="Calibri"/>
           <w:rtl w:val="0"/>
         </w:rPr>
       </w:r>
@@ -5246,12 +5406,14 @@
         <w:rPr/>
       </w:pPr>
       <w:r>
-        <w:rPr/>
+        <w:rPr>
+          <w:rFonts w:ascii="Calibri" w:hAnsi="Calibri"/>
+        </w:rPr>
         <w:drawing>
           <wp:inline distB="0" distT="0" distL="0" distR="0">
             <wp:extent cx="4191000" cy="733425"/>
             <wp:effectExtent b="0" l="0" r="0" t="0"/>
-            <wp:docPr descr="Pantallazo de la ejecución de pruebas" id="137" name="image39.png"/>
+            <wp:docPr descr="Pantallazo de la ejecución de pruebas" id="183" name="image39.png"/>
             <a:graphic>
               <a:graphicData uri="http://schemas.openxmlformats.org/drawingml/2006/picture">
                 <pic:pic>
@@ -5282,6 +5444,7 @@
       </w:r>
       <w:r>
         <w:rPr>
+          <w:rFonts w:ascii="Calibri" w:hAnsi="Calibri"/>
           <w:rtl w:val="0"/>
         </w:rPr>
       </w:r>
@@ -5304,6 +5467,7 @@
       </w:r>
       <w:r>
         <w:rPr>
+          <w:rFonts w:ascii="Calibri" w:hAnsi="Calibri"/>
           <w:rtl w:val="0"/>
         </w:rPr>
       </w:r>
@@ -5318,9 +5482,10 @@
       <w:r>
         <w:rPr>
           <w:rFonts w:ascii="Calibri" w:cs="Calibri" w:eastAsia="Calibri" w:hAnsi="Calibri"/>
-          <w:b w:val="1"/>
+          <w:b/>
           <w:bCs w:val="1"/>
-          <w:color w:val="2f5d8c"/>
+          <w:i w:val="0"/>
+          <w:color w:val="2F5D8C"/>
           <w:sz w:val="24"/>
           <w:szCs w:val="24"/>
           <w:rtl w:val="0"/>
@@ -5329,6 +5494,11 @@
       </w:r>
       <w:r>
         <w:rPr>
+          <w:rFonts w:ascii="Calibri" w:hAnsi="Calibri"/>
+          <w:b/>
+          <w:i w:val="0"/>
+          <w:color w:val="2F5D8C"/>
+          <w:sz w:val="24"/>
           <w:rtl w:val="0"/>
         </w:rPr>
       </w:r>
@@ -5349,6 +5519,7 @@
       </w:r>
       <w:r>
         <w:rPr>
+          <w:rFonts w:ascii="Calibri" w:hAnsi="Calibri"/>
           <w:rtl w:val="0"/>
         </w:rPr>
       </w:r>
@@ -5360,17 +5531,19 @@
         <w:rPr/>
       </w:pPr>
       <w:r>
-        <w:rPr/>
+        <w:rPr>
+          <w:rFonts w:ascii="Calibri" w:hAnsi="Calibri"/>
+        </w:rPr>
         <w:drawing>
           <wp:inline distB="0" distT="0" distL="0" distR="0">
             <wp:extent cx="4381500" cy="1876425"/>
             <wp:effectExtent b="0" l="0" r="0" t="0"/>
-            <wp:docPr descr="Pantallazo de la ejecución de pruebas" id="139" name="image43.png"/>
+            <wp:docPr descr="Pantallazo de la ejecución de pruebas" id="185" name="image41.png"/>
             <a:graphic>
               <a:graphicData uri="http://schemas.openxmlformats.org/drawingml/2006/picture">
                 <pic:pic>
                   <pic:nvPicPr>
-                    <pic:cNvPr descr="Pantallazo de la ejecución de pruebas" id="0" name="image43.png"/>
+                    <pic:cNvPr descr="Pantallazo de la ejecución de pruebas" id="0" name="image41.png"/>
                     <pic:cNvPicPr preferRelativeResize="0"/>
                   </pic:nvPicPr>
                   <pic:blipFill>
@@ -5396,6 +5569,7 @@
       </w:r>
       <w:r>
         <w:rPr>
+          <w:rFonts w:ascii="Calibri" w:hAnsi="Calibri"/>
           <w:rtl w:val="0"/>
         </w:rPr>
       </w:r>
@@ -5418,6 +5592,7 @@
       </w:r>
       <w:r>
         <w:rPr>
+          <w:rFonts w:ascii="Calibri" w:hAnsi="Calibri"/>
           <w:rtl w:val="0"/>
         </w:rPr>
       </w:r>
@@ -5432,9 +5607,10 @@
       <w:r>
         <w:rPr>
           <w:rFonts w:ascii="Calibri" w:cs="Calibri" w:eastAsia="Calibri" w:hAnsi="Calibri"/>
-          <w:b w:val="1"/>
+          <w:b/>
           <w:bCs w:val="1"/>
-          <w:color w:val="1e3a5f"/>
+          <w:i w:val="0"/>
+          <w:color w:val="1E3A5F"/>
           <w:sz w:val="27"/>
           <w:szCs w:val="27"/>
           <w:rtl w:val="0"/>
@@ -5443,6 +5619,11 @@
       </w:r>
       <w:r>
         <w:rPr>
+          <w:rFonts w:ascii="Calibri" w:hAnsi="Calibri"/>
+          <w:b/>
+          <w:i w:val="0"/>
+          <w:color w:val="1E3A5F"/>
+          <w:sz w:val="27"/>
           <w:rtl w:val="0"/>
         </w:rPr>
       </w:r>
@@ -5457,9 +5638,10 @@
       <w:r>
         <w:rPr>
           <w:rFonts w:ascii="Calibri" w:cs="Calibri" w:eastAsia="Calibri" w:hAnsi="Calibri"/>
-          <w:b w:val="1"/>
+          <w:b/>
           <w:bCs w:val="1"/>
-          <w:color w:val="2f5d8c"/>
+          <w:i w:val="0"/>
+          <w:color w:val="2F5D8C"/>
           <w:sz w:val="24"/>
           <w:szCs w:val="24"/>
           <w:rtl w:val="0"/>
@@ -5468,6 +5650,11 @@
       </w:r>
       <w:r>
         <w:rPr>
+          <w:rFonts w:ascii="Calibri" w:hAnsi="Calibri"/>
+          <w:b/>
+          <w:i w:val="0"/>
+          <w:color w:val="2F5D8C"/>
+          <w:sz w:val="24"/>
           <w:rtl w:val="0"/>
         </w:rPr>
       </w:r>
@@ -5488,6 +5675,7 @@
       </w:r>
       <w:r>
         <w:rPr>
+          <w:rFonts w:ascii="Calibri" w:hAnsi="Calibri"/>
           <w:rtl w:val="0"/>
         </w:rPr>
       </w:r>
@@ -5499,17 +5687,19 @@
         <w:rPr/>
       </w:pPr>
       <w:r>
-        <w:rPr/>
+        <w:rPr>
+          <w:rFonts w:ascii="Calibri" w:hAnsi="Calibri"/>
+        </w:rPr>
         <w:drawing>
           <wp:inline distB="0" distT="0" distL="0" distR="0">
             <wp:extent cx="3619500" cy="2047875"/>
             <wp:effectExtent b="0" l="0" r="0" t="0"/>
-            <wp:docPr descr="Pantallazo de la ejecución de pruebas" id="141" name="image42.png"/>
+            <wp:docPr descr="Pantallazo de la ejecución de pruebas" id="187" name="image44.png"/>
             <a:graphic>
               <a:graphicData uri="http://schemas.openxmlformats.org/drawingml/2006/picture">
                 <pic:pic>
                   <pic:nvPicPr>
-                    <pic:cNvPr descr="Pantallazo de la ejecución de pruebas" id="0" name="image42.png"/>
+                    <pic:cNvPr descr="Pantallazo de la ejecución de pruebas" id="0" name="image44.png"/>
                     <pic:cNvPicPr preferRelativeResize="0"/>
                   </pic:nvPicPr>
                   <pic:blipFill>
@@ -5535,6 +5725,7 @@
       </w:r>
       <w:r>
         <w:rPr>
+          <w:rFonts w:ascii="Calibri" w:hAnsi="Calibri"/>
           <w:rtl w:val="0"/>
         </w:rPr>
       </w:r>
@@ -5557,6 +5748,7 @@
       </w:r>
       <w:r>
         <w:rPr>
+          <w:rFonts w:ascii="Calibri" w:hAnsi="Calibri"/>
           <w:rtl w:val="0"/>
         </w:rPr>
       </w:r>
@@ -5581,6 +5773,7 @@
       </w:r>
       <w:r>
         <w:rPr>
+          <w:rFonts w:ascii="Calibri" w:hAnsi="Calibri"/>
           <w:rtl w:val="0"/>
         </w:rPr>
       </w:r>
@@ -5629,6 +5822,7 @@
       </w:r>
       <w:r>
         <w:rPr>
+          <w:rFonts w:ascii="Calibri" w:hAnsi="Calibri"/>
           <w:rtl w:val="0"/>
         </w:rPr>
       </w:r>
@@ -5677,6 +5871,7 @@
       </w:r>
       <w:r>
         <w:rPr>
+          <w:rFonts w:ascii="Calibri" w:hAnsi="Calibri"/>
           <w:rtl w:val="0"/>
         </w:rPr>
       </w:r>
@@ -5725,6 +5920,7 @@
       </w:r>
       <w:r>
         <w:rPr>
+          <w:rFonts w:ascii="Calibri" w:hAnsi="Calibri"/>
           <w:rtl w:val="0"/>
         </w:rPr>
       </w:r>
@@ -5736,17 +5932,19 @@
         <w:rPr/>
       </w:pPr>
       <w:r>
-        <w:rPr/>
+        <w:rPr>
+          <w:rFonts w:ascii="Calibri" w:hAnsi="Calibri"/>
+        </w:rPr>
         <w:drawing>
           <wp:inline distB="0" distT="0" distL="0" distR="0">
             <wp:extent cx="4381500" cy="2276475"/>
             <wp:effectExtent b="0" l="0" r="0" t="0"/>
-            <wp:docPr descr="Pantallazo de la ejecución de pruebas" id="143" name="image46.png"/>
+            <wp:docPr descr="Pantallazo de la ejecución de pruebas" id="189" name="image45.png"/>
             <a:graphic>
               <a:graphicData uri="http://schemas.openxmlformats.org/drawingml/2006/picture">
                 <pic:pic>
                   <pic:nvPicPr>
-                    <pic:cNvPr descr="Pantallazo de la ejecución de pruebas" id="0" name="image46.png"/>
+                    <pic:cNvPr descr="Pantallazo de la ejecución de pruebas" id="0" name="image45.png"/>
                     <pic:cNvPicPr preferRelativeResize="0"/>
                   </pic:nvPicPr>
                   <pic:blipFill>
@@ -5772,6 +5970,7 @@
       </w:r>
       <w:r>
         <w:rPr>
+          <w:rFonts w:ascii="Calibri" w:hAnsi="Calibri"/>
           <w:rtl w:val="0"/>
         </w:rPr>
       </w:r>
@@ -5794,6 +5993,7 @@
       </w:r>
       <w:r>
         <w:rPr>
+          <w:rFonts w:ascii="Calibri" w:hAnsi="Calibri"/>
           <w:rtl w:val="0"/>
         </w:rPr>
       </w:r>
@@ -5808,9 +6008,10 @@
       <w:r>
         <w:rPr>
           <w:rFonts w:ascii="Calibri" w:cs="Calibri" w:eastAsia="Calibri" w:hAnsi="Calibri"/>
-          <w:b w:val="1"/>
+          <w:b/>
           <w:bCs w:val="1"/>
-          <w:color w:val="2f5d8c"/>
+          <w:i w:val="0"/>
+          <w:color w:val="2F5D8C"/>
           <w:sz w:val="24"/>
           <w:szCs w:val="24"/>
           <w:rtl w:val="0"/>
@@ -5819,6 +6020,11 @@
       </w:r>
       <w:r>
         <w:rPr>
+          <w:rFonts w:ascii="Calibri" w:hAnsi="Calibri"/>
+          <w:b/>
+          <w:i w:val="0"/>
+          <w:color w:val="2F5D8C"/>
+          <w:sz w:val="24"/>
           <w:rtl w:val="0"/>
         </w:rPr>
       </w:r>
@@ -5839,6 +6045,7 @@
       </w:r>
       <w:r>
         <w:rPr>
+          <w:rFonts w:ascii="Calibri" w:hAnsi="Calibri"/>
           <w:rtl w:val="0"/>
         </w:rPr>
       </w:r>
@@ -5850,17 +6057,19 @@
         <w:rPr/>
       </w:pPr>
       <w:r>
-        <w:rPr/>
+        <w:rPr>
+          <w:rFonts w:ascii="Calibri" w:hAnsi="Calibri"/>
+        </w:rPr>
         <w:drawing>
           <wp:inline distB="0" distT="0" distL="114300" distR="114300">
             <wp:extent cx="4191000" cy="2038149"/>
             <wp:effectExtent b="0" l="0" r="0" t="0"/>
-            <wp:docPr id="144" name="image41.png"/>
+            <wp:docPr id="190" name="image43.png"/>
             <a:graphic>
               <a:graphicData uri="http://schemas.openxmlformats.org/drawingml/2006/picture">
                 <pic:pic>
                   <pic:nvPicPr>
-                    <pic:cNvPr id="0" name="image41.png"/>
+                    <pic:cNvPr id="0" name="image43.png"/>
                     <pic:cNvPicPr preferRelativeResize="0"/>
                   </pic:nvPicPr>
                   <pic:blipFill>
@@ -5886,6 +6095,7 @@
       </w:r>
       <w:r>
         <w:rPr>
+          <w:rFonts w:ascii="Calibri" w:hAnsi="Calibri"/>
           <w:rtl w:val="0"/>
         </w:rPr>
       </w:r>
@@ -5908,6 +6118,7 @@
       </w:r>
       <w:r>
         <w:rPr>
+          <w:rFonts w:ascii="Calibri" w:hAnsi="Calibri"/>
           <w:rtl w:val="0"/>
         </w:rPr>
       </w:r>
@@ -5922,9 +6133,10 @@
       <w:r>
         <w:rPr>
           <w:rFonts w:ascii="Calibri" w:cs="Calibri" w:eastAsia="Calibri" w:hAnsi="Calibri"/>
-          <w:b w:val="1"/>
+          <w:b/>
           <w:bCs w:val="1"/>
-          <w:color w:val="2f5d8c"/>
+          <w:i w:val="0"/>
+          <w:color w:val="2F5D8C"/>
           <w:sz w:val="24"/>
           <w:szCs w:val="24"/>
           <w:rtl w:val="0"/>
@@ -5933,6 +6145,11 @@
       </w:r>
       <w:r>
         <w:rPr>
+          <w:rFonts w:ascii="Calibri" w:hAnsi="Calibri"/>
+          <w:b/>
+          <w:i w:val="0"/>
+          <w:color w:val="2F5D8C"/>
+          <w:sz w:val="24"/>
           <w:rtl w:val="0"/>
         </w:rPr>
       </w:r>
@@ -5953,6 +6170,7 @@
       </w:r>
       <w:r>
         <w:rPr>
+          <w:rFonts w:ascii="Calibri" w:hAnsi="Calibri"/>
           <w:rtl w:val="0"/>
         </w:rPr>
       </w:r>
@@ -5973,6 +6191,7 @@
       </w:r>
       <w:r>
         <w:rPr>
+          <w:rFonts w:ascii="Calibri" w:hAnsi="Calibri"/>
           <w:rtl w:val="0"/>
         </w:rPr>
       </w:r>
@@ -5984,17 +6203,19 @@
         <w:rPr/>
       </w:pPr>
       <w:r>
-        <w:rPr/>
+        <w:rPr>
+          <w:rFonts w:ascii="Calibri" w:hAnsi="Calibri"/>
+        </w:rPr>
         <w:drawing>
           <wp:inline distB="0" distT="0" distL="114300" distR="114300">
             <wp:extent cx="4191000" cy="2156945"/>
             <wp:effectExtent b="0" l="0" r="0" t="0"/>
-            <wp:docPr id="101" name="image7.png"/>
+            <wp:docPr id="147" name="image17.png"/>
             <a:graphic>
               <a:graphicData uri="http://schemas.openxmlformats.org/drawingml/2006/picture">
                 <pic:pic>
                   <pic:nvPicPr>
-                    <pic:cNvPr id="0" name="image7.png"/>
+                    <pic:cNvPr id="0" name="image17.png"/>
                     <pic:cNvPicPr preferRelativeResize="0"/>
                   </pic:nvPicPr>
                   <pic:blipFill>
@@ -6020,6 +6241,7 @@
       </w:r>
       <w:r>
         <w:rPr>
+          <w:rFonts w:ascii="Calibri" w:hAnsi="Calibri"/>
           <w:rtl w:val="0"/>
         </w:rPr>
       </w:r>
@@ -6042,6 +6264,7 @@
       </w:r>
       <w:r>
         <w:rPr>
+          <w:rFonts w:ascii="Calibri" w:hAnsi="Calibri"/>
           <w:rtl w:val="0"/>
         </w:rPr>
       </w:r>
@@ -6053,6 +6276,11 @@
       </w:pPr>
       <w:r>
         <w:rPr>
+          <w:rFonts w:ascii="Calibri" w:hAnsi="Calibri"/>
+          <w:b/>
+          <w:i w:val="0"/>
+          <w:color w:val="2F5D8C"/>
+          <w:sz w:val="24"/>
           <w:rtl w:val="0"/>
         </w:rPr>
         <w:t xml:space="preserve">Verificación de la suite del frontend antes del Sprint 3</w:t>
@@ -6065,6 +6293,7 @@
       </w:pPr>
       <w:r>
         <w:rPr>
+          <w:rFonts w:ascii="Calibri" w:hAnsi="Calibri"/>
           <w:rtl w:val="0"/>
         </w:rPr>
         <w:t xml:space="preserve">El 16 de octubre de 2026 se ejecutó npm.cmd test -- --watch=false en el frontend local. La ejecución terminó con 37 de 37 pruebas aprobadas en 11 archivos, sin fallos. Este resultado corresponde a la suite existente antes de incorporar las pruebas automatizadas de donantes.</w:t>
@@ -6077,17 +6306,19 @@
         <w:rPr/>
       </w:pPr>
       <w:r>
-        <w:rPr/>
+        <w:rPr>
+          <w:rFonts w:ascii="Calibri" w:hAnsi="Calibri"/>
+        </w:rPr>
         <w:drawing>
           <wp:inline distB="0" distT="0" distL="114300" distR="114300">
             <wp:extent cx="5303520" cy="2948792"/>
             <wp:effectExtent b="0" l="0" r="0" t="0"/>
-            <wp:docPr id="103" name="image10.png"/>
+            <wp:docPr id="149" name="image3.png"/>
             <a:graphic>
               <a:graphicData uri="http://schemas.openxmlformats.org/drawingml/2006/picture">
                 <pic:pic>
                   <pic:nvPicPr>
-                    <pic:cNvPr id="0" name="image10.png"/>
+                    <pic:cNvPr id="0" name="image3.png"/>
                     <pic:cNvPicPr preferRelativeResize="0"/>
                   </pic:nvPicPr>
                   <pic:blipFill>
@@ -6113,6 +6344,7 @@
       </w:r>
       <w:r>
         <w:rPr>
+          <w:rFonts w:ascii="Calibri" w:hAnsi="Calibri"/>
           <w:rtl w:val="0"/>
         </w:rPr>
       </w:r>
@@ -6124,6 +6356,7 @@
       </w:pPr>
       <w:r>
         <w:rPr>
+          <w:rFonts w:ascii="Calibri" w:hAnsi="Calibri"/>
           <w:rtl w:val="0"/>
         </w:rPr>
         <w:t xml:space="preserve">Resultado de referencia: 11 archivos aprobados, 37 pruebas aprobadas y duración de 11,41 segundos.</w:t>
@@ -6136,6 +6369,11 @@
       </w:pPr>
       <w:r>
         <w:rPr>
+          <w:rFonts w:ascii="Calibri" w:hAnsi="Calibri"/>
+          <w:b/>
+          <w:i w:val="0"/>
+          <w:color w:val="2F5D8C"/>
+          <w:sz w:val="24"/>
           <w:rtl w:val="0"/>
         </w:rPr>
         <w:t xml:space="preserve">Sprint 3 Pruebas unitarias del frontend</w:t>
@@ -6148,9 +6386,14 @@
       </w:pPr>
       <w:r>
         <w:rPr>
-          <w:rtl w:val="0"/>
-        </w:rPr>
-        <w:t xml:space="preserve">S3-HU08 Registrar mascota como donante</w:t>
+          <w:rFonts w:ascii="Calibri" w:hAnsi="Calibri"/>
+          <w:b/>
+          <w:i w:val="0"/>
+          <w:color w:val="2F5D8C"/>
+          <w:sz w:val="24"/>
+          <w:rtl w:val="0"/>
+        </w:rPr>
+        <w:t>S3-HU08: Registrar mascota como donante</w:t>
       </w:r>
     </w:p>
     <w:p>
@@ -6160,6 +6403,7 @@
       </w:pPr>
       <w:r>
         <w:rPr>
+          <w:rFonts w:ascii="Calibri" w:hAnsi="Calibri"/>
           <w:rtl w:val="0"/>
         </w:rPr>
         <w:t xml:space="preserve">Se incorporaron ocho pruebas automatizadas de DonanteComponent con Vitest y HttpTestingController. Verifican el bloqueo sin aceptar la declaración, el rechazo de grupos compuestos solo por espacios, el envío del token y del grupo sin espacios externos, la inscripción activa, la inscripción pendiente sin grupo, la prevención de envíos simultáneos, el aviso de duplicados, el aviso de sesión inválida y la conservación de los datos con reintento tras un error del servidor. La inscripción activa y el envío autenticado se verifican en el mismo caso.</w:t>
@@ -6172,6 +6416,7 @@
       </w:pPr>
       <w:r>
         <w:rPr>
+          <w:rFonts w:ascii="Calibri" w:hAnsi="Calibri"/>
           <w:rtl w:val="0"/>
         </w:rPr>
         <w:t xml:space="preserve">Las solicitudes HTTP se simularon; estas pruebas no crean donantes en la base de datos real. Durante la preparación se corrigió la ausencia de los imports de describe, it, expect, beforeEach y afterEach desde vitest en el archivo de pruebas.</w:t>
@@ -6184,17 +6429,19 @@
         <w:rPr/>
       </w:pPr>
       <w:r>
-        <w:rPr/>
+        <w:rPr>
+          <w:rFonts w:ascii="Calibri" w:hAnsi="Calibri"/>
+        </w:rPr>
         <w:drawing>
           <wp:inline distB="0" distT="0" distL="114300" distR="114300">
             <wp:extent cx="5303520" cy="2783320"/>
             <wp:effectExtent b="0" l="0" r="0" t="0"/>
-            <wp:docPr id="105" name="image14.png"/>
+            <wp:docPr id="151" name="image8.png"/>
             <a:graphic>
               <a:graphicData uri="http://schemas.openxmlformats.org/drawingml/2006/picture">
                 <pic:pic>
                   <pic:nvPicPr>
-                    <pic:cNvPr id="0" name="image14.png"/>
+                    <pic:cNvPr id="0" name="image8.png"/>
                     <pic:cNvPicPr preferRelativeResize="0"/>
                   </pic:nvPicPr>
                   <pic:blipFill>
@@ -6220,6 +6467,7 @@
       </w:r>
       <w:r>
         <w:rPr>
+          <w:rFonts w:ascii="Calibri" w:hAnsi="Calibri"/>
           <w:rtl w:val="0"/>
         </w:rPr>
       </w:r>
@@ -6231,6 +6479,7 @@
       </w:pPr>
       <w:r>
         <w:rPr>
+          <w:rFonts w:ascii="Calibri" w:hAnsi="Calibri"/>
           <w:rtl w:val="0"/>
         </w:rPr>
         <w:t xml:space="preserve">Resultado verificado el 16 de octubre de 2026: las 8 pruebas nuevas de donantes fueron aprobadas. La suite completa finalizó con 45 de 45 pruebas aprobadas en 12 archivos, sin fallos, en 7,93 segundos.</w:t>
@@ -6246,17 +6495,23 @@
       <w:r>
         <w:rPr>
           <w:rFonts w:ascii="Calibri" w:cs="Calibri" w:eastAsia="Calibri" w:hAnsi="Calibri"/>
-          <w:b w:val="1"/>
+          <w:b/>
           <w:bCs w:val="1"/>
-          <w:color w:val="2f5d8c"/>
+          <w:i w:val="0"/>
+          <w:color w:val="2F5D8C"/>
           <w:sz w:val="24"/>
           <w:szCs w:val="24"/>
           <w:rtl w:val="0"/>
         </w:rPr>
-        <w:t xml:space="preserve">S3-HU09 Solicitudes de sangre</w:t>
-      </w:r>
-      <w:r>
-        <w:rPr>
+        <w:t>S3-HU09: Solicitudes de sangre</w:t>
+      </w:r>
+      <w:r>
+        <w:rPr>
+          <w:rFonts w:ascii="Calibri" w:hAnsi="Calibri"/>
+          <w:b/>
+          <w:i w:val="0"/>
+          <w:color w:val="2F5D8C"/>
+          <w:sz w:val="24"/>
           <w:rtl w:val="0"/>
         </w:rPr>
       </w:r>
@@ -6277,6 +6532,7 @@
       </w:r>
       <w:r>
         <w:rPr>
+          <w:rFonts w:ascii="Calibri" w:hAnsi="Calibri"/>
           <w:rtl w:val="0"/>
         </w:rPr>
       </w:r>
@@ -6291,17 +6547,23 @@
       <w:r>
         <w:rPr>
           <w:rFonts w:ascii="Calibri" w:cs="Calibri" w:eastAsia="Calibri" w:hAnsi="Calibri"/>
-          <w:b w:val="1"/>
+          <w:b/>
           <w:bCs w:val="1"/>
-          <w:color w:val="2f5d8c"/>
+          <w:i w:val="0"/>
+          <w:color w:val="2F5D8C"/>
           <w:sz w:val="24"/>
           <w:szCs w:val="24"/>
           <w:rtl w:val="0"/>
         </w:rPr>
-        <w:t xml:space="preserve">S3-HU10 Búsqueda de donantes</w:t>
-      </w:r>
-      <w:r>
-        <w:rPr>
+        <w:t>S3-HU10: Búsqueda de donantes</w:t>
+      </w:r>
+      <w:r>
+        <w:rPr>
+          <w:rFonts w:ascii="Calibri" w:hAnsi="Calibri"/>
+          <w:b/>
+          <w:i w:val="0"/>
+          <w:color w:val="2F5D8C"/>
+          <w:sz w:val="24"/>
           <w:rtl w:val="0"/>
         </w:rPr>
       </w:r>
@@ -6322,6 +6584,7 @@
       </w:r>
       <w:r>
         <w:rPr>
+          <w:rFonts w:ascii="Calibri" w:hAnsi="Calibri"/>
           <w:rtl w:val="0"/>
         </w:rPr>
       </w:r>
@@ -6336,9 +6599,10 @@
       <w:r>
         <w:rPr>
           <w:rFonts w:ascii="Calibri" w:cs="Calibri" w:eastAsia="Calibri" w:hAnsi="Calibri"/>
-          <w:b w:val="1"/>
+          <w:b/>
           <w:bCs w:val="1"/>
-          <w:color w:val="2f5d8c"/>
+          <w:i w:val="0"/>
+          <w:color w:val="2F5D8C"/>
           <w:sz w:val="24"/>
           <w:szCs w:val="24"/>
           <w:rtl w:val="0"/>
@@ -6347,6 +6611,11 @@
       </w:r>
       <w:r>
         <w:rPr>
+          <w:rFonts w:ascii="Calibri" w:hAnsi="Calibri"/>
+          <w:b/>
+          <w:i w:val="0"/>
+          <w:color w:val="2F5D8C"/>
+          <w:sz w:val="24"/>
           <w:rtl w:val="0"/>
         </w:rPr>
       </w:r>
@@ -6367,6 +6636,7 @@
       </w:r>
       <w:r>
         <w:rPr>
+          <w:rFonts w:ascii="Calibri" w:hAnsi="Calibri"/>
           <w:rtl w:val="0"/>
         </w:rPr>
       </w:r>
@@ -6377,17 +6647,19 @@
         <w:rPr/>
       </w:pPr>
       <w:r>
-        <w:rPr/>
+        <w:rPr>
+          <w:rFonts w:ascii="Calibri" w:hAnsi="Calibri"/>
+        </w:rPr>
         <w:drawing>
           <wp:inline distB="0" distT="0" distL="114300" distR="114300">
             <wp:extent cx="5577840" cy="1972651"/>
             <wp:effectExtent b="0" l="0" r="0" t="0"/>
-            <wp:docPr id="107" name="image4.png"/>
+            <wp:docPr id="153" name="image2.png"/>
             <a:graphic>
               <a:graphicData uri="http://schemas.openxmlformats.org/drawingml/2006/picture">
                 <pic:pic>
                   <pic:nvPicPr>
-                    <pic:cNvPr id="0" name="image4.png"/>
+                    <pic:cNvPr id="0" name="image2.png"/>
                     <pic:cNvPicPr preferRelativeResize="0"/>
                   </pic:nvPicPr>
                   <pic:blipFill>
@@ -6413,6 +6685,7 @@
       </w:r>
       <w:r>
         <w:rPr>
+          <w:rFonts w:ascii="Calibri" w:hAnsi="Calibri"/>
           <w:rtl w:val="0"/>
         </w:rPr>
       </w:r>
@@ -6433,6 +6706,7 @@
       </w:r>
       <w:r>
         <w:rPr>
+          <w:rFonts w:ascii="Calibri" w:hAnsi="Calibri"/>
           <w:rtl w:val="0"/>
         </w:rPr>
       </w:r>
@@ -6448,9 +6722,10 @@
       <w:r>
         <w:rPr>
           <w:rFonts w:ascii="Calibri" w:cs="Calibri" w:eastAsia="Calibri" w:hAnsi="Calibri"/>
-          <w:b w:val="1"/>
+          <w:b/>
           <w:bCs w:val="1"/>
-          <w:color w:val="1e3a5f"/>
+          <w:i w:val="0"/>
+          <w:color w:val="1E3A5F"/>
           <w:sz w:val="32"/>
           <w:szCs w:val="32"/>
           <w:rtl w:val="0"/>
@@ -6459,6 +6734,11 @@
       </w:r>
       <w:r>
         <w:rPr>
+          <w:rFonts w:ascii="Calibri" w:hAnsi="Calibri"/>
+          <w:b/>
+          <w:i w:val="0"/>
+          <w:color w:val="1E3A5F"/>
+          <w:sz w:val="32"/>
           <w:rtl w:val="0"/>
         </w:rPr>
       </w:r>
@@ -6473,10 +6753,11 @@
       <w:r>
         <w:rPr>
           <w:rFonts w:ascii="Calibri" w:cs="Calibri" w:eastAsia="Calibri" w:hAnsi="Calibri"/>
-          <w:b w:val="1"/>
+          <w:b/>
           <w:bCs w:val="1"/>
-          <w:color w:val="1e3a5f"/>
-          <w:sz w:val="27"/>
+          <w:i w:val="0"/>
+          <w:color w:val="2F5D8C"/>
+          <w:sz w:val="24"/>
           <w:szCs w:val="27"/>
           <w:rtl w:val="0"/>
         </w:rPr>
@@ -6484,6 +6765,11 @@
       </w:r>
       <w:r>
         <w:rPr>
+          <w:rFonts w:ascii="Calibri" w:hAnsi="Calibri"/>
+          <w:b/>
+          <w:i w:val="0"/>
+          <w:color w:val="2F5D8C"/>
+          <w:sz w:val="24"/>
           <w:rtl w:val="0"/>
         </w:rPr>
       </w:r>
@@ -6504,6 +6790,7 @@
       </w:r>
       <w:r>
         <w:rPr>
+          <w:rFonts w:ascii="Calibri" w:hAnsi="Calibri"/>
           <w:rtl w:val="0"/>
         </w:rPr>
       </w:r>
@@ -6552,6 +6839,7 @@
       </w:r>
       <w:r>
         <w:rPr>
+          <w:rFonts w:ascii="Calibri" w:hAnsi="Calibri"/>
           <w:rtl w:val="0"/>
         </w:rPr>
       </w:r>
@@ -6600,6 +6888,7 @@
       </w:r>
       <w:r>
         <w:rPr>
+          <w:rFonts w:ascii="Calibri" w:hAnsi="Calibri"/>
           <w:rtl w:val="0"/>
         </w:rPr>
       </w:r>
@@ -6648,6 +6937,7 @@
       </w:r>
       <w:r>
         <w:rPr>
+          <w:rFonts w:ascii="Calibri" w:hAnsi="Calibri"/>
           <w:rtl w:val="0"/>
         </w:rPr>
       </w:r>
@@ -6696,6 +6986,7 @@
       </w:r>
       <w:r>
         <w:rPr>
+          <w:rFonts w:ascii="Calibri" w:hAnsi="Calibri"/>
           <w:rtl w:val="0"/>
         </w:rPr>
       </w:r>
@@ -7728,9 +8019,10 @@
       <w:r>
         <w:rPr>
           <w:rFonts w:ascii="Calibri" w:cs="Calibri" w:eastAsia="Calibri" w:hAnsi="Calibri"/>
-          <w:b w:val="1"/>
+          <w:b/>
           <w:bCs w:val="1"/>
-          <w:color w:val="2f5d8c"/>
+          <w:i w:val="0"/>
+          <w:color w:val="2F5D8C"/>
           <w:sz w:val="24"/>
           <w:szCs w:val="24"/>
           <w:rtl w:val="0"/>
@@ -7739,6 +8031,11 @@
       </w:r>
       <w:r>
         <w:rPr>
+          <w:rFonts w:ascii="Calibri" w:hAnsi="Calibri"/>
+          <w:b/>
+          <w:i w:val="0"/>
+          <w:color w:val="2F5D8C"/>
+          <w:sz w:val="24"/>
           <w:rtl w:val="0"/>
         </w:rPr>
       </w:r>
@@ -7763,6 +8060,7 @@
       </w:r>
       <w:r>
         <w:rPr>
+          <w:rFonts w:ascii="Calibri" w:hAnsi="Calibri"/>
           <w:rtl w:val="0"/>
         </w:rPr>
       </w:r>
@@ -7778,7 +8076,7 @@
       </w:pPr>
       <w:r>
         <w:rPr>
-          <w:rFonts w:ascii="Consolas" w:cs="Consolas" w:eastAsia="Consolas" w:hAnsi="Consolas"/>
+          <w:rFonts w:ascii="Calibri" w:cs="Consolas" w:eastAsia="Consolas" w:hAnsi="Calibri"/>
           <w:sz w:val="20"/>
           <w:szCs w:val="20"/>
           <w:rtl w:val="0"/>
@@ -7787,6 +8085,7 @@
       </w:r>
       <w:r>
         <w:rPr>
+          <w:rFonts w:ascii="Calibri" w:hAnsi="Calibri"/>
           <w:rtl w:val="0"/>
         </w:rPr>
       </w:r>
@@ -7802,7 +8101,7 @@
       </w:pPr>
       <w:r>
         <w:rPr>
-          <w:rFonts w:ascii="Consolas" w:cs="Consolas" w:eastAsia="Consolas" w:hAnsi="Consolas"/>
+          <w:rFonts w:ascii="Calibri" w:cs="Consolas" w:eastAsia="Consolas" w:hAnsi="Calibri"/>
           <w:sz w:val="20"/>
           <w:szCs w:val="20"/>
           <w:rtl w:val="0"/>
@@ -7811,6 +8110,7 @@
       </w:r>
       <w:r>
         <w:rPr>
+          <w:rFonts w:ascii="Calibri" w:hAnsi="Calibri"/>
           <w:rtl w:val="0"/>
         </w:rPr>
       </w:r>
@@ -7826,7 +8126,7 @@
       </w:pPr>
       <w:r>
         <w:rPr>
-          <w:rFonts w:ascii="Consolas" w:cs="Consolas" w:eastAsia="Consolas" w:hAnsi="Consolas"/>
+          <w:rFonts w:ascii="Calibri" w:cs="Consolas" w:eastAsia="Consolas" w:hAnsi="Calibri"/>
           <w:sz w:val="20"/>
           <w:szCs w:val="20"/>
           <w:rtl w:val="0"/>
@@ -7835,6 +8135,7 @@
       </w:r>
       <w:r>
         <w:rPr>
+          <w:rFonts w:ascii="Calibri" w:hAnsi="Calibri"/>
           <w:rtl w:val="0"/>
         </w:rPr>
       </w:r>
@@ -7859,6 +8160,7 @@
       </w:r>
       <w:r>
         <w:rPr>
+          <w:rFonts w:ascii="Calibri" w:hAnsi="Calibri"/>
           <w:rtl w:val="0"/>
         </w:rPr>
       </w:r>
@@ -7870,17 +8172,19 @@
         <w:rPr/>
       </w:pPr>
       <w:r>
-        <w:rPr/>
+        <w:rPr>
+          <w:rFonts w:ascii="Calibri" w:hAnsi="Calibri"/>
+        </w:rPr>
         <w:drawing>
           <wp:inline distB="0" distT="0" distL="0" distR="0">
             <wp:extent cx="4762500" cy="1638300"/>
             <wp:effectExtent b="0" l="0" r="0" t="0"/>
-            <wp:docPr descr="Pantallazo de la ejecución de pruebas" id="109" name="image12.png"/>
+            <wp:docPr descr="Pantallazo de la ejecución de pruebas" id="155" name="image19.png"/>
             <a:graphic>
               <a:graphicData uri="http://schemas.openxmlformats.org/drawingml/2006/picture">
                 <pic:pic>
                   <pic:nvPicPr>
-                    <pic:cNvPr descr="Pantallazo de la ejecución de pruebas" id="0" name="image12.png"/>
+                    <pic:cNvPr descr="Pantallazo de la ejecución de pruebas" id="0" name="image19.png"/>
                     <pic:cNvPicPr preferRelativeResize="0"/>
                   </pic:nvPicPr>
                   <pic:blipFill>
@@ -7906,6 +8210,7 @@
       </w:r>
       <w:r>
         <w:rPr>
+          <w:rFonts w:ascii="Calibri" w:hAnsi="Calibri"/>
           <w:rtl w:val="0"/>
         </w:rPr>
       </w:r>
@@ -7928,6 +8233,7 @@
       </w:r>
       <w:r>
         <w:rPr>
+          <w:rFonts w:ascii="Calibri" w:hAnsi="Calibri"/>
           <w:rtl w:val="0"/>
         </w:rPr>
       </w:r>
@@ -7942,9 +8248,10 @@
       <w:r>
         <w:rPr>
           <w:rFonts w:ascii="Calibri" w:cs="Calibri" w:eastAsia="Calibri" w:hAnsi="Calibri"/>
-          <w:b w:val="1"/>
+          <w:b/>
           <w:bCs w:val="1"/>
-          <w:color w:val="2f5d8c"/>
+          <w:i w:val="0"/>
+          <w:color w:val="2F5D8C"/>
           <w:sz w:val="24"/>
           <w:szCs w:val="24"/>
           <w:rtl w:val="0"/>
@@ -7953,6 +8260,11 @@
       </w:r>
       <w:r>
         <w:rPr>
+          <w:rFonts w:ascii="Calibri" w:hAnsi="Calibri"/>
+          <w:b/>
+          <w:i w:val="0"/>
+          <w:color w:val="2F5D8C"/>
+          <w:sz w:val="24"/>
           <w:rtl w:val="0"/>
         </w:rPr>
       </w:r>
@@ -7977,6 +8289,7 @@
       </w:r>
       <w:r>
         <w:rPr>
+          <w:rFonts w:ascii="Calibri" w:hAnsi="Calibri"/>
           <w:rtl w:val="0"/>
         </w:rPr>
       </w:r>
@@ -7992,7 +8305,7 @@
       </w:pPr>
       <w:r>
         <w:rPr>
-          <w:rFonts w:ascii="Consolas" w:cs="Consolas" w:eastAsia="Consolas" w:hAnsi="Consolas"/>
+          <w:rFonts w:ascii="Calibri" w:cs="Consolas" w:eastAsia="Consolas" w:hAnsi="Calibri"/>
           <w:sz w:val="20"/>
           <w:szCs w:val="20"/>
           <w:rtl w:val="0"/>
@@ -8001,6 +8314,7 @@
       </w:r>
       <w:r>
         <w:rPr>
+          <w:rFonts w:ascii="Calibri" w:hAnsi="Calibri"/>
           <w:rtl w:val="0"/>
         </w:rPr>
       </w:r>
@@ -8016,7 +8330,7 @@
       </w:pPr>
       <w:r>
         <w:rPr>
-          <w:rFonts w:ascii="Consolas" w:cs="Consolas" w:eastAsia="Consolas" w:hAnsi="Consolas"/>
+          <w:rFonts w:ascii="Calibri" w:cs="Consolas" w:eastAsia="Consolas" w:hAnsi="Calibri"/>
           <w:sz w:val="20"/>
           <w:szCs w:val="20"/>
           <w:rtl w:val="0"/>
@@ -8025,6 +8339,7 @@
       </w:r>
       <w:r>
         <w:rPr>
+          <w:rFonts w:ascii="Calibri" w:hAnsi="Calibri"/>
           <w:rtl w:val="0"/>
         </w:rPr>
       </w:r>
@@ -8040,7 +8355,7 @@
       </w:pPr>
       <w:r>
         <w:rPr>
-          <w:rFonts w:ascii="Consolas" w:cs="Consolas" w:eastAsia="Consolas" w:hAnsi="Consolas"/>
+          <w:rFonts w:ascii="Calibri" w:cs="Consolas" w:eastAsia="Consolas" w:hAnsi="Calibri"/>
           <w:sz w:val="20"/>
           <w:szCs w:val="20"/>
           <w:rtl w:val="0"/>
@@ -8049,6 +8364,7 @@
       </w:r>
       <w:r>
         <w:rPr>
+          <w:rFonts w:ascii="Calibri" w:hAnsi="Calibri"/>
           <w:rtl w:val="0"/>
         </w:rPr>
       </w:r>
@@ -8064,7 +8380,7 @@
       </w:pPr>
       <w:r>
         <w:rPr>
-          <w:rFonts w:ascii="Consolas" w:cs="Consolas" w:eastAsia="Consolas" w:hAnsi="Consolas"/>
+          <w:rFonts w:ascii="Calibri" w:cs="Consolas" w:eastAsia="Consolas" w:hAnsi="Calibri"/>
           <w:sz w:val="20"/>
           <w:szCs w:val="20"/>
           <w:rtl w:val="0"/>
@@ -8073,6 +8389,7 @@
       </w:r>
       <w:r>
         <w:rPr>
+          <w:rFonts w:ascii="Calibri" w:hAnsi="Calibri"/>
           <w:rtl w:val="0"/>
         </w:rPr>
       </w:r>
@@ -8088,7 +8405,7 @@
       </w:pPr>
       <w:r>
         <w:rPr>
-          <w:rFonts w:ascii="Consolas" w:cs="Consolas" w:eastAsia="Consolas" w:hAnsi="Consolas"/>
+          <w:rFonts w:ascii="Calibri" w:cs="Consolas" w:eastAsia="Consolas" w:hAnsi="Calibri"/>
           <w:sz w:val="20"/>
           <w:szCs w:val="20"/>
           <w:rtl w:val="0"/>
@@ -8097,6 +8414,7 @@
       </w:r>
       <w:r>
         <w:rPr>
+          <w:rFonts w:ascii="Calibri" w:hAnsi="Calibri"/>
           <w:rtl w:val="0"/>
         </w:rPr>
       </w:r>
@@ -8121,6 +8439,7 @@
       </w:r>
       <w:r>
         <w:rPr>
+          <w:rFonts w:ascii="Calibri" w:hAnsi="Calibri"/>
           <w:rtl w:val="0"/>
         </w:rPr>
       </w:r>
@@ -8132,17 +8451,19 @@
         <w:rPr/>
       </w:pPr>
       <w:r>
-        <w:rPr/>
+        <w:rPr>
+          <w:rFonts w:ascii="Calibri" w:hAnsi="Calibri"/>
+        </w:rPr>
         <w:drawing>
           <wp:inline distB="0" distT="0" distL="0" distR="0">
             <wp:extent cx="4762500" cy="1809750"/>
             <wp:effectExtent b="0" l="0" r="0" t="0"/>
-            <wp:docPr descr="Pantallazo de la ejecución de pruebas" id="110" name="image18.png"/>
+            <wp:docPr descr="Pantallazo de la ejecución de pruebas" id="156" name="image15.png"/>
             <a:graphic>
               <a:graphicData uri="http://schemas.openxmlformats.org/drawingml/2006/picture">
                 <pic:pic>
                   <pic:nvPicPr>
-                    <pic:cNvPr descr="Pantallazo de la ejecución de pruebas" id="0" name="image18.png"/>
+                    <pic:cNvPr descr="Pantallazo de la ejecución de pruebas" id="0" name="image15.png"/>
                     <pic:cNvPicPr preferRelativeResize="0"/>
                   </pic:nvPicPr>
                   <pic:blipFill>
@@ -8168,6 +8489,7 @@
       </w:r>
       <w:r>
         <w:rPr>
+          <w:rFonts w:ascii="Calibri" w:hAnsi="Calibri"/>
           <w:rtl w:val="0"/>
         </w:rPr>
       </w:r>
@@ -8190,6 +8512,7 @@
       </w:r>
       <w:r>
         <w:rPr>
+          <w:rFonts w:ascii="Calibri" w:hAnsi="Calibri"/>
           <w:rtl w:val="0"/>
         </w:rPr>
       </w:r>
@@ -8204,9 +8527,10 @@
       <w:r>
         <w:rPr>
           <w:rFonts w:ascii="Calibri" w:cs="Calibri" w:eastAsia="Calibri" w:hAnsi="Calibri"/>
-          <w:b w:val="1"/>
+          <w:b/>
           <w:bCs w:val="1"/>
-          <w:color w:val="2f5d8c"/>
+          <w:i w:val="0"/>
+          <w:color w:val="2F5D8C"/>
           <w:sz w:val="24"/>
           <w:szCs w:val="24"/>
           <w:rtl w:val="0"/>
@@ -8215,6 +8539,11 @@
       </w:r>
       <w:r>
         <w:rPr>
+          <w:rFonts w:ascii="Calibri" w:hAnsi="Calibri"/>
+          <w:b/>
+          <w:i w:val="0"/>
+          <w:color w:val="2F5D8C"/>
+          <w:sz w:val="24"/>
           <w:rtl w:val="0"/>
         </w:rPr>
       </w:r>
@@ -8239,6 +8568,7 @@
       </w:r>
       <w:r>
         <w:rPr>
+          <w:rFonts w:ascii="Calibri" w:hAnsi="Calibri"/>
           <w:rtl w:val="0"/>
         </w:rPr>
       </w:r>
@@ -8254,7 +8584,7 @@
       </w:pPr>
       <w:r>
         <w:rPr>
-          <w:rFonts w:ascii="Consolas" w:cs="Consolas" w:eastAsia="Consolas" w:hAnsi="Consolas"/>
+          <w:rFonts w:ascii="Calibri" w:cs="Consolas" w:eastAsia="Consolas" w:hAnsi="Calibri"/>
           <w:sz w:val="20"/>
           <w:szCs w:val="20"/>
           <w:rtl w:val="0"/>
@@ -8263,6 +8593,7 @@
       </w:r>
       <w:r>
         <w:rPr>
+          <w:rFonts w:ascii="Calibri" w:hAnsi="Calibri"/>
           <w:rtl w:val="0"/>
         </w:rPr>
       </w:r>
@@ -8278,7 +8609,7 @@
       </w:pPr>
       <w:r>
         <w:rPr>
-          <w:rFonts w:ascii="Consolas" w:cs="Consolas" w:eastAsia="Consolas" w:hAnsi="Consolas"/>
+          <w:rFonts w:ascii="Calibri" w:cs="Consolas" w:eastAsia="Consolas" w:hAnsi="Calibri"/>
           <w:sz w:val="20"/>
           <w:szCs w:val="20"/>
           <w:rtl w:val="0"/>
@@ -8287,6 +8618,7 @@
       </w:r>
       <w:r>
         <w:rPr>
+          <w:rFonts w:ascii="Calibri" w:hAnsi="Calibri"/>
           <w:rtl w:val="0"/>
         </w:rPr>
       </w:r>
@@ -8302,7 +8634,7 @@
       </w:pPr>
       <w:r>
         <w:rPr>
-          <w:rFonts w:ascii="Consolas" w:cs="Consolas" w:eastAsia="Consolas" w:hAnsi="Consolas"/>
+          <w:rFonts w:ascii="Calibri" w:cs="Consolas" w:eastAsia="Consolas" w:hAnsi="Calibri"/>
           <w:sz w:val="20"/>
           <w:szCs w:val="20"/>
           <w:rtl w:val="0"/>
@@ -8311,6 +8643,7 @@
       </w:r>
       <w:r>
         <w:rPr>
+          <w:rFonts w:ascii="Calibri" w:hAnsi="Calibri"/>
           <w:rtl w:val="0"/>
         </w:rPr>
       </w:r>
@@ -8326,7 +8659,7 @@
       </w:pPr>
       <w:r>
         <w:rPr>
-          <w:rFonts w:ascii="Consolas" w:cs="Consolas" w:eastAsia="Consolas" w:hAnsi="Consolas"/>
+          <w:rFonts w:ascii="Calibri" w:cs="Consolas" w:eastAsia="Consolas" w:hAnsi="Calibri"/>
           <w:sz w:val="20"/>
           <w:szCs w:val="20"/>
           <w:rtl w:val="0"/>
@@ -8335,6 +8668,7 @@
       </w:r>
       <w:r>
         <w:rPr>
+          <w:rFonts w:ascii="Calibri" w:hAnsi="Calibri"/>
           <w:rtl w:val="0"/>
         </w:rPr>
       </w:r>
@@ -8350,7 +8684,7 @@
       </w:pPr>
       <w:r>
         <w:rPr>
-          <w:rFonts w:ascii="Consolas" w:cs="Consolas" w:eastAsia="Consolas" w:hAnsi="Consolas"/>
+          <w:rFonts w:ascii="Calibri" w:cs="Consolas" w:eastAsia="Consolas" w:hAnsi="Calibri"/>
           <w:sz w:val="20"/>
           <w:szCs w:val="20"/>
           <w:rtl w:val="0"/>
@@ -8359,6 +8693,7 @@
       </w:r>
       <w:r>
         <w:rPr>
+          <w:rFonts w:ascii="Calibri" w:hAnsi="Calibri"/>
           <w:rtl w:val="0"/>
         </w:rPr>
       </w:r>
@@ -8383,6 +8718,7 @@
       </w:r>
       <w:r>
         <w:rPr>
+          <w:rFonts w:ascii="Calibri" w:hAnsi="Calibri"/>
           <w:rtl w:val="0"/>
         </w:rPr>
       </w:r>
@@ -8394,17 +8730,19 @@
         <w:rPr/>
       </w:pPr>
       <w:r>
-        <w:rPr/>
+        <w:rPr>
+          <w:rFonts w:ascii="Calibri" w:hAnsi="Calibri"/>
+        </w:rPr>
         <w:drawing>
           <wp:inline distB="0" distT="0" distL="0" distR="0">
             <wp:extent cx="3810000" cy="1438275"/>
             <wp:effectExtent b="0" l="0" r="0" t="0"/>
-            <wp:docPr descr="Pantallazo de la ejecución de pruebas" id="111" name="image11.png"/>
+            <wp:docPr descr="Pantallazo de la ejecución de pruebas" id="157" name="image4.png"/>
             <a:graphic>
               <a:graphicData uri="http://schemas.openxmlformats.org/drawingml/2006/picture">
                 <pic:pic>
                   <pic:nvPicPr>
-                    <pic:cNvPr descr="Pantallazo de la ejecución de pruebas" id="0" name="image11.png"/>
+                    <pic:cNvPr descr="Pantallazo de la ejecución de pruebas" id="0" name="image4.png"/>
                     <pic:cNvPicPr preferRelativeResize="0"/>
                   </pic:nvPicPr>
                   <pic:blipFill>
@@ -8430,6 +8768,7 @@
       </w:r>
       <w:r>
         <w:rPr>
+          <w:rFonts w:ascii="Calibri" w:hAnsi="Calibri"/>
           <w:rtl w:val="0"/>
         </w:rPr>
       </w:r>
@@ -8452,6 +8791,7 @@
       </w:r>
       <w:r>
         <w:rPr>
+          <w:rFonts w:ascii="Calibri" w:hAnsi="Calibri"/>
           <w:rtl w:val="0"/>
         </w:rPr>
       </w:r>
@@ -8466,9 +8806,10 @@
       <w:r>
         <w:rPr>
           <w:rFonts w:ascii="Calibri" w:cs="Calibri" w:eastAsia="Calibri" w:hAnsi="Calibri"/>
-          <w:b w:val="1"/>
+          <w:b/>
           <w:bCs w:val="1"/>
-          <w:color w:val="2f5d8c"/>
+          <w:i w:val="0"/>
+          <w:color w:val="2F5D8C"/>
           <w:sz w:val="24"/>
           <w:szCs w:val="24"/>
           <w:rtl w:val="0"/>
@@ -8477,6 +8818,11 @@
       </w:r>
       <w:r>
         <w:rPr>
+          <w:rFonts w:ascii="Calibri" w:hAnsi="Calibri"/>
+          <w:b/>
+          <w:i w:val="0"/>
+          <w:color w:val="2F5D8C"/>
+          <w:sz w:val="24"/>
           <w:rtl w:val="0"/>
         </w:rPr>
       </w:r>
@@ -8501,6 +8847,7 @@
       </w:r>
       <w:r>
         <w:rPr>
+          <w:rFonts w:ascii="Calibri" w:hAnsi="Calibri"/>
           <w:rtl w:val="0"/>
         </w:rPr>
       </w:r>
@@ -8516,7 +8863,7 @@
       </w:pPr>
       <w:r>
         <w:rPr>
-          <w:rFonts w:ascii="Consolas" w:cs="Consolas" w:eastAsia="Consolas" w:hAnsi="Consolas"/>
+          <w:rFonts w:ascii="Calibri" w:cs="Consolas" w:eastAsia="Consolas" w:hAnsi="Calibri"/>
           <w:sz w:val="20"/>
           <w:szCs w:val="20"/>
           <w:rtl w:val="0"/>
@@ -8525,6 +8872,7 @@
       </w:r>
       <w:r>
         <w:rPr>
+          <w:rFonts w:ascii="Calibri" w:hAnsi="Calibri"/>
           <w:rtl w:val="0"/>
         </w:rPr>
       </w:r>
@@ -8540,7 +8888,7 @@
       </w:pPr>
       <w:r>
         <w:rPr>
-          <w:rFonts w:ascii="Consolas" w:cs="Consolas" w:eastAsia="Consolas" w:hAnsi="Consolas"/>
+          <w:rFonts w:ascii="Calibri" w:cs="Consolas" w:eastAsia="Consolas" w:hAnsi="Calibri"/>
           <w:sz w:val="20"/>
           <w:szCs w:val="20"/>
           <w:rtl w:val="0"/>
@@ -8549,6 +8897,7 @@
       </w:r>
       <w:r>
         <w:rPr>
+          <w:rFonts w:ascii="Calibri" w:hAnsi="Calibri"/>
           <w:rtl w:val="0"/>
         </w:rPr>
       </w:r>
@@ -8564,7 +8913,7 @@
       </w:pPr>
       <w:r>
         <w:rPr>
-          <w:rFonts w:ascii="Consolas" w:cs="Consolas" w:eastAsia="Consolas" w:hAnsi="Consolas"/>
+          <w:rFonts w:ascii="Calibri" w:cs="Consolas" w:eastAsia="Consolas" w:hAnsi="Calibri"/>
           <w:sz w:val="20"/>
           <w:szCs w:val="20"/>
           <w:rtl w:val="0"/>
@@ -8573,6 +8922,7 @@
       </w:r>
       <w:r>
         <w:rPr>
+          <w:rFonts w:ascii="Calibri" w:hAnsi="Calibri"/>
           <w:rtl w:val="0"/>
         </w:rPr>
       </w:r>
@@ -8588,7 +8938,7 @@
       </w:pPr>
       <w:r>
         <w:rPr>
-          <w:rFonts w:ascii="Consolas" w:cs="Consolas" w:eastAsia="Consolas" w:hAnsi="Consolas"/>
+          <w:rFonts w:ascii="Calibri" w:cs="Consolas" w:eastAsia="Consolas" w:hAnsi="Calibri"/>
           <w:sz w:val="20"/>
           <w:szCs w:val="20"/>
           <w:rtl w:val="0"/>
@@ -8597,6 +8947,7 @@
       </w:r>
       <w:r>
         <w:rPr>
+          <w:rFonts w:ascii="Calibri" w:hAnsi="Calibri"/>
           <w:rtl w:val="0"/>
         </w:rPr>
       </w:r>
@@ -8621,6 +8972,7 @@
       </w:r>
       <w:r>
         <w:rPr>
+          <w:rFonts w:ascii="Calibri" w:hAnsi="Calibri"/>
           <w:rtl w:val="0"/>
         </w:rPr>
       </w:r>
@@ -8632,17 +8984,19 @@
         <w:rPr/>
       </w:pPr>
       <w:r>
-        <w:rPr/>
+        <w:rPr>
+          <w:rFonts w:ascii="Calibri" w:hAnsi="Calibri"/>
+        </w:rPr>
         <w:drawing>
           <wp:inline distB="0" distT="0" distL="0" distR="0">
             <wp:extent cx="4762500" cy="1819275"/>
             <wp:effectExtent b="0" l="0" r="0" t="0"/>
-            <wp:docPr descr="Pantallazo de la ejecución de pruebas" id="112" name="image19.png"/>
+            <wp:docPr descr="Pantallazo de la ejecución de pruebas" id="158" name="image11.png"/>
             <a:graphic>
               <a:graphicData uri="http://schemas.openxmlformats.org/drawingml/2006/picture">
                 <pic:pic>
                   <pic:nvPicPr>
-                    <pic:cNvPr descr="Pantallazo de la ejecución de pruebas" id="0" name="image19.png"/>
+                    <pic:cNvPr descr="Pantallazo de la ejecución de pruebas" id="0" name="image11.png"/>
                     <pic:cNvPicPr preferRelativeResize="0"/>
                   </pic:nvPicPr>
                   <pic:blipFill>
@@ -8668,6 +9022,7 @@
       </w:r>
       <w:r>
         <w:rPr>
+          <w:rFonts w:ascii="Calibri" w:hAnsi="Calibri"/>
           <w:rtl w:val="0"/>
         </w:rPr>
       </w:r>
@@ -8690,6 +9045,7 @@
       </w:r>
       <w:r>
         <w:rPr>
+          <w:rFonts w:ascii="Calibri" w:hAnsi="Calibri"/>
           <w:rtl w:val="0"/>
         </w:rPr>
       </w:r>
@@ -8704,10 +9060,11 @@
       <w:r>
         <w:rPr>
           <w:rFonts w:ascii="Calibri" w:cs="Calibri" w:eastAsia="Calibri" w:hAnsi="Calibri"/>
-          <w:b w:val="1"/>
+          <w:b/>
           <w:bCs w:val="1"/>
-          <w:color w:val="1e3a5f"/>
-          <w:sz w:val="27"/>
+          <w:i w:val="0"/>
+          <w:color w:val="2F5D8C"/>
+          <w:sz w:val="24"/>
           <w:szCs w:val="27"/>
           <w:rtl w:val="0"/>
         </w:rPr>
@@ -8715,6 +9072,11 @@
       </w:r>
       <w:r>
         <w:rPr>
+          <w:rFonts w:ascii="Calibri" w:hAnsi="Calibri"/>
+          <w:b/>
+          <w:i w:val="0"/>
+          <w:color w:val="2F5D8C"/>
+          <w:sz w:val="24"/>
           <w:rtl w:val="0"/>
         </w:rPr>
       </w:r>
@@ -8735,6 +9097,7 @@
       </w:r>
       <w:r>
         <w:rPr>
+          <w:rFonts w:ascii="Calibri" w:hAnsi="Calibri"/>
           <w:rtl w:val="0"/>
         </w:rPr>
       </w:r>
@@ -8783,6 +9146,7 @@
       </w:r>
       <w:r>
         <w:rPr>
+          <w:rFonts w:ascii="Calibri" w:hAnsi="Calibri"/>
           <w:rtl w:val="0"/>
         </w:rPr>
       </w:r>
@@ -8831,6 +9195,7 @@
       </w:r>
       <w:r>
         <w:rPr>
+          <w:rFonts w:ascii="Calibri" w:hAnsi="Calibri"/>
           <w:rtl w:val="0"/>
         </w:rPr>
       </w:r>
@@ -8879,6 +9244,7 @@
       </w:r>
       <w:r>
         <w:rPr>
+          <w:rFonts w:ascii="Calibri" w:hAnsi="Calibri"/>
           <w:rtl w:val="0"/>
         </w:rPr>
       </w:r>
@@ -10303,9 +10669,10 @@
       <w:r>
         <w:rPr>
           <w:rFonts w:ascii="Calibri" w:cs="Calibri" w:eastAsia="Calibri" w:hAnsi="Calibri"/>
-          <w:b w:val="1"/>
+          <w:b/>
           <w:bCs w:val="1"/>
-          <w:color w:val="2f5d8c"/>
+          <w:i w:val="0"/>
+          <w:color w:val="2F5D8C"/>
           <w:sz w:val="24"/>
           <w:szCs w:val="24"/>
           <w:rtl w:val="0"/>
@@ -10314,6 +10681,11 @@
       </w:r>
       <w:r>
         <w:rPr>
+          <w:rFonts w:ascii="Calibri" w:hAnsi="Calibri"/>
+          <w:b/>
+          <w:i w:val="0"/>
+          <w:color w:val="2F5D8C"/>
+          <w:sz w:val="24"/>
           <w:rtl w:val="0"/>
         </w:rPr>
       </w:r>
@@ -10338,6 +10710,7 @@
       </w:r>
       <w:r>
         <w:rPr>
+          <w:rFonts w:ascii="Calibri" w:hAnsi="Calibri"/>
           <w:rtl w:val="0"/>
         </w:rPr>
       </w:r>
@@ -10353,7 +10726,7 @@
       </w:pPr>
       <w:r>
         <w:rPr>
-          <w:rFonts w:ascii="Consolas" w:cs="Consolas" w:eastAsia="Consolas" w:hAnsi="Consolas"/>
+          <w:rFonts w:ascii="Calibri" w:cs="Consolas" w:eastAsia="Consolas" w:hAnsi="Calibri"/>
           <w:sz w:val="20"/>
           <w:szCs w:val="20"/>
           <w:rtl w:val="0"/>
@@ -10362,6 +10735,7 @@
       </w:r>
       <w:r>
         <w:rPr>
+          <w:rFonts w:ascii="Calibri" w:hAnsi="Calibri"/>
           <w:rtl w:val="0"/>
         </w:rPr>
       </w:r>
@@ -10377,7 +10751,7 @@
       </w:pPr>
       <w:r>
         <w:rPr>
-          <w:rFonts w:ascii="Consolas" w:cs="Consolas" w:eastAsia="Consolas" w:hAnsi="Consolas"/>
+          <w:rFonts w:ascii="Calibri" w:cs="Consolas" w:eastAsia="Consolas" w:hAnsi="Calibri"/>
           <w:sz w:val="20"/>
           <w:szCs w:val="20"/>
           <w:rtl w:val="0"/>
@@ -10386,6 +10760,7 @@
       </w:r>
       <w:r>
         <w:rPr>
+          <w:rFonts w:ascii="Calibri" w:hAnsi="Calibri"/>
           <w:rtl w:val="0"/>
         </w:rPr>
       </w:r>
@@ -10401,7 +10776,7 @@
       </w:pPr>
       <w:r>
         <w:rPr>
-          <w:rFonts w:ascii="Consolas" w:cs="Consolas" w:eastAsia="Consolas" w:hAnsi="Consolas"/>
+          <w:rFonts w:ascii="Calibri" w:cs="Consolas" w:eastAsia="Consolas" w:hAnsi="Calibri"/>
           <w:sz w:val="20"/>
           <w:szCs w:val="20"/>
           <w:rtl w:val="0"/>
@@ -10410,6 +10785,7 @@
       </w:r>
       <w:r>
         <w:rPr>
+          <w:rFonts w:ascii="Calibri" w:hAnsi="Calibri"/>
           <w:rtl w:val="0"/>
         </w:rPr>
       </w:r>
@@ -10425,7 +10801,7 @@
       </w:pPr>
       <w:r>
         <w:rPr>
-          <w:rFonts w:ascii="Consolas" w:cs="Consolas" w:eastAsia="Consolas" w:hAnsi="Consolas"/>
+          <w:rFonts w:ascii="Calibri" w:cs="Consolas" w:eastAsia="Consolas" w:hAnsi="Calibri"/>
           <w:sz w:val="20"/>
           <w:szCs w:val="20"/>
           <w:rtl w:val="0"/>
@@ -10434,6 +10810,7 @@
       </w:r>
       <w:r>
         <w:rPr>
+          <w:rFonts w:ascii="Calibri" w:hAnsi="Calibri"/>
           <w:rtl w:val="0"/>
         </w:rPr>
       </w:r>
@@ -10449,7 +10826,7 @@
       </w:pPr>
       <w:r>
         <w:rPr>
-          <w:rFonts w:ascii="Consolas" w:cs="Consolas" w:eastAsia="Consolas" w:hAnsi="Consolas"/>
+          <w:rFonts w:ascii="Calibri" w:cs="Consolas" w:eastAsia="Consolas" w:hAnsi="Calibri"/>
           <w:sz w:val="20"/>
           <w:szCs w:val="20"/>
           <w:rtl w:val="0"/>
@@ -10458,6 +10835,7 @@
       </w:r>
       <w:r>
         <w:rPr>
+          <w:rFonts w:ascii="Calibri" w:hAnsi="Calibri"/>
           <w:rtl w:val="0"/>
         </w:rPr>
       </w:r>
@@ -10482,6 +10860,7 @@
       </w:r>
       <w:r>
         <w:rPr>
+          <w:rFonts w:ascii="Calibri" w:hAnsi="Calibri"/>
           <w:rtl w:val="0"/>
         </w:rPr>
       </w:r>
@@ -10493,17 +10872,19 @@
         <w:rPr/>
       </w:pPr>
       <w:r>
-        <w:rPr/>
+        <w:rPr>
+          <w:rFonts w:ascii="Calibri" w:hAnsi="Calibri"/>
+        </w:rPr>
         <w:drawing>
           <wp:inline distB="0" distT="0" distL="0" distR="0">
             <wp:extent cx="4191000" cy="2133600"/>
             <wp:effectExtent b="0" l="0" r="0" t="0"/>
-            <wp:docPr descr="Pantallazo de la ejecución de pruebas" id="113" name="image15.png"/>
+            <wp:docPr descr="Pantallazo de la ejecución de pruebas" id="159" name="image12.png"/>
             <a:graphic>
               <a:graphicData uri="http://schemas.openxmlformats.org/drawingml/2006/picture">
                 <pic:pic>
                   <pic:nvPicPr>
-                    <pic:cNvPr descr="Pantallazo de la ejecución de pruebas" id="0" name="image15.png"/>
+                    <pic:cNvPr descr="Pantallazo de la ejecución de pruebas" id="0" name="image12.png"/>
                     <pic:cNvPicPr preferRelativeResize="0"/>
                   </pic:nvPicPr>
                   <pic:blipFill>
@@ -10529,6 +10910,7 @@
       </w:r>
       <w:r>
         <w:rPr>
+          <w:rFonts w:ascii="Calibri" w:hAnsi="Calibri"/>
           <w:rtl w:val="0"/>
         </w:rPr>
       </w:r>
@@ -10551,6 +10933,7 @@
       </w:r>
       <w:r>
         <w:rPr>
+          <w:rFonts w:ascii="Calibri" w:hAnsi="Calibri"/>
           <w:rtl w:val="0"/>
         </w:rPr>
       </w:r>
@@ -10565,9 +10948,10 @@
       <w:r>
         <w:rPr>
           <w:rFonts w:ascii="Calibri" w:cs="Calibri" w:eastAsia="Calibri" w:hAnsi="Calibri"/>
-          <w:b w:val="1"/>
+          <w:b/>
           <w:bCs w:val="1"/>
-          <w:color w:val="2f5d8c"/>
+          <w:i w:val="0"/>
+          <w:color w:val="2F5D8C"/>
           <w:sz w:val="24"/>
           <w:szCs w:val="24"/>
           <w:rtl w:val="0"/>
@@ -10576,6 +10960,11 @@
       </w:r>
       <w:r>
         <w:rPr>
+          <w:rFonts w:ascii="Calibri" w:hAnsi="Calibri"/>
+          <w:b/>
+          <w:i w:val="0"/>
+          <w:color w:val="2F5D8C"/>
+          <w:sz w:val="24"/>
           <w:rtl w:val="0"/>
         </w:rPr>
       </w:r>
@@ -10600,6 +10989,7 @@
       </w:r>
       <w:r>
         <w:rPr>
+          <w:rFonts w:ascii="Calibri" w:hAnsi="Calibri"/>
           <w:rtl w:val="0"/>
         </w:rPr>
       </w:r>
@@ -10615,7 +11005,7 @@
       </w:pPr>
       <w:r>
         <w:rPr>
-          <w:rFonts w:ascii="Consolas" w:cs="Consolas" w:eastAsia="Consolas" w:hAnsi="Consolas"/>
+          <w:rFonts w:ascii="Calibri" w:cs="Consolas" w:eastAsia="Consolas" w:hAnsi="Calibri"/>
           <w:sz w:val="20"/>
           <w:szCs w:val="20"/>
           <w:rtl w:val="0"/>
@@ -10624,6 +11014,7 @@
       </w:r>
       <w:r>
         <w:rPr>
+          <w:rFonts w:ascii="Calibri" w:hAnsi="Calibri"/>
           <w:rtl w:val="0"/>
         </w:rPr>
       </w:r>
@@ -10639,7 +11030,7 @@
       </w:pPr>
       <w:r>
         <w:rPr>
-          <w:rFonts w:ascii="Consolas" w:cs="Consolas" w:eastAsia="Consolas" w:hAnsi="Consolas"/>
+          <w:rFonts w:ascii="Calibri" w:cs="Consolas" w:eastAsia="Consolas" w:hAnsi="Calibri"/>
           <w:sz w:val="20"/>
           <w:szCs w:val="20"/>
           <w:rtl w:val="0"/>
@@ -10648,6 +11039,7 @@
       </w:r>
       <w:r>
         <w:rPr>
+          <w:rFonts w:ascii="Calibri" w:hAnsi="Calibri"/>
           <w:rtl w:val="0"/>
         </w:rPr>
       </w:r>
@@ -10663,7 +11055,7 @@
       </w:pPr>
       <w:r>
         <w:rPr>
-          <w:rFonts w:ascii="Consolas" w:cs="Consolas" w:eastAsia="Consolas" w:hAnsi="Consolas"/>
+          <w:rFonts w:ascii="Calibri" w:cs="Consolas" w:eastAsia="Consolas" w:hAnsi="Calibri"/>
           <w:sz w:val="20"/>
           <w:szCs w:val="20"/>
           <w:rtl w:val="0"/>
@@ -10672,6 +11064,7 @@
       </w:r>
       <w:r>
         <w:rPr>
+          <w:rFonts w:ascii="Calibri" w:hAnsi="Calibri"/>
           <w:rtl w:val="0"/>
         </w:rPr>
       </w:r>
@@ -10687,7 +11080,7 @@
       </w:pPr>
       <w:r>
         <w:rPr>
-          <w:rFonts w:ascii="Consolas" w:cs="Consolas" w:eastAsia="Consolas" w:hAnsi="Consolas"/>
+          <w:rFonts w:ascii="Calibri" w:cs="Consolas" w:eastAsia="Consolas" w:hAnsi="Calibri"/>
           <w:sz w:val="20"/>
           <w:szCs w:val="20"/>
           <w:rtl w:val="0"/>
@@ -10696,6 +11089,7 @@
       </w:r>
       <w:r>
         <w:rPr>
+          <w:rFonts w:ascii="Calibri" w:hAnsi="Calibri"/>
           <w:rtl w:val="0"/>
         </w:rPr>
       </w:r>
@@ -10720,6 +11114,7 @@
       </w:r>
       <w:r>
         <w:rPr>
+          <w:rFonts w:ascii="Calibri" w:hAnsi="Calibri"/>
           <w:rtl w:val="0"/>
         </w:rPr>
       </w:r>
@@ -10731,17 +11126,19 @@
         <w:rPr/>
       </w:pPr>
       <w:r>
-        <w:rPr/>
+        <w:rPr>
+          <w:rFonts w:ascii="Calibri" w:hAnsi="Calibri"/>
+        </w:rPr>
         <w:drawing>
           <wp:inline distB="0" distT="0" distL="0" distR="0">
             <wp:extent cx="4191000" cy="1447800"/>
             <wp:effectExtent b="0" l="0" r="0" t="0"/>
-            <wp:docPr descr="Pantallazo de la ejecución de pruebas" id="114" name="image9.png"/>
+            <wp:docPr descr="Pantallazo de la ejecución de pruebas" id="160" name="image7.png"/>
             <a:graphic>
               <a:graphicData uri="http://schemas.openxmlformats.org/drawingml/2006/picture">
                 <pic:pic>
                   <pic:nvPicPr>
-                    <pic:cNvPr descr="Pantallazo de la ejecución de pruebas" id="0" name="image9.png"/>
+                    <pic:cNvPr descr="Pantallazo de la ejecución de pruebas" id="0" name="image7.png"/>
                     <pic:cNvPicPr preferRelativeResize="0"/>
                   </pic:nvPicPr>
                   <pic:blipFill>
@@ -10767,6 +11164,7 @@
       </w:r>
       <w:r>
         <w:rPr>
+          <w:rFonts w:ascii="Calibri" w:hAnsi="Calibri"/>
           <w:rtl w:val="0"/>
         </w:rPr>
       </w:r>
@@ -10789,6 +11187,7 @@
       </w:r>
       <w:r>
         <w:rPr>
+          <w:rFonts w:ascii="Calibri" w:hAnsi="Calibri"/>
           <w:rtl w:val="0"/>
         </w:rPr>
       </w:r>
@@ -10803,9 +11202,10 @@
       <w:r>
         <w:rPr>
           <w:rFonts w:ascii="Calibri" w:cs="Calibri" w:eastAsia="Calibri" w:hAnsi="Calibri"/>
-          <w:b w:val="1"/>
+          <w:b/>
           <w:bCs w:val="1"/>
-          <w:color w:val="2f5d8c"/>
+          <w:i w:val="0"/>
+          <w:color w:val="2F5D8C"/>
           <w:sz w:val="24"/>
           <w:szCs w:val="24"/>
           <w:rtl w:val="0"/>
@@ -10814,6 +11214,11 @@
       </w:r>
       <w:r>
         <w:rPr>
+          <w:rFonts w:ascii="Calibri" w:hAnsi="Calibri"/>
+          <w:b/>
+          <w:i w:val="0"/>
+          <w:color w:val="2F5D8C"/>
+          <w:sz w:val="24"/>
           <w:rtl w:val="0"/>
         </w:rPr>
       </w:r>
@@ -10838,6 +11243,7 @@
       </w:r>
       <w:r>
         <w:rPr>
+          <w:rFonts w:ascii="Calibri" w:hAnsi="Calibri"/>
           <w:rtl w:val="0"/>
         </w:rPr>
       </w:r>
@@ -10862,6 +11268,7 @@
       </w:r>
       <w:r>
         <w:rPr>
+          <w:rFonts w:ascii="Calibri" w:hAnsi="Calibri"/>
           <w:rtl w:val="0"/>
         </w:rPr>
       </w:r>
@@ -10873,17 +11280,19 @@
         <w:rPr/>
       </w:pPr>
       <w:r>
-        <w:rPr/>
+        <w:rPr>
+          <w:rFonts w:ascii="Calibri" w:hAnsi="Calibri"/>
+        </w:rPr>
         <w:drawing>
           <wp:inline distB="0" distT="0" distL="0" distR="0">
             <wp:extent cx="3114675" cy="2857500"/>
             <wp:effectExtent b="0" l="0" r="0" t="0"/>
-            <wp:docPr descr="Pantallazo de la ejecución de pruebas" id="122" name="image26.png"/>
+            <wp:docPr descr="Pantallazo de la ejecución de pruebas" id="168" name="image22.png"/>
             <a:graphic>
               <a:graphicData uri="http://schemas.openxmlformats.org/drawingml/2006/picture">
                 <pic:pic>
                   <pic:nvPicPr>
-                    <pic:cNvPr descr="Pantallazo de la ejecución de pruebas" id="0" name="image26.png"/>
+                    <pic:cNvPr descr="Pantallazo de la ejecución de pruebas" id="0" name="image22.png"/>
                     <pic:cNvPicPr preferRelativeResize="0"/>
                   </pic:nvPicPr>
                   <pic:blipFill>
@@ -10909,6 +11318,7 @@
       </w:r>
       <w:r>
         <w:rPr>
+          <w:rFonts w:ascii="Calibri" w:hAnsi="Calibri"/>
           <w:rtl w:val="0"/>
         </w:rPr>
       </w:r>
@@ -10931,6 +11341,7 @@
       </w:r>
       <w:r>
         <w:rPr>
+          <w:rFonts w:ascii="Calibri" w:hAnsi="Calibri"/>
           <w:rtl w:val="0"/>
         </w:rPr>
       </w:r>
@@ -10945,9 +11356,10 @@
       <w:r>
         <w:rPr>
           <w:rFonts w:ascii="Calibri" w:cs="Calibri" w:eastAsia="Calibri" w:hAnsi="Calibri"/>
-          <w:b w:val="1"/>
+          <w:b/>
           <w:bCs w:val="1"/>
-          <w:color w:val="2f5d8c"/>
+          <w:i w:val="0"/>
+          <w:color w:val="2F5D8C"/>
           <w:sz w:val="24"/>
           <w:szCs w:val="24"/>
           <w:rtl w:val="0"/>
@@ -10956,6 +11368,11 @@
       </w:r>
       <w:r>
         <w:rPr>
+          <w:rFonts w:ascii="Calibri" w:hAnsi="Calibri"/>
+          <w:b/>
+          <w:i w:val="0"/>
+          <w:color w:val="2F5D8C"/>
+          <w:sz w:val="24"/>
           <w:rtl w:val="0"/>
         </w:rPr>
       </w:r>
@@ -10980,6 +11397,7 @@
       </w:r>
       <w:r>
         <w:rPr>
+          <w:rFonts w:ascii="Calibri" w:hAnsi="Calibri"/>
           <w:rtl w:val="0"/>
         </w:rPr>
       </w:r>
@@ -11004,6 +11422,7 @@
       </w:r>
       <w:r>
         <w:rPr>
+          <w:rFonts w:ascii="Calibri" w:hAnsi="Calibri"/>
           <w:rtl w:val="0"/>
         </w:rPr>
       </w:r>
@@ -11015,17 +11434,19 @@
         <w:rPr/>
       </w:pPr>
       <w:r>
-        <w:rPr/>
+        <w:rPr>
+          <w:rFonts w:ascii="Calibri" w:hAnsi="Calibri"/>
+        </w:rPr>
         <w:drawing>
           <wp:inline distB="0" distT="0" distL="0" distR="0">
             <wp:extent cx="4000500" cy="2714625"/>
             <wp:effectExtent b="0" l="0" r="0" t="0"/>
-            <wp:docPr descr="Pantallazo de la ejecución de pruebas" id="124" name="image23.png"/>
+            <wp:docPr descr="Pantallazo de la ejecución de pruebas" id="170" name="image26.png"/>
             <a:graphic>
               <a:graphicData uri="http://schemas.openxmlformats.org/drawingml/2006/picture">
                 <pic:pic>
                   <pic:nvPicPr>
-                    <pic:cNvPr descr="Pantallazo de la ejecución de pruebas" id="0" name="image23.png"/>
+                    <pic:cNvPr descr="Pantallazo de la ejecución de pruebas" id="0" name="image26.png"/>
                     <pic:cNvPicPr preferRelativeResize="0"/>
                   </pic:nvPicPr>
                   <pic:blipFill>
@@ -11051,6 +11472,7 @@
       </w:r>
       <w:r>
         <w:rPr>
+          <w:rFonts w:ascii="Calibri" w:hAnsi="Calibri"/>
           <w:rtl w:val="0"/>
         </w:rPr>
       </w:r>
@@ -11073,6 +11495,7 @@
       </w:r>
       <w:r>
         <w:rPr>
+          <w:rFonts w:ascii="Calibri" w:hAnsi="Calibri"/>
           <w:rtl w:val="0"/>
         </w:rPr>
       </w:r>
@@ -11087,9 +11510,10 @@
       <w:r>
         <w:rPr>
           <w:rFonts w:ascii="Calibri" w:cs="Calibri" w:eastAsia="Calibri" w:hAnsi="Calibri"/>
-          <w:b w:val="1"/>
+          <w:b/>
           <w:bCs w:val="1"/>
-          <w:color w:val="2f5d8c"/>
+          <w:i w:val="0"/>
+          <w:color w:val="2F5D8C"/>
           <w:sz w:val="24"/>
           <w:szCs w:val="24"/>
           <w:rtl w:val="0"/>
@@ -11098,6 +11522,11 @@
       </w:r>
       <w:r>
         <w:rPr>
+          <w:rFonts w:ascii="Calibri" w:hAnsi="Calibri"/>
+          <w:b/>
+          <w:i w:val="0"/>
+          <w:color w:val="2F5D8C"/>
+          <w:sz w:val="24"/>
           <w:rtl w:val="0"/>
         </w:rPr>
       </w:r>
@@ -11122,6 +11551,7 @@
       </w:r>
       <w:r>
         <w:rPr>
+          <w:rFonts w:ascii="Calibri" w:hAnsi="Calibri"/>
           <w:rtl w:val="0"/>
         </w:rPr>
       </w:r>
@@ -11146,6 +11576,7 @@
       </w:r>
       <w:r>
         <w:rPr>
+          <w:rFonts w:ascii="Calibri" w:hAnsi="Calibri"/>
           <w:rtl w:val="0"/>
         </w:rPr>
       </w:r>
@@ -11157,17 +11588,19 @@
         <w:rPr/>
       </w:pPr>
       <w:r>
-        <w:rPr/>
+        <w:rPr>
+          <w:rFonts w:ascii="Calibri" w:hAnsi="Calibri"/>
+        </w:rPr>
         <w:drawing>
           <wp:inline distB="0" distT="0" distL="0" distR="0">
             <wp:extent cx="4000500" cy="1466850"/>
             <wp:effectExtent b="0" l="0" r="0" t="0"/>
-            <wp:docPr descr="Pantallazo de la ejecución de pruebas" id="127" name="image25.png"/>
+            <wp:docPr descr="Pantallazo de la ejecución de pruebas" id="173" name="image33.png"/>
             <a:graphic>
               <a:graphicData uri="http://schemas.openxmlformats.org/drawingml/2006/picture">
                 <pic:pic>
                   <pic:nvPicPr>
-                    <pic:cNvPr descr="Pantallazo de la ejecución de pruebas" id="0" name="image25.png"/>
+                    <pic:cNvPr descr="Pantallazo de la ejecución de pruebas" id="0" name="image33.png"/>
                     <pic:cNvPicPr preferRelativeResize="0"/>
                   </pic:nvPicPr>
                   <pic:blipFill>
@@ -11193,6 +11626,7 @@
       </w:r>
       <w:r>
         <w:rPr>
+          <w:rFonts w:ascii="Calibri" w:hAnsi="Calibri"/>
           <w:rtl w:val="0"/>
         </w:rPr>
       </w:r>
@@ -11215,6 +11649,7 @@
       </w:r>
       <w:r>
         <w:rPr>
+          <w:rFonts w:ascii="Calibri" w:hAnsi="Calibri"/>
           <w:rtl w:val="0"/>
         </w:rPr>
       </w:r>
@@ -11229,9 +11664,10 @@
       <w:r>
         <w:rPr>
           <w:rFonts w:ascii="Calibri" w:cs="Calibri" w:eastAsia="Calibri" w:hAnsi="Calibri"/>
-          <w:b w:val="1"/>
+          <w:b/>
           <w:bCs w:val="1"/>
-          <w:color w:val="2f5d8c"/>
+          <w:i w:val="0"/>
+          <w:color w:val="2F5D8C"/>
           <w:sz w:val="24"/>
           <w:szCs w:val="24"/>
           <w:rtl w:val="0"/>
@@ -11240,6 +11676,11 @@
       </w:r>
       <w:r>
         <w:rPr>
+          <w:rFonts w:ascii="Calibri" w:hAnsi="Calibri"/>
+          <w:b/>
+          <w:i w:val="0"/>
+          <w:color w:val="2F5D8C"/>
+          <w:sz w:val="24"/>
           <w:rtl w:val="0"/>
         </w:rPr>
       </w:r>
@@ -11264,6 +11705,7 @@
       </w:r>
       <w:r>
         <w:rPr>
+          <w:rFonts w:ascii="Calibri" w:hAnsi="Calibri"/>
           <w:rtl w:val="0"/>
         </w:rPr>
       </w:r>
@@ -11288,6 +11730,7 @@
       </w:r>
       <w:r>
         <w:rPr>
+          <w:rFonts w:ascii="Calibri" w:hAnsi="Calibri"/>
           <w:rtl w:val="0"/>
         </w:rPr>
       </w:r>
@@ -11299,17 +11742,19 @@
         <w:rPr/>
       </w:pPr>
       <w:r>
-        <w:rPr/>
+        <w:rPr>
+          <w:rFonts w:ascii="Calibri" w:hAnsi="Calibri"/>
+        </w:rPr>
         <w:drawing>
           <wp:inline distB="0" distT="0" distL="0" distR="0">
             <wp:extent cx="4000500" cy="2362200"/>
             <wp:effectExtent b="0" l="0" r="0" t="0"/>
-            <wp:docPr descr="Pantallazo de la ejecución de pruebas" id="129" name="image22.png"/>
+            <wp:docPr descr="Pantallazo de la ejecución de pruebas" id="175" name="image23.png"/>
             <a:graphic>
               <a:graphicData uri="http://schemas.openxmlformats.org/drawingml/2006/picture">
                 <pic:pic>
                   <pic:nvPicPr>
-                    <pic:cNvPr descr="Pantallazo de la ejecución de pruebas" id="0" name="image22.png"/>
+                    <pic:cNvPr descr="Pantallazo de la ejecución de pruebas" id="0" name="image23.png"/>
                     <pic:cNvPicPr preferRelativeResize="0"/>
                   </pic:nvPicPr>
                   <pic:blipFill>
@@ -11335,6 +11780,7 @@
       </w:r>
       <w:r>
         <w:rPr>
+          <w:rFonts w:ascii="Calibri" w:hAnsi="Calibri"/>
           <w:rtl w:val="0"/>
         </w:rPr>
       </w:r>
@@ -11357,6 +11803,7 @@
       </w:r>
       <w:r>
         <w:rPr>
+          <w:rFonts w:ascii="Calibri" w:hAnsi="Calibri"/>
           <w:rtl w:val="0"/>
         </w:rPr>
       </w:r>
@@ -11371,10 +11818,11 @@
       <w:r>
         <w:rPr>
           <w:rFonts w:ascii="Calibri" w:cs="Calibri" w:eastAsia="Calibri" w:hAnsi="Calibri"/>
-          <w:b w:val="1"/>
+          <w:b/>
           <w:bCs w:val="1"/>
-          <w:color w:val="1e3a5f"/>
-          <w:sz w:val="27"/>
+          <w:i w:val="0"/>
+          <w:color w:val="2F5D8C"/>
+          <w:sz w:val="24"/>
           <w:szCs w:val="27"/>
           <w:rtl w:val="0"/>
         </w:rPr>
@@ -11382,6 +11830,11 @@
       </w:r>
       <w:r>
         <w:rPr>
+          <w:rFonts w:ascii="Calibri" w:hAnsi="Calibri"/>
+          <w:b/>
+          <w:i w:val="0"/>
+          <w:color w:val="2F5D8C"/>
+          <w:sz w:val="24"/>
           <w:rtl w:val="0"/>
         </w:rPr>
       </w:r>
@@ -11402,6 +11855,7 @@
       </w:r>
       <w:r>
         <w:rPr>
+          <w:rFonts w:ascii="Calibri" w:hAnsi="Calibri"/>
           <w:rtl w:val="0"/>
         </w:rPr>
       </w:r>
@@ -11450,6 +11904,7 @@
       </w:r>
       <w:r>
         <w:rPr>
+          <w:rFonts w:ascii="Calibri" w:hAnsi="Calibri"/>
           <w:rtl w:val="0"/>
         </w:rPr>
       </w:r>
@@ -11498,6 +11953,7 @@
       </w:r>
       <w:r>
         <w:rPr>
+          <w:rFonts w:ascii="Calibri" w:hAnsi="Calibri"/>
           <w:rtl w:val="0"/>
         </w:rPr>
       </w:r>
@@ -11546,6 +12002,7 @@
       </w:r>
       <w:r>
         <w:rPr>
+          <w:rFonts w:ascii="Calibri" w:hAnsi="Calibri"/>
           <w:rtl w:val="0"/>
         </w:rPr>
       </w:r>
@@ -12578,9 +13035,10 @@
       <w:r>
         <w:rPr>
           <w:rFonts w:ascii="Calibri" w:cs="Calibri" w:eastAsia="Calibri" w:hAnsi="Calibri"/>
-          <w:b w:val="1"/>
+          <w:b/>
           <w:bCs w:val="1"/>
-          <w:color w:val="2f5d8c"/>
+          <w:i w:val="0"/>
+          <w:color w:val="2F5D8C"/>
           <w:sz w:val="24"/>
           <w:szCs w:val="24"/>
           <w:rtl w:val="0"/>
@@ -12589,6 +13047,11 @@
       </w:r>
       <w:r>
         <w:rPr>
+          <w:rFonts w:ascii="Calibri" w:hAnsi="Calibri"/>
+          <w:b/>
+          <w:i w:val="0"/>
+          <w:color w:val="2F5D8C"/>
+          <w:sz w:val="24"/>
           <w:rtl w:val="0"/>
         </w:rPr>
       </w:r>
@@ -12613,6 +13076,7 @@
       </w:r>
       <w:r>
         <w:rPr>
+          <w:rFonts w:ascii="Calibri" w:hAnsi="Calibri"/>
           <w:rtl w:val="0"/>
         </w:rPr>
       </w:r>
@@ -12637,6 +13101,7 @@
       </w:r>
       <w:r>
         <w:rPr>
+          <w:rFonts w:ascii="Calibri" w:hAnsi="Calibri"/>
           <w:rtl w:val="0"/>
         </w:rPr>
       </w:r>
@@ -12648,17 +13113,19 @@
         <w:rPr/>
       </w:pPr>
       <w:r>
-        <w:rPr/>
+        <w:rPr>
+          <w:rFonts w:ascii="Calibri" w:hAnsi="Calibri"/>
+        </w:rPr>
         <w:drawing>
           <wp:inline distB="0" distT="0" distL="0" distR="0">
             <wp:extent cx="3143250" cy="2857500"/>
             <wp:effectExtent b="0" l="0" r="0" t="0"/>
-            <wp:docPr descr="Pantallazo de la ejecución de pruebas" id="132" name="image34.png"/>
+            <wp:docPr descr="Pantallazo de la ejecución de pruebas" id="178" name="image32.png"/>
             <a:graphic>
               <a:graphicData uri="http://schemas.openxmlformats.org/drawingml/2006/picture">
                 <pic:pic>
                   <pic:nvPicPr>
-                    <pic:cNvPr descr="Pantallazo de la ejecución de pruebas" id="0" name="image34.png"/>
+                    <pic:cNvPr descr="Pantallazo de la ejecución de pruebas" id="0" name="image32.png"/>
                     <pic:cNvPicPr preferRelativeResize="0"/>
                   </pic:nvPicPr>
                   <pic:blipFill>
@@ -12684,6 +13151,7 @@
       </w:r>
       <w:r>
         <w:rPr>
+          <w:rFonts w:ascii="Calibri" w:hAnsi="Calibri"/>
           <w:rtl w:val="0"/>
         </w:rPr>
       </w:r>
@@ -12706,6 +13174,7 @@
       </w:r>
       <w:r>
         <w:rPr>
+          <w:rFonts w:ascii="Calibri" w:hAnsi="Calibri"/>
           <w:rtl w:val="0"/>
         </w:rPr>
       </w:r>
@@ -12720,9 +13189,10 @@
       <w:r>
         <w:rPr>
           <w:rFonts w:ascii="Calibri" w:cs="Calibri" w:eastAsia="Calibri" w:hAnsi="Calibri"/>
-          <w:b w:val="1"/>
+          <w:b/>
           <w:bCs w:val="1"/>
-          <w:color w:val="2f5d8c"/>
+          <w:i w:val="0"/>
+          <w:color w:val="2F5D8C"/>
           <w:sz w:val="24"/>
           <w:szCs w:val="24"/>
           <w:rtl w:val="0"/>
@@ -12731,6 +13201,11 @@
       </w:r>
       <w:r>
         <w:rPr>
+          <w:rFonts w:ascii="Calibri" w:hAnsi="Calibri"/>
+          <w:b/>
+          <w:i w:val="0"/>
+          <w:color w:val="2F5D8C"/>
+          <w:sz w:val="24"/>
           <w:rtl w:val="0"/>
         </w:rPr>
       </w:r>
@@ -12755,6 +13230,7 @@
       </w:r>
       <w:r>
         <w:rPr>
+          <w:rFonts w:ascii="Calibri" w:hAnsi="Calibri"/>
           <w:rtl w:val="0"/>
         </w:rPr>
       </w:r>
@@ -12779,6 +13255,7 @@
       </w:r>
       <w:r>
         <w:rPr>
+          <w:rFonts w:ascii="Calibri" w:hAnsi="Calibri"/>
           <w:rtl w:val="0"/>
         </w:rPr>
       </w:r>
@@ -12790,17 +13267,19 @@
         <w:rPr/>
       </w:pPr>
       <w:r>
-        <w:rPr/>
+        <w:rPr>
+          <w:rFonts w:ascii="Calibri" w:hAnsi="Calibri"/>
+        </w:rPr>
         <w:drawing>
           <wp:inline distB="0" distT="0" distL="0" distR="0">
             <wp:extent cx="2924175" cy="2857500"/>
             <wp:effectExtent b="0" l="0" r="0" t="0"/>
-            <wp:docPr descr="Pantallazo de la ejecución de pruebas" id="134" name="image31.png"/>
+            <wp:docPr descr="Pantallazo de la ejecución de pruebas" id="180" name="image37.png"/>
             <a:graphic>
               <a:graphicData uri="http://schemas.openxmlformats.org/drawingml/2006/picture">
                 <pic:pic>
                   <pic:nvPicPr>
-                    <pic:cNvPr descr="Pantallazo de la ejecución de pruebas" id="0" name="image31.png"/>
+                    <pic:cNvPr descr="Pantallazo de la ejecución de pruebas" id="0" name="image37.png"/>
                     <pic:cNvPicPr preferRelativeResize="0"/>
                   </pic:nvPicPr>
                   <pic:blipFill>
@@ -12826,6 +13305,7 @@
       </w:r>
       <w:r>
         <w:rPr>
+          <w:rFonts w:ascii="Calibri" w:hAnsi="Calibri"/>
           <w:rtl w:val="0"/>
         </w:rPr>
       </w:r>
@@ -12848,6 +13328,7 @@
       </w:r>
       <w:r>
         <w:rPr>
+          <w:rFonts w:ascii="Calibri" w:hAnsi="Calibri"/>
           <w:rtl w:val="0"/>
         </w:rPr>
       </w:r>
@@ -12862,9 +13343,10 @@
       <w:r>
         <w:rPr>
           <w:rFonts w:ascii="Calibri" w:cs="Calibri" w:eastAsia="Calibri" w:hAnsi="Calibri"/>
-          <w:b w:val="1"/>
+          <w:b/>
           <w:bCs w:val="1"/>
-          <w:color w:val="2f5d8c"/>
+          <w:i w:val="0"/>
+          <w:color w:val="2F5D8C"/>
           <w:sz w:val="24"/>
           <w:szCs w:val="24"/>
           <w:rtl w:val="0"/>
@@ -12873,6 +13355,11 @@
       </w:r>
       <w:r>
         <w:rPr>
+          <w:rFonts w:ascii="Calibri" w:hAnsi="Calibri"/>
+          <w:b/>
+          <w:i w:val="0"/>
+          <w:color w:val="2F5D8C"/>
+          <w:sz w:val="24"/>
           <w:rtl w:val="0"/>
         </w:rPr>
       </w:r>
@@ -12897,6 +13384,7 @@
       </w:r>
       <w:r>
         <w:rPr>
+          <w:rFonts w:ascii="Calibri" w:hAnsi="Calibri"/>
           <w:rtl w:val="0"/>
         </w:rPr>
       </w:r>
@@ -12921,6 +13409,7 @@
       </w:r>
       <w:r>
         <w:rPr>
+          <w:rFonts w:ascii="Calibri" w:hAnsi="Calibri"/>
           <w:rtl w:val="0"/>
         </w:rPr>
       </w:r>
@@ -12932,17 +13421,19 @@
         <w:rPr/>
       </w:pPr>
       <w:r>
-        <w:rPr/>
+        <w:rPr>
+          <w:rFonts w:ascii="Calibri" w:hAnsi="Calibri"/>
+        </w:rPr>
         <w:drawing>
           <wp:inline distB="0" distT="0" distL="0" distR="0">
             <wp:extent cx="4000500" cy="1438275"/>
             <wp:effectExtent b="0" l="0" r="0" t="0"/>
-            <wp:docPr descr="Pantallazo de la ejecución de pruebas" id="136" name="image37.png"/>
+            <wp:docPr descr="Pantallazo de la ejecución de pruebas" id="182" name="image34.png"/>
             <a:graphic>
               <a:graphicData uri="http://schemas.openxmlformats.org/drawingml/2006/picture">
                 <pic:pic>
                   <pic:nvPicPr>
-                    <pic:cNvPr descr="Pantallazo de la ejecución de pruebas" id="0" name="image37.png"/>
+                    <pic:cNvPr descr="Pantallazo de la ejecución de pruebas" id="0" name="image34.png"/>
                     <pic:cNvPicPr preferRelativeResize="0"/>
                   </pic:nvPicPr>
                   <pic:blipFill>
@@ -12968,6 +13459,7 @@
       </w:r>
       <w:r>
         <w:rPr>
+          <w:rFonts w:ascii="Calibri" w:hAnsi="Calibri"/>
           <w:rtl w:val="0"/>
         </w:rPr>
       </w:r>
@@ -12990,6 +13482,7 @@
       </w:r>
       <w:r>
         <w:rPr>
+          <w:rFonts w:ascii="Calibri" w:hAnsi="Calibri"/>
           <w:rtl w:val="0"/>
         </w:rPr>
       </w:r>
@@ -13004,9 +13497,10 @@
       <w:r>
         <w:rPr>
           <w:rFonts w:ascii="Calibri" w:cs="Calibri" w:eastAsia="Calibri" w:hAnsi="Calibri"/>
-          <w:b w:val="1"/>
+          <w:b/>
           <w:bCs w:val="1"/>
-          <w:color w:val="2f5d8c"/>
+          <w:i w:val="0"/>
+          <w:color w:val="2F5D8C"/>
           <w:sz w:val="24"/>
           <w:szCs w:val="24"/>
           <w:rtl w:val="0"/>
@@ -13015,6 +13509,11 @@
       </w:r>
       <w:r>
         <w:rPr>
+          <w:rFonts w:ascii="Calibri" w:hAnsi="Calibri"/>
+          <w:b/>
+          <w:i w:val="0"/>
+          <w:color w:val="2F5D8C"/>
+          <w:sz w:val="24"/>
           <w:rtl w:val="0"/>
         </w:rPr>
       </w:r>
@@ -13039,6 +13538,7 @@
       </w:r>
       <w:r>
         <w:rPr>
+          <w:rFonts w:ascii="Calibri" w:hAnsi="Calibri"/>
           <w:rtl w:val="0"/>
         </w:rPr>
       </w:r>
@@ -13063,6 +13563,7 @@
       </w:r>
       <w:r>
         <w:rPr>
+          <w:rFonts w:ascii="Calibri" w:hAnsi="Calibri"/>
           <w:rtl w:val="0"/>
         </w:rPr>
       </w:r>
@@ -13074,17 +13575,19 @@
         <w:rPr/>
       </w:pPr>
       <w:r>
-        <w:rPr/>
+        <w:rPr>
+          <w:rFonts w:ascii="Calibri" w:hAnsi="Calibri"/>
+        </w:rPr>
         <w:drawing>
           <wp:inline distB="0" distT="0" distL="0" distR="0">
             <wp:extent cx="4000500" cy="1304925"/>
             <wp:effectExtent b="0" l="0" r="0" t="0"/>
-            <wp:docPr descr="Pantallazo de la ejecución de pruebas" id="138" name="image35.png"/>
+            <wp:docPr descr="Pantallazo de la ejecución de pruebas" id="184" name="image40.png"/>
             <a:graphic>
               <a:graphicData uri="http://schemas.openxmlformats.org/drawingml/2006/picture">
                 <pic:pic>
                   <pic:nvPicPr>
-                    <pic:cNvPr descr="Pantallazo de la ejecución de pruebas" id="0" name="image35.png"/>
+                    <pic:cNvPr descr="Pantallazo de la ejecución de pruebas" id="0" name="image40.png"/>
                     <pic:cNvPicPr preferRelativeResize="0"/>
                   </pic:nvPicPr>
                   <pic:blipFill>
@@ -13110,6 +13613,7 @@
       </w:r>
       <w:r>
         <w:rPr>
+          <w:rFonts w:ascii="Calibri" w:hAnsi="Calibri"/>
           <w:rtl w:val="0"/>
         </w:rPr>
       </w:r>
@@ -13132,19 +13636,24 @@
       </w:r>
       <w:r>
         <w:rPr>
-          <w:rtl w:val="0"/>
-        </w:rPr>
-      </w:r>
-    </w:p>
-    <w:p>
-      <w:pPr>
-        <w:rPr/>
-      </w:pPr>
-      <w:r>
+          <w:rFonts w:ascii="Calibri" w:hAnsi="Calibri"/>
+          <w:rtl w:val="0"/>
+        </w:rPr>
+      </w:r>
+    </w:p>
+    <w:p>
+      <w:pPr>
+        <w:rPr/>
+      </w:pPr>
+      <w:r>
+        <w:rPr>
+          <w:rFonts w:ascii="Calibri" w:hAnsi="Calibri"/>
+        </w:rPr>
         <w:br w:type="page"/>
       </w:r>
       <w:r>
         <w:rPr>
+          <w:rFonts w:ascii="Calibri" w:hAnsi="Calibri"/>
           <w:rtl w:val="0"/>
         </w:rPr>
       </w:r>
@@ -13159,17 +13668,23 @@
       <w:r>
         <w:rPr>
           <w:rFonts w:ascii="Calibri" w:cs="Calibri" w:eastAsia="Calibri" w:hAnsi="Calibri"/>
-          <w:b w:val="1"/>
+          <w:b/>
           <w:bCs w:val="1"/>
-          <w:color w:val="1e3a5f"/>
+          <w:i w:val="0"/>
+          <w:color w:val="1E3A5F"/>
           <w:sz w:val="32"/>
           <w:szCs w:val="32"/>
           <w:rtl w:val="0"/>
         </w:rPr>
-        <w:t xml:space="preserve">4 Capturas de pruebas en la interfaz</w:t>
-      </w:r>
-      <w:r>
-        <w:rPr>
+        <w:t>4. Pruebas manuales de interfaz: Sprint 3</w:t>
+      </w:r>
+      <w:r>
+        <w:rPr>
+          <w:rFonts w:ascii="Calibri" w:hAnsi="Calibri"/>
+          <w:b/>
+          <w:i w:val="0"/>
+          <w:color w:val="1E3A5F"/>
+          <w:sz w:val="32"/>
           <w:rtl w:val="0"/>
         </w:rPr>
       </w:r>
@@ -13181,6 +13696,7 @@
       </w:pPr>
       <w:r>
         <w:rPr>
+          <w:rFonts w:ascii="Calibri" w:hAnsi="Calibri"/>
           <w:rtl w:val="0"/>
         </w:rPr>
       </w:r>
@@ -13195,9 +13711,10 @@
       <w:r>
         <w:rPr>
           <w:rFonts w:ascii="Calibri" w:cs="Calibri" w:eastAsia="Calibri" w:hAnsi="Calibri"/>
-          <w:b w:val="1"/>
+          <w:b/>
           <w:bCs w:val="1"/>
-          <w:color w:val="1e3a5f"/>
+          <w:i w:val="0"/>
+          <w:color w:val="1E3A5F"/>
           <w:sz w:val="27"/>
           <w:szCs w:val="27"/>
           <w:rtl w:val="0"/>
@@ -13206,6 +13723,11 @@
       </w:r>
       <w:r>
         <w:rPr>
+          <w:rFonts w:ascii="Calibri" w:hAnsi="Calibri"/>
+          <w:b/>
+          <w:i w:val="0"/>
+          <w:color w:val="1E3A5F"/>
+          <w:sz w:val="27"/>
           <w:rtl w:val="0"/>
         </w:rPr>
       </w:r>
@@ -13226,6 +13748,7 @@
       </w:r>
       <w:r>
         <w:rPr>
+          <w:rFonts w:ascii="Calibri" w:hAnsi="Calibri"/>
           <w:rtl w:val="0"/>
         </w:rPr>
       </w:r>
@@ -13236,17 +13759,19 @@
         <w:rPr/>
       </w:pPr>
       <w:r>
-        <w:rPr/>
+        <w:rPr>
+          <w:rFonts w:ascii="Calibri" w:hAnsi="Calibri"/>
+        </w:rPr>
         <w:drawing>
           <wp:inline distB="0" distT="0" distL="114300" distR="114300">
             <wp:extent cx="5486400" cy="3594735"/>
             <wp:effectExtent b="0" l="0" r="0" t="0"/>
-            <wp:docPr descr="Ejecución del frontend en el computador de Paulina captura original 181649" id="140" name="image45.png"/>
+            <wp:docPr descr="Ejecución del frontend en el computador de Paulina captura original 181649" id="186" name="image46.png"/>
             <a:graphic>
               <a:graphicData uri="http://schemas.openxmlformats.org/drawingml/2006/picture">
                 <pic:pic>
                   <pic:nvPicPr>
-                    <pic:cNvPr descr="Ejecución del frontend en el computador de Paulina captura original 181649" id="0" name="image45.png"/>
+                    <pic:cNvPr descr="Ejecución del frontend en el computador de Paulina captura original 181649" id="0" name="image46.png"/>
                     <pic:cNvPicPr preferRelativeResize="0"/>
                   </pic:nvPicPr>
                   <pic:blipFill>
@@ -13272,19 +13797,24 @@
       </w:r>
       <w:r>
         <w:rPr>
-          <w:rtl w:val="0"/>
-        </w:rPr>
-      </w:r>
-    </w:p>
-    <w:p>
-      <w:pPr>
-        <w:rPr/>
-      </w:pPr>
-      <w:r>
+          <w:rFonts w:ascii="Calibri" w:hAnsi="Calibri"/>
+          <w:rtl w:val="0"/>
+        </w:rPr>
+      </w:r>
+    </w:p>
+    <w:p>
+      <w:pPr>
+        <w:rPr/>
+      </w:pPr>
+      <w:r>
+        <w:rPr>
+          <w:rFonts w:ascii="Calibri" w:hAnsi="Calibri"/>
+        </w:rPr>
         <w:br w:type="page"/>
       </w:r>
       <w:r>
         <w:rPr>
+          <w:rFonts w:ascii="Calibri" w:hAnsi="Calibri"/>
           <w:rtl w:val="0"/>
         </w:rPr>
       </w:r>
@@ -13299,37 +13829,23 @@
       <w:r>
         <w:rPr>
           <w:rFonts w:ascii="Calibri" w:cs="Calibri" w:eastAsia="Calibri" w:hAnsi="Calibri"/>
-          <w:b w:val="1"/>
+          <w:b/>
           <w:bCs w:val="1"/>
-          <w:color w:val="1e3a5f"/>
-          <w:sz w:val="27"/>
+          <w:i w:val="0"/>
+          <w:color w:val="2F5D8C"/>
+          <w:sz w:val="24"/>
           <w:szCs w:val="27"/>
           <w:rtl w:val="0"/>
         </w:rPr>
-        <w:t xml:space="preserve">HU09 Validación del nivel de urgencia</w:t>
-      </w:r>
-      <w:r>
-        <w:rPr>
-          <w:rtl w:val="0"/>
-        </w:rPr>
-      </w:r>
-    </w:p>
-    <w:p>
-      <w:pPr>
-        <w:spacing w:after="120" w:line="288" w:lineRule="auto"/>
-        <w:rPr/>
-      </w:pPr>
-      <w:r>
-        <w:rPr>
-          <w:rFonts w:ascii="Calibri" w:cs="Calibri" w:eastAsia="Calibri" w:hAnsi="Calibri"/>
-          <w:sz w:val="22"/>
-          <w:szCs w:val="22"/>
-          <w:rtl w:val="0"/>
-        </w:rPr>
-        <w:t xml:space="preserve">Con especie Gato y grupo sanguíneo a, se intentó publicar sin seleccionar urgencia. La interfaz mostró “Debes indicar el nivel de urgencia”. Resultado observado: se presentó la validación requerida.</w:t>
-      </w:r>
-      <w:r>
-        <w:rPr>
+        <w:t>S3-HU09: Solicitudes de sangre</w:t>
+      </w:r>
+      <w:r>
+        <w:rPr>
+          <w:rFonts w:ascii="Calibri" w:hAnsi="Calibri"/>
+          <w:b/>
+          <w:i w:val="0"/>
+          <w:color w:val="2F5D8C"/>
+          <w:sz w:val="24"/>
           <w:rtl w:val="0"/>
         </w:rPr>
       </w:r>
@@ -13340,17 +13856,19 @@
         <w:rPr/>
       </w:pPr>
       <w:r>
-        <w:rPr/>
+        <w:rPr>
+          <w:rFonts w:ascii="Calibri" w:hAnsi="Calibri"/>
+        </w:rPr>
         <w:drawing>
           <wp:inline distB="0" distT="0" distL="114300" distR="114300">
             <wp:extent cx="4403549" cy="4846320"/>
             <wp:effectExtent b="0" l="0" r="0" t="0"/>
-            <wp:docPr descr="HU09 Validación del nivel de urgencia captura original 182323" id="142" name="image44.png"/>
+            <wp:docPr descr="HU09 Validación del nivel de urgencia captura original 182323" id="188" name="image42.png"/>
             <a:graphic>
               <a:graphicData uri="http://schemas.openxmlformats.org/drawingml/2006/picture">
                 <pic:pic>
                   <pic:nvPicPr>
-                    <pic:cNvPr descr="HU09 Validación del nivel de urgencia captura original 182323" id="0" name="image44.png"/>
+                    <pic:cNvPr descr="HU09 Validación del nivel de urgencia captura original 182323" id="0" name="image42.png"/>
                     <pic:cNvPicPr preferRelativeResize="0"/>
                   </pic:nvPicPr>
                   <pic:blipFill>
@@ -13376,19 +13894,50 @@
       </w:r>
       <w:r>
         <w:rPr>
-          <w:rtl w:val="0"/>
-        </w:rPr>
-      </w:r>
-    </w:p>
-    <w:p>
-      <w:pPr>
-        <w:rPr/>
-      </w:pPr>
-      <w:r>
+          <w:rFonts w:ascii="Calibri" w:hAnsi="Calibri"/>
+          <w:rtl w:val="0"/>
+        </w:rPr>
+      </w:r>
+    </w:p>
+    <w:p>
+      <w:pPr>
+        <w:spacing w:after="120" w:line="288" w:lineRule="auto" w:before="120"/>
+        <w:rPr/>
+      </w:pPr>
+      <w:r>
+        <w:rPr>
+          <w:rFonts w:ascii="Calibri" w:cs="Calibri" w:eastAsia="Calibri" w:hAnsi="Calibri"/>
+          <w:b w:val="0"/>
+          <w:i/>
+          <w:sz w:val="22"/>
+          <w:szCs w:val="22"/>
+          <w:rtl w:val="0"/>
+        </w:rPr>
+        <w:t>Caso 1: Validación del nivel de urgencia. Con especie Gato y grupo sanguíneo a, se intentó publicar sin seleccionar urgencia. La interfaz mostró “Debes indicar el nivel de urgencia”. Resultado observado: se presentó la validación requerida.</w:t>
+      </w:r>
+      <w:r>
+        <w:rPr>
+          <w:rFonts w:ascii="Calibri" w:hAnsi="Calibri"/>
+          <w:b w:val="0"/>
+          <w:i/>
+          <w:sz w:val="22"/>
+          <w:rtl w:val="0"/>
+        </w:rPr>
+      </w:r>
+    </w:p>
+    <w:p>
+      <w:pPr>
+        <w:rPr/>
+      </w:pPr>
+      <w:r>
+        <w:rPr>
+          <w:rFonts w:ascii="Calibri" w:hAnsi="Calibri"/>
+        </w:rPr>
         <w:br w:type="page"/>
       </w:r>
       <w:r>
         <w:rPr>
+          <w:rFonts w:ascii="Calibri" w:hAnsi="Calibri"/>
           <w:rtl w:val="0"/>
         </w:rPr>
       </w:r>
@@ -13403,37 +13952,23 @@
       <w:r>
         <w:rPr>
           <w:rFonts w:ascii="Calibri" w:cs="Calibri" w:eastAsia="Calibri" w:hAnsi="Calibri"/>
-          <w:b w:val="1"/>
+          <w:b/>
           <w:bCs w:val="1"/>
-          <w:color w:val="1e3a5f"/>
-          <w:sz w:val="27"/>
+          <w:i w:val="0"/>
+          <w:color w:val="2F5D8C"/>
+          <w:sz w:val="24"/>
           <w:szCs w:val="27"/>
           <w:rtl w:val="0"/>
         </w:rPr>
-        <w:t xml:space="preserve">HU09 Publicación exitosa de una solicitud</w:t>
-      </w:r>
-      <w:r>
-        <w:rPr>
-          <w:rtl w:val="0"/>
-        </w:rPr>
-      </w:r>
-    </w:p>
-    <w:p>
-      <w:pPr>
-        <w:spacing w:after="120" w:line="288" w:lineRule="auto"/>
-        <w:rPr/>
-      </w:pPr>
-      <w:r>
-        <w:rPr>
-          <w:rFonts w:ascii="Calibri" w:cs="Calibri" w:eastAsia="Calibri" w:hAnsi="Calibri"/>
-          <w:sz w:val="22"/>
-          <w:szCs w:val="22"/>
-          <w:rtl w:val="0"/>
-        </w:rPr>
-        <w:t xml:space="preserve">Se seleccionó urgencia alta y se publicó la solicitud. La primera captura muestra “Solicitud publicada correctamente.” y el formulario reiniciado; la segunda muestra Gato · a en Activas, con urgencia alta y estado Activa. La solicitud resuelta que ya figuraba en esa lista corresponde a un registro anterior.</w:t>
-      </w:r>
-      <w:r>
-        <w:rPr>
+        <w:t>S3-HU09: Solicitudes de sangre</w:t>
+      </w:r>
+      <w:r>
+        <w:rPr>
+          <w:rFonts w:ascii="Calibri" w:hAnsi="Calibri"/>
+          <w:b/>
+          <w:i w:val="0"/>
+          <w:color w:val="2F5D8C"/>
+          <w:sz w:val="24"/>
           <w:rtl w:val="0"/>
         </w:rPr>
       </w:r>
@@ -13444,17 +13979,19 @@
         <w:rPr/>
       </w:pPr>
       <w:r>
-        <w:rPr/>
+        <w:rPr>
+          <w:rFonts w:ascii="Calibri" w:hAnsi="Calibri"/>
+        </w:rPr>
         <w:drawing>
           <wp:inline distB="0" distT="0" distL="114300" distR="114300">
             <wp:extent cx="3413316" cy="3200400"/>
             <wp:effectExtent b="0" l="0" r="0" t="0"/>
-            <wp:docPr descr="HU09 Publicación exitosa de una solicitud captura original 182422" id="99" name="image3.png"/>
+            <wp:docPr descr="HU09 Publicación exitosa de una solicitud captura original 182422" id="145" name="image9.png"/>
             <a:graphic>
               <a:graphicData uri="http://schemas.openxmlformats.org/drawingml/2006/picture">
                 <pic:pic>
                   <pic:nvPicPr>
-                    <pic:cNvPr descr="HU09 Publicación exitosa de una solicitud captura original 182422" id="0" name="image3.png"/>
+                    <pic:cNvPr descr="HU09 Publicación exitosa de una solicitud captura original 182422" id="0" name="image9.png"/>
                     <pic:cNvPicPr preferRelativeResize="0"/>
                   </pic:nvPicPr>
                   <pic:blipFill>
@@ -13480,6 +14017,7 @@
       </w:r>
       <w:r>
         <w:rPr>
+          <w:rFonts w:ascii="Calibri" w:hAnsi="Calibri"/>
           <w:rtl w:val="0"/>
         </w:rPr>
       </w:r>
@@ -13490,17 +14028,19 @@
         <w:rPr/>
       </w:pPr>
       <w:r>
-        <w:rPr/>
+        <w:rPr>
+          <w:rFonts w:ascii="Calibri" w:hAnsi="Calibri"/>
+        </w:rPr>
         <w:drawing>
           <wp:inline distB="0" distT="0" distL="114300" distR="114300">
             <wp:extent cx="3672900" cy="3200400"/>
             <wp:effectExtent b="0" l="0" r="0" t="0"/>
-            <wp:docPr descr="HU09 Publicación exitosa de una solicitud captura original 182430" id="100" name="image8.png"/>
+            <wp:docPr descr="HU09 Publicación exitosa de una solicitud captura original 182430" id="146" name="image18.png"/>
             <a:graphic>
               <a:graphicData uri="http://schemas.openxmlformats.org/drawingml/2006/picture">
                 <pic:pic>
                   <pic:nvPicPr>
-                    <pic:cNvPr descr="HU09 Publicación exitosa de una solicitud captura original 182430" id="0" name="image8.png"/>
+                    <pic:cNvPr descr="HU09 Publicación exitosa de una solicitud captura original 182430" id="0" name="image18.png"/>
                     <pic:cNvPicPr preferRelativeResize="0"/>
                   </pic:nvPicPr>
                   <pic:blipFill>
@@ -13526,19 +14066,50 @@
       </w:r>
       <w:r>
         <w:rPr>
-          <w:rtl w:val="0"/>
-        </w:rPr>
-      </w:r>
-    </w:p>
-    <w:p>
-      <w:pPr>
-        <w:rPr/>
-      </w:pPr>
-      <w:r>
+          <w:rFonts w:ascii="Calibri" w:hAnsi="Calibri"/>
+          <w:rtl w:val="0"/>
+        </w:rPr>
+      </w:r>
+    </w:p>
+    <w:p>
+      <w:pPr>
+        <w:spacing w:after="120" w:line="288" w:lineRule="auto" w:before="120"/>
+        <w:rPr/>
+      </w:pPr>
+      <w:r>
+        <w:rPr>
+          <w:rFonts w:ascii="Calibri" w:cs="Calibri" w:eastAsia="Calibri" w:hAnsi="Calibri"/>
+          <w:b w:val="0"/>
+          <w:i/>
+          <w:sz w:val="22"/>
+          <w:szCs w:val="22"/>
+          <w:rtl w:val="0"/>
+        </w:rPr>
+        <w:t>Caso 2: Publicación exitosa de una solicitud. Se seleccionó urgencia alta y se publicó la solicitud. La primera captura muestra “Solicitud publicada correctamente.” y el formulario reiniciado; la segunda muestra Gato · a en Activas, con urgencia alta y estado Activa. La solicitud resuelta que ya figuraba en esa lista corresponde a un registro anterior.</w:t>
+      </w:r>
+      <w:r>
+        <w:rPr>
+          <w:rFonts w:ascii="Calibri" w:hAnsi="Calibri"/>
+          <w:b w:val="0"/>
+          <w:i/>
+          <w:sz w:val="22"/>
+          <w:rtl w:val="0"/>
+        </w:rPr>
+      </w:r>
+    </w:p>
+    <w:p>
+      <w:pPr>
+        <w:rPr/>
+      </w:pPr>
+      <w:r>
+        <w:rPr>
+          <w:rFonts w:ascii="Calibri" w:hAnsi="Calibri"/>
+        </w:rPr>
         <w:br w:type="page"/>
       </w:r>
       <w:r>
         <w:rPr>
+          <w:rFonts w:ascii="Calibri" w:hAnsi="Calibri"/>
           <w:rtl w:val="0"/>
         </w:rPr>
       </w:r>
@@ -13553,37 +14124,23 @@
       <w:r>
         <w:rPr>
           <w:rFonts w:ascii="Calibri" w:cs="Calibri" w:eastAsia="Calibri" w:hAnsi="Calibri"/>
-          <w:b w:val="1"/>
+          <w:b/>
           <w:bCs w:val="1"/>
-          <w:color w:val="1e3a5f"/>
-          <w:sz w:val="27"/>
+          <w:i w:val="0"/>
+          <w:color w:val="2F5D8C"/>
+          <w:sz w:val="24"/>
           <w:szCs w:val="27"/>
           <w:rtl w:val="0"/>
         </w:rPr>
-        <w:t xml:space="preserve">HU09 Cierre de la solicitud</w:t>
-      </w:r>
-      <w:r>
-        <w:rPr>
-          <w:rtl w:val="0"/>
-        </w:rPr>
-      </w:r>
-    </w:p>
-    <w:p>
-      <w:pPr>
-        <w:spacing w:after="120" w:line="288" w:lineRule="auto"/>
-        <w:rPr/>
-      </w:pPr>
-      <w:r>
-        <w:rPr>
-          <w:rFonts w:ascii="Calibri" w:cs="Calibri" w:eastAsia="Calibri" w:hAnsi="Calibri"/>
-          <w:sz w:val="22"/>
-          <w:szCs w:val="22"/>
-          <w:rtl w:val="0"/>
-        </w:rPr>
-        <w:t xml:space="preserve">Tras marcar la solicitud como resuelta, la lista muestra “No tienes solicitudes activas.” y dos registros en Resueltas. Resultado observado: la solicitud dejó de figurar en Activas. Esta captura documenta el estado final; por sí sola no demuestra la recarga ni la visibilidad desde otra cuenta.</w:t>
-      </w:r>
-      <w:r>
-        <w:rPr>
+        <w:t>S3-HU09: Solicitudes de sangre</w:t>
+      </w:r>
+      <w:r>
+        <w:rPr>
+          <w:rFonts w:ascii="Calibri" w:hAnsi="Calibri"/>
+          <w:b/>
+          <w:i w:val="0"/>
+          <w:color w:val="2F5D8C"/>
+          <w:sz w:val="24"/>
           <w:rtl w:val="0"/>
         </w:rPr>
       </w:r>
@@ -13594,12 +14151,14 @@
         <w:rPr/>
       </w:pPr>
       <w:r>
-        <w:rPr/>
+        <w:rPr>
+          <w:rFonts w:ascii="Calibri" w:hAnsi="Calibri"/>
+        </w:rPr>
         <w:drawing>
           <wp:inline distB="0" distT="0" distL="114300" distR="114300">
             <wp:extent cx="5460045" cy="4846320"/>
             <wp:effectExtent b="0" l="0" r="0" t="0"/>
-            <wp:docPr descr="HU09 Cierre de la solicitud captura original 182620" id="102" name="image1.png"/>
+            <wp:docPr descr="HU09 Cierre de la solicitud captura original 182620" id="148" name="image1.png"/>
             <a:graphic>
               <a:graphicData uri="http://schemas.openxmlformats.org/drawingml/2006/picture">
                 <pic:pic>
@@ -13630,19 +14189,50 @@
       </w:r>
       <w:r>
         <w:rPr>
-          <w:rtl w:val="0"/>
-        </w:rPr>
-      </w:r>
-    </w:p>
-    <w:p>
-      <w:pPr>
-        <w:rPr/>
-      </w:pPr>
-      <w:r>
+          <w:rFonts w:ascii="Calibri" w:hAnsi="Calibri"/>
+          <w:rtl w:val="0"/>
+        </w:rPr>
+      </w:r>
+    </w:p>
+    <w:p>
+      <w:pPr>
+        <w:spacing w:after="120" w:line="288" w:lineRule="auto" w:before="120"/>
+        <w:rPr/>
+      </w:pPr>
+      <w:r>
+        <w:rPr>
+          <w:rFonts w:ascii="Calibri" w:cs="Calibri" w:eastAsia="Calibri" w:hAnsi="Calibri"/>
+          <w:b w:val="0"/>
+          <w:i/>
+          <w:sz w:val="22"/>
+          <w:szCs w:val="22"/>
+          <w:rtl w:val="0"/>
+        </w:rPr>
+        <w:t>Caso 3: Cierre de la solicitud. Tras marcar la solicitud como resuelta, la lista muestra “No tienes solicitudes activas.” y dos registros en Resueltas. Resultado observado: la solicitud dejó de figurar en Activas. Esta captura documenta el estado final; por sí sola no demuestra la recarga ni la visibilidad desde otra cuenta.</w:t>
+      </w:r>
+      <w:r>
+        <w:rPr>
+          <w:rFonts w:ascii="Calibri" w:hAnsi="Calibri"/>
+          <w:b w:val="0"/>
+          <w:i/>
+          <w:sz w:val="22"/>
+          <w:rtl w:val="0"/>
+        </w:rPr>
+      </w:r>
+    </w:p>
+    <w:p>
+      <w:pPr>
+        <w:rPr/>
+      </w:pPr>
+      <w:r>
+        <w:rPr>
+          <w:rFonts w:ascii="Calibri" w:hAnsi="Calibri"/>
+        </w:rPr>
         <w:br w:type="page"/>
       </w:r>
       <w:r>
         <w:rPr>
+          <w:rFonts w:ascii="Calibri" w:hAnsi="Calibri"/>
           <w:rtl w:val="0"/>
         </w:rPr>
       </w:r>
@@ -13657,37 +14247,23 @@
       <w:r>
         <w:rPr>
           <w:rFonts w:ascii="Calibri" w:cs="Calibri" w:eastAsia="Calibri" w:hAnsi="Calibri"/>
-          <w:b w:val="1"/>
+          <w:b/>
           <w:bCs w:val="1"/>
-          <w:color w:val="1e3a5f"/>
-          <w:sz w:val="27"/>
+          <w:i w:val="0"/>
+          <w:color w:val="2F5D8C"/>
+          <w:sz w:val="24"/>
           <w:szCs w:val="27"/>
           <w:rtl w:val="0"/>
         </w:rPr>
-        <w:t xml:space="preserve">HU10 Validación de los campos obligatorios</w:t>
-      </w:r>
-      <w:r>
-        <w:rPr>
-          <w:rtl w:val="0"/>
-        </w:rPr>
-      </w:r>
-    </w:p>
-    <w:p>
-      <w:pPr>
-        <w:spacing w:after="120" w:line="288" w:lineRule="auto"/>
-        <w:rPr/>
-      </w:pPr>
-      <w:r>
-        <w:rPr>
-          <w:rFonts w:ascii="Calibri" w:cs="Calibri" w:eastAsia="Calibri" w:hAnsi="Calibri"/>
-          <w:sz w:val="22"/>
-          <w:szCs w:val="22"/>
-          <w:rtl w:val="0"/>
-        </w:rPr>
-        <w:t xml:space="preserve">Se presionó Buscar donantes sin seleccionar especie ni ingresar grupo sanguíneo. La interfaz mostró “Selecciona la especie e ingresa un grupo sanguíneo válido.” Resultado observado: se presentó el mensaje de validación.</w:t>
-      </w:r>
-      <w:r>
-        <w:rPr>
+        <w:t>S3-HU10: Buscar donantes compatibles</w:t>
+      </w:r>
+      <w:r>
+        <w:rPr>
+          <w:rFonts w:ascii="Calibri" w:hAnsi="Calibri"/>
+          <w:b/>
+          <w:i w:val="0"/>
+          <w:color w:val="2F5D8C"/>
+          <w:sz w:val="24"/>
           <w:rtl w:val="0"/>
         </w:rPr>
       </w:r>
@@ -13698,17 +14274,19 @@
         <w:rPr/>
       </w:pPr>
       <w:r>
-        <w:rPr/>
+        <w:rPr>
+          <w:rFonts w:ascii="Calibri" w:hAnsi="Calibri"/>
+        </w:rPr>
         <w:drawing>
           <wp:inline distB="0" distT="0" distL="114300" distR="114300">
             <wp:extent cx="4530977" cy="4846320"/>
             <wp:effectExtent b="0" l="0" r="0" t="0"/>
-            <wp:docPr descr="HU10 Validación de los campos obligatorios captura original 182730" id="104" name="image6.png"/>
+            <wp:docPr descr="HU10 Validación de los campos obligatorios captura original 182730" id="150" name="image10.png"/>
             <a:graphic>
               <a:graphicData uri="http://schemas.openxmlformats.org/drawingml/2006/picture">
                 <pic:pic>
                   <pic:nvPicPr>
-                    <pic:cNvPr descr="HU10 Validación de los campos obligatorios captura original 182730" id="0" name="image6.png"/>
+                    <pic:cNvPr descr="HU10 Validación de los campos obligatorios captura original 182730" id="0" name="image10.png"/>
                     <pic:cNvPicPr preferRelativeResize="0"/>
                   </pic:nvPicPr>
                   <pic:blipFill>
@@ -13734,19 +14312,50 @@
       </w:r>
       <w:r>
         <w:rPr>
-          <w:rtl w:val="0"/>
-        </w:rPr>
-      </w:r>
-    </w:p>
-    <w:p>
-      <w:pPr>
-        <w:rPr/>
-      </w:pPr>
-      <w:r>
+          <w:rFonts w:ascii="Calibri" w:hAnsi="Calibri"/>
+          <w:rtl w:val="0"/>
+        </w:rPr>
+      </w:r>
+    </w:p>
+    <w:p>
+      <w:pPr>
+        <w:spacing w:after="120" w:line="288" w:lineRule="auto" w:before="120"/>
+        <w:rPr/>
+      </w:pPr>
+      <w:r>
+        <w:rPr>
+          <w:rFonts w:ascii="Calibri" w:cs="Calibri" w:eastAsia="Calibri" w:hAnsi="Calibri"/>
+          <w:b w:val="0"/>
+          <w:i/>
+          <w:sz w:val="22"/>
+          <w:szCs w:val="22"/>
+          <w:rtl w:val="0"/>
+        </w:rPr>
+        <w:t>Caso 1: Validación de los campos obligatorios. Se presionó Buscar donantes sin seleccionar especie ni ingresar grupo sanguíneo. La interfaz mostró “Selecciona la especie e ingresa un grupo sanguíneo válido.” Resultado observado: se presentó el mensaje de validación.</w:t>
+      </w:r>
+      <w:r>
+        <w:rPr>
+          <w:rFonts w:ascii="Calibri" w:hAnsi="Calibri"/>
+          <w:b w:val="0"/>
+          <w:i/>
+          <w:sz w:val="22"/>
+          <w:rtl w:val="0"/>
+        </w:rPr>
+      </w:r>
+    </w:p>
+    <w:p>
+      <w:pPr>
+        <w:rPr/>
+      </w:pPr>
+      <w:r>
+        <w:rPr>
+          <w:rFonts w:ascii="Calibri" w:hAnsi="Calibri"/>
+        </w:rPr>
         <w:br w:type="page"/>
       </w:r>
       <w:r>
         <w:rPr>
+          <w:rFonts w:ascii="Calibri" w:hAnsi="Calibri"/>
           <w:rtl w:val="0"/>
         </w:rPr>
       </w:r>
@@ -13761,37 +14370,23 @@
       <w:r>
         <w:rPr>
           <w:rFonts w:ascii="Calibri" w:cs="Calibri" w:eastAsia="Calibri" w:hAnsi="Calibri"/>
-          <w:b w:val="1"/>
+          <w:b/>
           <w:bCs w:val="1"/>
-          <w:color w:val="1e3a5f"/>
-          <w:sz w:val="27"/>
+          <w:i w:val="0"/>
+          <w:color w:val="2F5D8C"/>
+          <w:sz w:val="24"/>
           <w:szCs w:val="27"/>
           <w:rtl w:val="0"/>
         </w:rPr>
-        <w:t xml:space="preserve">HU10 Búsqueda con resultados</w:t>
-      </w:r>
-      <w:r>
-        <w:rPr>
-          <w:rtl w:val="0"/>
-        </w:rPr>
-      </w:r>
-    </w:p>
-    <w:p>
-      <w:pPr>
-        <w:spacing w:after="120" w:line="288" w:lineRule="auto"/>
-        <w:rPr/>
-      </w:pPr>
-      <w:r>
-        <w:rPr>
-          <w:rFonts w:ascii="Calibri" w:cs="Calibri" w:eastAsia="Calibri" w:hAnsi="Calibri"/>
-          <w:sz w:val="22"/>
-          <w:szCs w:val="22"/>
-          <w:rtl w:val="0"/>
-        </w:rPr>
-        <w:t xml:space="preserve">Se buscó la especie Gato y el grupo sanguíneo a, sin preferencia de comuna. Se obtuvo un resultado: kuro, especie Gato, grupo a, con raza y comuna sin especificar. Resultado observado: se mostró el donante coincidente. La compatibilidad médica debe ser confirmada por un veterinario.</w:t>
-      </w:r>
-      <w:r>
-        <w:rPr>
+        <w:t>S3-HU10: Buscar donantes compatibles</w:t>
+      </w:r>
+      <w:r>
+        <w:rPr>
+          <w:rFonts w:ascii="Calibri" w:hAnsi="Calibri"/>
+          <w:b/>
+          <w:i w:val="0"/>
+          <w:color w:val="2F5D8C"/>
+          <w:sz w:val="24"/>
           <w:rtl w:val="0"/>
         </w:rPr>
       </w:r>
@@ -13802,17 +14397,19 @@
         <w:rPr/>
       </w:pPr>
       <w:r>
-        <w:rPr/>
+        <w:rPr>
+          <w:rFonts w:ascii="Calibri" w:hAnsi="Calibri"/>
+        </w:rPr>
         <w:drawing>
           <wp:inline distB="0" distT="0" distL="114300" distR="114300">
             <wp:extent cx="3196508" cy="4846320"/>
             <wp:effectExtent b="0" l="0" r="0" t="0"/>
-            <wp:docPr descr="HU10 Búsqueda con resultados captura original 182816" id="106" name="image5.png"/>
+            <wp:docPr descr="HU10 Búsqueda con resultados captura original 182816" id="152" name="image14.png"/>
             <a:graphic>
               <a:graphicData uri="http://schemas.openxmlformats.org/drawingml/2006/picture">
                 <pic:pic>
                   <pic:nvPicPr>
-                    <pic:cNvPr descr="HU10 Búsqueda con resultados captura original 182816" id="0" name="image5.png"/>
+                    <pic:cNvPr descr="HU10 Búsqueda con resultados captura original 182816" id="0" name="image14.png"/>
                     <pic:cNvPicPr preferRelativeResize="0"/>
                   </pic:nvPicPr>
                   <pic:blipFill>
@@ -13838,19 +14435,50 @@
       </w:r>
       <w:r>
         <w:rPr>
-          <w:rtl w:val="0"/>
-        </w:rPr>
-      </w:r>
-    </w:p>
-    <w:p>
-      <w:pPr>
-        <w:rPr/>
-      </w:pPr>
-      <w:r>
+          <w:rFonts w:ascii="Calibri" w:hAnsi="Calibri"/>
+          <w:rtl w:val="0"/>
+        </w:rPr>
+      </w:r>
+    </w:p>
+    <w:p>
+      <w:pPr>
+        <w:spacing w:after="120" w:line="288" w:lineRule="auto" w:before="120"/>
+        <w:rPr/>
+      </w:pPr>
+      <w:r>
+        <w:rPr>
+          <w:rFonts w:ascii="Calibri" w:cs="Calibri" w:eastAsia="Calibri" w:hAnsi="Calibri"/>
+          <w:b w:val="0"/>
+          <w:i/>
+          <w:sz w:val="22"/>
+          <w:szCs w:val="22"/>
+          <w:rtl w:val="0"/>
+        </w:rPr>
+        <w:t>Caso 2: Búsqueda con resultados. Se buscó la especie Gato y el grupo sanguíneo a, sin preferencia de comuna. Se obtuvo un resultado: kuro, especie Gato, grupo a, con raza y comuna sin especificar. Resultado observado: se mostró el donante coincidente. La compatibilidad médica debe ser confirmada por un veterinario.</w:t>
+      </w:r>
+      <w:r>
+        <w:rPr>
+          <w:rFonts w:ascii="Calibri" w:hAnsi="Calibri"/>
+          <w:b w:val="0"/>
+          <w:i/>
+          <w:sz w:val="22"/>
+          <w:rtl w:val="0"/>
+        </w:rPr>
+      </w:r>
+    </w:p>
+    <w:p>
+      <w:pPr>
+        <w:rPr/>
+      </w:pPr>
+      <w:r>
+        <w:rPr>
+          <w:rFonts w:ascii="Calibri" w:hAnsi="Calibri"/>
+        </w:rPr>
         <w:br w:type="page"/>
       </w:r>
       <w:r>
         <w:rPr>
+          <w:rFonts w:ascii="Calibri" w:hAnsi="Calibri"/>
           <w:rtl w:val="0"/>
         </w:rPr>
       </w:r>
@@ -13865,37 +14493,23 @@
       <w:r>
         <w:rPr>
           <w:rFonts w:ascii="Calibri" w:cs="Calibri" w:eastAsia="Calibri" w:hAnsi="Calibri"/>
-          <w:b w:val="1"/>
+          <w:b/>
           <w:bCs w:val="1"/>
-          <w:color w:val="1e3a5f"/>
-          <w:sz w:val="27"/>
+          <w:i w:val="0"/>
+          <w:color w:val="2F5D8C"/>
+          <w:sz w:val="24"/>
           <w:szCs w:val="27"/>
           <w:rtl w:val="0"/>
         </w:rPr>
-        <w:t xml:space="preserve">HU10 Búsqueda sin resultados</w:t>
-      </w:r>
-      <w:r>
-        <w:rPr>
-          <w:rtl w:val="0"/>
-        </w:rPr>
-      </w:r>
-    </w:p>
-    <w:p>
-      <w:pPr>
-        <w:spacing w:after="120" w:line="288" w:lineRule="auto"/>
-        <w:rPr/>
-      </w:pPr>
-      <w:r>
-        <w:rPr>
-          <w:rFonts w:ascii="Calibri" w:cs="Calibri" w:eastAsia="Calibri" w:hAnsi="Calibri"/>
-          <w:sz w:val="22"/>
-          <w:szCs w:val="22"/>
-          <w:rtl w:val="0"/>
-        </w:rPr>
-        <w:t xml:space="preserve">Se buscó la especie Gato y el grupo sanguíneo ab, sin preferencia de comuna. La interfaz mostró “No se encontraron donantes compatibles en este momento”. Resultado observado: se informó la ausencia de coincidencias y no se mantuvo la tarjeta del resultado anterior.</w:t>
-      </w:r>
-      <w:r>
-        <w:rPr>
+        <w:t>S3-HU10: Buscar donantes compatibles</w:t>
+      </w:r>
+      <w:r>
+        <w:rPr>
+          <w:rFonts w:ascii="Calibri" w:hAnsi="Calibri"/>
+          <w:b/>
+          <w:i w:val="0"/>
+          <w:color w:val="2F5D8C"/>
+          <w:sz w:val="24"/>
           <w:rtl w:val="0"/>
         </w:rPr>
       </w:r>
@@ -13906,17 +14520,19 @@
         <w:rPr/>
       </w:pPr>
       <w:r>
-        <w:rPr/>
+        <w:rPr>
+          <w:rFonts w:ascii="Calibri" w:hAnsi="Calibri"/>
+        </w:rPr>
         <w:drawing>
           <wp:inline distB="0" distT="0" distL="114300" distR="114300">
             <wp:extent cx="3432809" cy="4846320"/>
             <wp:effectExtent b="0" l="0" r="0" t="0"/>
-            <wp:docPr descr="HU10 Búsqueda sin resultados captura original 182934" id="108" name="image2.png"/>
+            <wp:docPr descr="HU10 Búsqueda sin resultados captura original 182934" id="154" name="image13.png"/>
             <a:graphic>
               <a:graphicData uri="http://schemas.openxmlformats.org/drawingml/2006/picture">
                 <pic:pic>
                   <pic:nvPicPr>
-                    <pic:cNvPr descr="HU10 Búsqueda sin resultados captura original 182934" id="0" name="image2.png"/>
+                    <pic:cNvPr descr="HU10 Búsqueda sin resultados captura original 182934" id="0" name="image13.png"/>
                     <pic:cNvPicPr preferRelativeResize="0"/>
                   </pic:nvPicPr>
                   <pic:blipFill>
@@ -13942,6 +14558,33 @@
       </w:r>
       <w:r>
         <w:rPr>
+          <w:rFonts w:ascii="Calibri" w:hAnsi="Calibri"/>
+          <w:rtl w:val="0"/>
+        </w:rPr>
+      </w:r>
+    </w:p>
+    <w:p>
+      <w:pPr>
+        <w:spacing w:after="120" w:line="288" w:lineRule="auto" w:before="120"/>
+        <w:rPr/>
+      </w:pPr>
+      <w:r>
+        <w:rPr>
+          <w:rFonts w:ascii="Calibri" w:cs="Calibri" w:eastAsia="Calibri" w:hAnsi="Calibri"/>
+          <w:b w:val="0"/>
+          <w:i/>
+          <w:sz w:val="22"/>
+          <w:szCs w:val="22"/>
+          <w:rtl w:val="0"/>
+        </w:rPr>
+        <w:t>Caso 3: Búsqueda sin resultados. Se buscó la especie Gato y el grupo sanguíneo ab, sin preferencia de comuna. La interfaz mostró “No se encontraron donantes compatibles en este momento”. Resultado observado: se informó la ausencia de coincidencias y no se mantuvo la tarjeta del resultado anterior.</w:t>
+      </w:r>
+      <w:r>
+        <w:rPr>
+          <w:rFonts w:ascii="Calibri" w:hAnsi="Calibri"/>
+          <w:b w:val="0"/>
+          <w:i/>
+          <w:sz w:val="22"/>
           <w:rtl w:val="0"/>
         </w:rPr>
       </w:r>
@@ -14121,6 +14764,9 @@
   </w:style>
   <w:style w:type="paragraph" w:styleId="Normal" w:default="1">
     <w:name w:val="normal"/>
+    <w:rPr>
+      <w:rFonts w:ascii="Calibri" w:hAnsi="Calibri"/>
+    </w:rPr>
   </w:style>
   <w:style w:type="paragraph" w:styleId="Heading1">
     <w:name w:val="heading 1"/>
@@ -14394,6 +15040,9 @@
   </w:style>
   <w:style w:type="paragraph" w:styleId="Normal" w:default="1">
     <w:name w:val="normal"/>
+    <w:rPr>
+      <w:rFonts w:ascii="Calibri" w:hAnsi="Calibri"/>
+    </w:rPr>
   </w:style>
   <w:style w:type="table" w:styleId="TableNormal" w:default="1">
     <w:name w:val="TableNormal"/>
@@ -14408,6 +15057,26 @@
   </w:style>
   <w:style w:type="paragraph" w:styleId="Normal" w:default="1">
     <w:name w:val="normal"/>
+    <w:rPr>
+      <w:rFonts w:ascii="Calibri" w:hAnsi="Calibri"/>
+    </w:rPr>
+  </w:style>
+  <w:style w:type="table" w:styleId="TableNormal" w:default="1">
+    <w:name w:val="TableNormal"/>
+    <w:tblPr>
+      <w:tblCellMar>
+        <w:top w:w="100.0" w:type="dxa"/>
+        <w:left w:w="100.0" w:type="dxa"/>
+        <w:bottom w:w="100.0" w:type="dxa"/>
+        <w:right w:w="100.0" w:type="dxa"/>
+      </w:tblCellMar>
+    </w:tblPr>
+  </w:style>
+  <w:style w:type="paragraph" w:styleId="Normal" w:default="1">
+    <w:name w:val="normal"/>
+    <w:rPr>
+      <w:rFonts w:ascii="Calibri" w:hAnsi="Calibri"/>
+    </w:rPr>
   </w:style>
   <w:style w:type="paragraph" w:styleId="Strong">
     <w:name w:val="Strong"/>
@@ -14415,6 +15084,7 @@
     <w:next w:val="Normal"/>
     <w:qFormat w:val="1"/>
     <w:rPr>
+      <w:rFonts w:ascii="Calibri" w:hAnsi="Calibri"/>
       <w:b w:val="1"/>
       <w:bCs w:val="1"/>
     </w:rPr>
@@ -14423,6 +15093,9 @@
     <w:name w:val="List Paragraph"/>
     <w:basedOn w:val="Normal"/>
     <w:qFormat w:val="1"/>
+    <w:rPr>
+      <w:rFonts w:ascii="Calibri" w:hAnsi="Calibri"/>
+    </w:rPr>
   </w:style>
   <w:style w:type="character" w:styleId="Hyperlink">
     <w:name w:val="Hyperlink"/>
@@ -14430,6 +15103,7 @@
     <w:uiPriority w:val="99"/>
     <w:unhideWhenUsed w:val="1"/>
     <w:rPr>
+      <w:rFonts w:ascii="Calibri" w:hAnsi="Calibri"/>
       <w:color w:val="0563c1"/>
       <w:u w:val="single"/>
     </w:rPr>
@@ -14441,6 +15115,7 @@
     <w:semiHidden w:val="1"/>
     <w:unhideWhenUsed w:val="1"/>
     <w:rPr>
+      <w:rFonts w:ascii="Calibri" w:hAnsi="Calibri"/>
       <w:vertAlign w:val="superscript"/>
     </w:rPr>
   </w:style>
@@ -14455,6 +15130,7 @@
       <w:spacing w:after="0" w:line="240" w:lineRule="auto"/>
     </w:pPr>
     <w:rPr>
+      <w:rFonts w:ascii="Calibri" w:hAnsi="Calibri"/>
       <w:sz w:val="20"/>
       <w:szCs w:val="20"/>
     </w:rPr>
@@ -14467,6 +15143,7 @@
     <w:semiHidden w:val="1"/>
     <w:unhideWhenUsed w:val="1"/>
     <w:rPr>
+      <w:rFonts w:ascii="Calibri" w:hAnsi="Calibri"/>
       <w:sz w:val="20"/>
       <w:szCs w:val="20"/>
     </w:rPr>
@@ -14478,6 +15155,7 @@
     <w:semiHidden w:val="1"/>
     <w:unhideWhenUsed w:val="1"/>
     <w:rPr>
+      <w:rFonts w:ascii="Calibri" w:hAnsi="Calibri"/>
       <w:vertAlign w:val="superscript"/>
     </w:rPr>
   </w:style>
@@ -14492,6 +15170,7 @@
       <w:spacing w:after="0" w:line="240" w:lineRule="auto"/>
     </w:pPr>
     <w:rPr>
+      <w:rFonts w:ascii="Calibri" w:hAnsi="Calibri"/>
       <w:sz w:val="20"/>
       <w:szCs w:val="20"/>
     </w:rPr>
@@ -14504,9 +15183,62 @@
     <w:semiHidden w:val="1"/>
     <w:unhideWhenUsed w:val="1"/>
     <w:rPr>
+      <w:rFonts w:ascii="Calibri" w:hAnsi="Calibri"/>
       <w:sz w:val="20"/>
       <w:szCs w:val="20"/>
     </w:rPr>
+  </w:style>
+  <w:style w:type="table" w:styleId="Table1">
+    <w:basedOn w:val="TableNormal"/>
+    <w:tblPr>
+      <w:tblStyleRowBandSize w:val="1"/>
+      <w:tblStyleColBandSize w:val="1"/>
+      <w:tblCellMar>
+        <w:top w:w="0.0" w:type="dxa"/>
+        <w:left w:w="115.0" w:type="dxa"/>
+        <w:bottom w:w="0.0" w:type="dxa"/>
+        <w:right w:w="115.0" w:type="dxa"/>
+      </w:tblCellMar>
+    </w:tblPr>
+  </w:style>
+  <w:style w:type="table" w:styleId="Table2">
+    <w:basedOn w:val="TableNormal"/>
+    <w:tblPr>
+      <w:tblStyleRowBandSize w:val="1"/>
+      <w:tblStyleColBandSize w:val="1"/>
+      <w:tblCellMar>
+        <w:top w:w="0.0" w:type="dxa"/>
+        <w:left w:w="115.0" w:type="dxa"/>
+        <w:bottom w:w="0.0" w:type="dxa"/>
+        <w:right w:w="115.0" w:type="dxa"/>
+      </w:tblCellMar>
+    </w:tblPr>
+  </w:style>
+  <w:style w:type="table" w:styleId="Table3">
+    <w:basedOn w:val="TableNormal"/>
+    <w:tblPr>
+      <w:tblStyleRowBandSize w:val="1"/>
+      <w:tblStyleColBandSize w:val="1"/>
+      <w:tblCellMar>
+        <w:top w:w="0.0" w:type="dxa"/>
+        <w:left w:w="115.0" w:type="dxa"/>
+        <w:bottom w:w="0.0" w:type="dxa"/>
+        <w:right w:w="115.0" w:type="dxa"/>
+      </w:tblCellMar>
+    </w:tblPr>
+  </w:style>
+  <w:style w:type="table" w:styleId="Table4">
+    <w:basedOn w:val="TableNormal"/>
+    <w:tblPr>
+      <w:tblStyleRowBandSize w:val="1"/>
+      <w:tblStyleColBandSize w:val="1"/>
+      <w:tblCellMar>
+        <w:top w:w="0.0" w:type="dxa"/>
+        <w:left w:w="115.0" w:type="dxa"/>
+        <w:bottom w:w="0.0" w:type="dxa"/>
+        <w:right w:w="115.0" w:type="dxa"/>
+      </w:tblCellMar>
+    </w:tblPr>
   </w:style>
   <w:style w:type="table" w:styleId="Table1">
     <w:basedOn w:val="TableNormal"/>
@@ -14623,7 +15355,7 @@
       <w:spacing w:after="80" w:before="360" w:lineRule="auto"/>
     </w:pPr>
     <w:rPr>
-      <w:rFonts w:ascii="Georgia" w:cs="Georgia" w:eastAsia="Georgia" w:hAnsi="Georgia"/>
+      <w:rFonts w:ascii="Calibri" w:cs="Georgia" w:eastAsia="Georgia" w:hAnsi="Calibri"/>
       <w:i w:val="1"/>
       <w:iCs w:val="1"/>
       <w:color w:val="666666"/>

</xml_diff>